<commit_message>
Brochure: BNI referrer fixes - case tags (panel 5), testimonial slot (6), referral update line (8)
Co-Authored-By: Claude Opus 5.5 <noreply@anthropic.com>
Claude-Session: https://claude.ai/code/session_01KhCungy6SpcQ77bdWEeQSw
</commit_message>
<xml_diff>
--- a/brochure/MAKESENSE-brochure-copy.docx
+++ b/brochure/MAKESENSE-brochure-copy.docx
@@ -10700,7 +10700,7 @@
                 <w:szCs w:val="20"/>
                 <w:rtl/>
               </w:rPr>
-              <w:t xml:space="preserve">4 מתוך 5</w:t>
+              <w:t xml:space="preserve">5 מתוך 5</w:t>
             </w:r>
           </w:p>
         </w:tc>
@@ -11216,6 +11216,131 @@
                 <w:rtl/>
               </w:rPr>
               <w:t xml:space="preserve">30pt · Black · "מי מייצג אתכם?" בכחול</w:t>
+            </w:r>
+          </w:p>
+        </w:tc>
+      </w:tr>
+      <w:tr>
+        <w:trPr>
+          <w:cantSplit/>
+          <w:tblHeader w:val="false"/>
+        </w:trPr>
+        <w:tc>
+          <w:tcPr>
+            <w:tcW w:type="dxa" w:w="2200"/>
+            <w:tcBorders>
+              <w:top w:val="single" w:color="C9DCF8" w:sz="4"/>
+              <w:left w:val="single" w:color="C9DCF8" w:sz="4"/>
+              <w:bottom w:val="single" w:color="C9DCF8" w:sz="4"/>
+              <w:right w:val="single" w:color="C9DCF8" w:sz="4"/>
+            </w:tcBorders>
+            <w:shd w:fill="EAF2FE" w:color="auto" w:val="clear"/>
+            <w:tcMar>
+              <w:top w:type="dxa" w:w="70"/>
+              <w:left w:type="dxa" w:w="110"/>
+              <w:bottom w:type="dxa" w:w="70"/>
+              <w:right w:type="dxa" w:w="110"/>
+            </w:tcMar>
+          </w:tcPr>
+          <w:p>
+            <w:pPr>
+              <w:bidi/>
+              <w:spacing w:after="30" w:before="0" w:line="276"/>
+              <w:jc w:val="start"/>
+            </w:pPr>
+            <w:r>
+              <w:rPr>
+                <w:rFonts w:ascii="Arial" w:cs="Arial" w:eastAsia="Arial" w:hAnsi="Arial"/>
+                <w:b/>
+                <w:bCs/>
+                <w:color w:val="0A0A0A"/>
+                <w:sz w:val="20"/>
+                <w:szCs w:val="20"/>
+                <w:rtl/>
+              </w:rPr>
+              <w:t xml:space="preserve">שורת תגיות (שורה אחת)</w:t>
+            </w:r>
+          </w:p>
+        </w:tc>
+        <w:tc>
+          <w:tcPr>
+            <w:tcW w:type="dxa" w:w="4838"/>
+            <w:tcBorders>
+              <w:top w:val="single" w:color="C9DCF8" w:sz="4"/>
+              <w:left w:val="single" w:color="C9DCF8" w:sz="4"/>
+              <w:bottom w:val="single" w:color="C9DCF8" w:sz="4"/>
+              <w:right w:val="single" w:color="C9DCF8" w:sz="4"/>
+            </w:tcBorders>
+            <w:tcMar>
+              <w:top w:type="dxa" w:w="70"/>
+              <w:left w:type="dxa" w:w="110"/>
+              <w:bottom w:type="dxa" w:w="70"/>
+              <w:right w:type="dxa" w:w="110"/>
+            </w:tcMar>
+          </w:tcPr>
+          <w:p>
+            <w:pPr>
+              <w:bidi/>
+              <w:spacing w:after="30" w:before="0" w:line="276"/>
+              <w:jc w:val="start"/>
+            </w:pPr>
+            <w:r>
+              <w:rPr>
+                <w:rFonts w:ascii="Arial" w:cs="Arial" w:eastAsia="Arial" w:hAnsi="Arial"/>
+                <w:b/>
+                <w:bCs/>
+                <w:color w:val="0A0A0A"/>
+                <w:sz w:val="20"/>
+                <w:szCs w:val="20"/>
+                <w:rtl/>
+              </w:rPr>
+              <w:t xml:space="preserve">מקרים שאני פוגש כל הזמן:</w:t>
+            </w:r>
+            <w:r>
+              <w:rPr>
+                <w:rFonts w:ascii="Arial" w:cs="Arial" w:eastAsia="Arial" w:hAnsi="Arial"/>
+                <w:b w:val="false"/>
+                <w:color w:val="0A0A0A"/>
+                <w:sz w:val="20"/>
+                <w:szCs w:val="20"/>
+                <w:rtl/>
+              </w:rPr>
+              <w:t xml:space="preserve"> זוגות צעירים · משפרי דיור · מסורבי בנקים · עצמאים · בעלי עסקים · משקיעי נדל"ן · בני 55+</w:t>
+            </w:r>
+          </w:p>
+        </w:tc>
+        <w:tc>
+          <w:tcPr>
+            <w:tcW w:type="dxa" w:w="2600"/>
+            <w:tcBorders>
+              <w:top w:val="single" w:color="C9DCF8" w:sz="4"/>
+              <w:left w:val="single" w:color="C9DCF8" w:sz="4"/>
+              <w:bottom w:val="single" w:color="C9DCF8" w:sz="4"/>
+              <w:right w:val="single" w:color="C9DCF8" w:sz="4"/>
+            </w:tcBorders>
+            <w:tcMar>
+              <w:top w:type="dxa" w:w="70"/>
+              <w:left w:type="dxa" w:w="110"/>
+              <w:bottom w:type="dxa" w:w="70"/>
+              <w:right w:type="dxa" w:w="110"/>
+            </w:tcMar>
+          </w:tcPr>
+          <w:p>
+            <w:pPr>
+              <w:bidi/>
+              <w:spacing w:after="30" w:before="0" w:line="276"/>
+              <w:jc w:val="start"/>
+            </w:pPr>
+            <w:r>
+              <w:rPr>
+                <w:rFonts w:ascii="Arial" w:cs="Arial" w:eastAsia="Arial" w:hAnsi="Arial"/>
+                <w:b w:val="false"/>
+                <w:color w:val="0A0A0A"/>
+                <w:sz w:val="20"/>
+                <w:szCs w:val="20"/>
+                <w:rtl/>
+              </w:rPr>
+              <w:t xml:space="preserve">8.5pt · תגיות עדינות</w:t>
             </w:r>
           </w:p>
         </w:tc>
@@ -11327,6 +11452,27 @@
     </w:p>
     <w:p>
       <w:pPr>
+        <w:pStyle w:val="ListParagraph"/>
+        <w:numPr>
+          <w:ilvl w:val="0"/>
+          <w:numId w:val="2"/>
+        </w:numPr>
+        <w:bidi/>
+        <w:spacing w:after="60" w:line="290"/>
+      </w:pPr>
+      <w:r>
+        <w:rPr>
+          <w:rFonts w:ascii="Arial" w:cs="Arial" w:eastAsia="Arial" w:hAnsi="Arial"/>
+          <w:color w:val="0A0A0A"/>
+          <w:sz w:val="21"/>
+          <w:szCs w:val="21"/>
+          <w:rtl/>
+        </w:rPr>
+        <w:t xml:space="preserve">שורת התגיות היא ההוכחה ששיראל הוא מוקד ידע למגוון מקרים, וגם רשימת הטריגרים למפנה. אם היא לא נכנסת בשורה אחת, מוותרים על "בני 55+".</w:t>
+      </w:r>
+    </w:p>
+    <w:p>
+      <w:pPr>
         <w:pStyle w:val="Heading2"/>
         <w:keepNext/>
         <w:bidi/>
@@ -12341,7 +12487,7 @@
                 <w:szCs w:val="20"/>
                 <w:rtl/>
               </w:rPr>
-              <w:t xml:space="preserve">2 נתונים (שורה אחת)</w:t>
+              <w:t xml:space="preserve">עדות לקוח (שורה אחת)</w:t>
             </w:r>
           </w:p>
         </w:tc>
@@ -12376,7 +12522,7 @@
                 <w:szCs w:val="20"/>
                 <w:rtl/>
               </w:rPr>
-              <w:t xml:space="preserve">B.A כלכלה + M.B.A · חבר בהתאחדות יועצי המשכנתאות</w:t>
+              <w:t xml:space="preserve">[עדות אמיתית: משפט אחד ושם פרטי]</w:t>
             </w:r>
           </w:p>
         </w:tc>
@@ -12411,7 +12557,7 @@
                 <w:szCs w:val="20"/>
                 <w:rtl/>
               </w:rPr>
-              <w:t xml:space="preserve">9.5pt · נקודות טורקיז</w:t>
+              <w:t xml:space="preserve">10pt · עד שתתקבל: B.A כלכלה + M.B.A · חבר בהתאחדות</w:t>
             </w:r>
           </w:p>
         </w:tc>
@@ -12589,7 +12735,7 @@
           <w:szCs w:val="21"/>
           <w:rtl/>
         </w:rPr>
-        <w:t xml:space="preserve">בלי ביוגרפיה. אם יש עדות לקוח אמיתית, היא תחליף את שורת הנתונים.</w:t>
+        <w:t xml:space="preserve">בלי ביוגרפיה. עדות לקוח מחליפה את שורת הנתונים: מפנה סומך על לקוח מרוצה יותר משהוא סומך על תואר.</w:t>
       </w:r>
     </w:p>
     <w:p>
@@ -14907,48 +15053,49 @@
             <w:r>
               <w:rPr>
                 <w:rFonts w:ascii="Arial" w:cs="Arial" w:eastAsia="Arial" w:hAnsi="Arial"/>
+                <w:b/>
+                <w:bCs/>
+                <w:color w:val="0A0A0A"/>
+                <w:sz w:val="20"/>
+                <w:szCs w:val="20"/>
+                <w:rtl/>
+              </w:rPr>
+              <w:t xml:space="preserve">שמעתם "הבנק אמר לא"? תכירו לו אותי, ואעדכן אתכם.</w:t>
+            </w:r>
+          </w:p>
+        </w:tc>
+        <w:tc>
+          <w:tcPr>
+            <w:tcW w:type="dxa" w:w="2600"/>
+            <w:tcBorders>
+              <w:top w:val="single" w:color="C9DCF8" w:sz="4"/>
+              <w:left w:val="single" w:color="C9DCF8" w:sz="4"/>
+              <w:bottom w:val="single" w:color="C9DCF8" w:sz="4"/>
+              <w:right w:val="single" w:color="C9DCF8" w:sz="4"/>
+            </w:tcBorders>
+            <w:tcMar>
+              <w:top w:type="dxa" w:w="70"/>
+              <w:left w:type="dxa" w:w="110"/>
+              <w:bottom w:type="dxa" w:w="70"/>
+              <w:right w:type="dxa" w:w="110"/>
+            </w:tcMar>
+          </w:tcPr>
+          <w:p>
+            <w:pPr>
+              <w:bidi/>
+              <w:spacing w:after="30" w:before="0" w:line="276"/>
+              <w:jc w:val="start"/>
+            </w:pPr>
+            <w:r>
+              <w:rPr>
+                <w:rFonts w:ascii="Arial" w:cs="Arial" w:eastAsia="Arial" w:hAnsi="Arial"/>
                 <w:b w:val="false"/>
                 <w:color w:val="0A0A0A"/>
                 <w:sz w:val="20"/>
                 <w:szCs w:val="20"/>
                 <w:rtl/>
               </w:rPr>
-              <w:t xml:space="preserve">מכירים מישהו שזה בדיוק המצב שלו? תכירו לו אותי.</w:t>
-            </w:r>
-          </w:p>
-        </w:tc>
-        <w:tc>
-          <w:tcPr>
-            <w:tcW w:type="dxa" w:w="2600"/>
-            <w:tcBorders>
-              <w:top w:val="single" w:color="C9DCF8" w:sz="4"/>
-              <w:left w:val="single" w:color="C9DCF8" w:sz="4"/>
-              <w:bottom w:val="single" w:color="C9DCF8" w:sz="4"/>
-              <w:right w:val="single" w:color="C9DCF8" w:sz="4"/>
-            </w:tcBorders>
-            <w:tcMar>
-              <w:top w:type="dxa" w:w="70"/>
-              <w:left w:type="dxa" w:w="110"/>
-              <w:bottom w:type="dxa" w:w="70"/>
-              <w:right w:type="dxa" w:w="110"/>
-            </w:tcMar>
-          </w:tcPr>
-          <w:p>
-            <w:pPr>
-              <w:bidi/>
-              <w:spacing w:after="30" w:before="0" w:line="276"/>
-              <w:jc w:val="start"/>
-            </w:pPr>
-            <w:r>
-              <w:rPr>
-                <w:rFonts w:ascii="Arial" w:cs="Arial" w:eastAsia="Arial" w:hAnsi="Arial"/>
-                <w:b w:val="false"/>
-                <w:color w:val="0A0A0A"/>
-                <w:sz w:val="20"/>
-                <w:szCs w:val="20"/>
-                <w:rtl/>
-              </w:rPr>
-              <w:t xml:space="preserve">9.5pt</w:t>
+              <w:t xml:space="preserve">10pt</w:t>
             </w:r>
           </w:p>
         </w:tc>
@@ -15927,7 +16074,627 @@
           <w:szCs w:val="34"/>
           <w:rtl/>
         </w:rPr>
-        <w:t xml:space="preserve">9. לאשר לפני עיצוב ודפוס</w:t>
+        <w:t xml:space="preserve">9. מבט של חבר BNI</w:t>
+      </w:r>
+    </w:p>
+    <w:p>
+      <w:pPr>
+        <w:bidi/>
+        <w:spacing w:after="120" w:before="0" w:line="300"/>
+        <w:jc w:val="start"/>
+      </w:pPr>
+      <w:r>
+        <w:rPr>
+          <w:rFonts w:ascii="Arial" w:cs="Arial" w:eastAsia="Arial" w:hAnsi="Arial"/>
+          <w:b/>
+          <w:bCs/>
+          <w:color w:val="0A0A0A"/>
+          <w:sz w:val="21"/>
+          <w:szCs w:val="21"/>
+          <w:rtl/>
+        </w:rPr>
+        <w:t xml:space="preserve">הרושם:</w:t>
+      </w:r>
+      <w:r>
+        <w:rPr>
+          <w:rFonts w:ascii="Arial" w:cs="Arial" w:eastAsia="Arial" w:hAnsi="Arial"/>
+          <w:color w:val="0A0A0A"/>
+          <w:sz w:val="21"/>
+          <w:szCs w:val="21"/>
+          <w:rtl/>
+        </w:rPr>
+        <w:t xml:space="preserve"> טוב. "הבנק מייצג את הבנק. מי מייצג אתכם?" נשאר בראש, הסיפור אמין, והעיצוב נקי. ברור ששיראל יועץ עצמאי.</w:t>
+      </w:r>
+    </w:p>
+    <w:tbl>
+      <w:tblPr>
+        <w:bidiVisual/>
+        <w:tblW w:type="dxa" w:w="9638"/>
+        <w:tblBorders>
+          <w:top w:val="single" w:color="auto" w:sz="4"/>
+          <w:left w:val="single" w:color="auto" w:sz="4"/>
+          <w:bottom w:val="single" w:color="auto" w:sz="4"/>
+          <w:right w:val="single" w:color="auto" w:sz="4"/>
+          <w:insideH w:val="single" w:color="auto" w:sz="4"/>
+          <w:insideV w:val="single" w:color="auto" w:sz="4"/>
+        </w:tblBorders>
+      </w:tblPr>
+      <w:tblGrid>
+        <w:gridCol w:w="3600"/>
+        <w:gridCol w:w="4838"/>
+        <w:gridCol w:w="1200"/>
+      </w:tblGrid>
+      <w:tr>
+        <w:trPr>
+          <w:cantSplit/>
+          <w:tblHeader/>
+        </w:trPr>
+        <w:tc>
+          <w:tcPr>
+            <w:tcW w:type="dxa" w:w="3600"/>
+            <w:tcBorders>
+              <w:top w:val="single" w:color="C9DCF8" w:sz="4"/>
+              <w:left w:val="single" w:color="C9DCF8" w:sz="4"/>
+              <w:bottom w:val="single" w:color="C9DCF8" w:sz="4"/>
+              <w:right w:val="single" w:color="C9DCF8" w:sz="4"/>
+            </w:tcBorders>
+            <w:shd w:fill="004AAD" w:color="auto" w:val="clear"/>
+            <w:tcMar>
+              <w:top w:type="dxa" w:w="70"/>
+              <w:left w:type="dxa" w:w="110"/>
+              <w:bottom w:type="dxa" w:w="70"/>
+              <w:right w:type="dxa" w:w="110"/>
+            </w:tcMar>
+          </w:tcPr>
+          <w:p>
+            <w:pPr>
+              <w:bidi/>
+              <w:spacing w:after="30" w:before="0" w:line="276"/>
+              <w:jc w:val="start"/>
+            </w:pPr>
+            <w:r>
+              <w:rPr>
+                <w:rFonts w:ascii="Arial" w:cs="Arial" w:eastAsia="Arial" w:hAnsi="Arial"/>
+                <w:b/>
+                <w:bCs/>
+                <w:color w:val="FFFFFF"/>
+                <w:sz w:val="20"/>
+                <w:szCs w:val="20"/>
+                <w:rtl/>
+              </w:rPr>
+              <w:t xml:space="preserve">פער</w:t>
+            </w:r>
+          </w:p>
+        </w:tc>
+        <w:tc>
+          <w:tcPr>
+            <w:tcW w:type="dxa" w:w="4838"/>
+            <w:tcBorders>
+              <w:top w:val="single" w:color="C9DCF8" w:sz="4"/>
+              <w:left w:val="single" w:color="C9DCF8" w:sz="4"/>
+              <w:bottom w:val="single" w:color="C9DCF8" w:sz="4"/>
+              <w:right w:val="single" w:color="C9DCF8" w:sz="4"/>
+            </w:tcBorders>
+            <w:shd w:fill="004AAD" w:color="auto" w:val="clear"/>
+            <w:tcMar>
+              <w:top w:type="dxa" w:w="70"/>
+              <w:left w:type="dxa" w:w="110"/>
+              <w:bottom w:type="dxa" w:w="70"/>
+              <w:right w:type="dxa" w:w="110"/>
+            </w:tcMar>
+          </w:tcPr>
+          <w:p>
+            <w:pPr>
+              <w:bidi/>
+              <w:spacing w:after="30" w:before="0" w:line="276"/>
+              <w:jc w:val="start"/>
+            </w:pPr>
+            <w:r>
+              <w:rPr>
+                <w:rFonts w:ascii="Arial" w:cs="Arial" w:eastAsia="Arial" w:hAnsi="Arial"/>
+                <w:b/>
+                <w:bCs/>
+                <w:color w:val="FFFFFF"/>
+                <w:sz w:val="20"/>
+                <w:szCs w:val="20"/>
+                <w:rtl/>
+              </w:rPr>
+              <w:t xml:space="preserve">התיקון</w:t>
+            </w:r>
+          </w:p>
+        </w:tc>
+        <w:tc>
+          <w:tcPr>
+            <w:tcW w:type="dxa" w:w="1200"/>
+            <w:tcBorders>
+              <w:top w:val="single" w:color="C9DCF8" w:sz="4"/>
+              <w:left w:val="single" w:color="C9DCF8" w:sz="4"/>
+              <w:bottom w:val="single" w:color="C9DCF8" w:sz="4"/>
+              <w:right w:val="single" w:color="C9DCF8" w:sz="4"/>
+            </w:tcBorders>
+            <w:shd w:fill="004AAD" w:color="auto" w:val="clear"/>
+            <w:tcMar>
+              <w:top w:type="dxa" w:w="70"/>
+              <w:left w:type="dxa" w:w="110"/>
+              <w:bottom w:type="dxa" w:w="70"/>
+              <w:right w:type="dxa" w:w="110"/>
+            </w:tcMar>
+          </w:tcPr>
+          <w:p>
+            <w:pPr>
+              <w:bidi/>
+              <w:spacing w:after="30" w:before="0" w:line="276"/>
+              <w:jc w:val="start"/>
+            </w:pPr>
+            <w:r>
+              <w:rPr>
+                <w:rFonts w:ascii="Arial" w:cs="Arial" w:eastAsia="Arial" w:hAnsi="Arial"/>
+                <w:b/>
+                <w:bCs/>
+                <w:color w:val="FFFFFF"/>
+                <w:sz w:val="20"/>
+                <w:szCs w:val="20"/>
+                <w:rtl/>
+              </w:rPr>
+              <w:t xml:space="preserve">פאנל</w:t>
+            </w:r>
+          </w:p>
+        </w:tc>
+      </w:tr>
+      <w:tr>
+        <w:trPr>
+          <w:cantSplit/>
+          <w:tblHeader w:val="false"/>
+        </w:trPr>
+        <w:tc>
+          <w:tcPr>
+            <w:tcW w:type="dxa" w:w="3600"/>
+            <w:tcBorders>
+              <w:top w:val="single" w:color="C9DCF8" w:sz="4"/>
+              <w:left w:val="single" w:color="C9DCF8" w:sz="4"/>
+              <w:bottom w:val="single" w:color="C9DCF8" w:sz="4"/>
+              <w:right w:val="single" w:color="C9DCF8" w:sz="4"/>
+            </w:tcBorders>
+            <w:tcMar>
+              <w:top w:type="dxa" w:w="70"/>
+              <w:left w:type="dxa" w:w="110"/>
+              <w:bottom w:type="dxa" w:w="70"/>
+              <w:right w:type="dxa" w:w="110"/>
+            </w:tcMar>
+          </w:tcPr>
+          <w:p>
+            <w:pPr>
+              <w:bidi/>
+              <w:spacing w:after="30" w:before="0" w:line="276"/>
+              <w:jc w:val="start"/>
+            </w:pPr>
+            <w:r>
+              <w:rPr>
+                <w:rFonts w:ascii="Arial" w:cs="Arial" w:eastAsia="Arial" w:hAnsi="Arial"/>
+                <w:color w:val="0A0A0A"/>
+                <w:sz w:val="20"/>
+                <w:szCs w:val="20"/>
+                <w:rtl/>
+              </w:rPr>
+              <w:t xml:space="preserve">מה קורה עם מי שאני מפנה? (המוניטין של המפנה)</w:t>
+            </w:r>
+          </w:p>
+        </w:tc>
+        <w:tc>
+          <w:tcPr>
+            <w:tcW w:type="dxa" w:w="4838"/>
+            <w:tcBorders>
+              <w:top w:val="single" w:color="C9DCF8" w:sz="4"/>
+              <w:left w:val="single" w:color="C9DCF8" w:sz="4"/>
+              <w:bottom w:val="single" w:color="C9DCF8" w:sz="4"/>
+              <w:right w:val="single" w:color="C9DCF8" w:sz="4"/>
+            </w:tcBorders>
+            <w:tcMar>
+              <w:top w:type="dxa" w:w="70"/>
+              <w:left w:type="dxa" w:w="110"/>
+              <w:bottom w:type="dxa" w:w="70"/>
+              <w:right w:type="dxa" w:w="110"/>
+            </w:tcMar>
+          </w:tcPr>
+          <w:p>
+            <w:pPr>
+              <w:bidi/>
+              <w:spacing w:after="30" w:before="0" w:line="276"/>
+              <w:jc w:val="start"/>
+            </w:pPr>
+            <w:r>
+              <w:rPr>
+                <w:rFonts w:ascii="Arial" w:cs="Arial" w:eastAsia="Arial" w:hAnsi="Arial"/>
+                <w:color w:val="0A0A0A"/>
+                <w:sz w:val="20"/>
+                <w:szCs w:val="20"/>
+                <w:rtl/>
+              </w:rPr>
+              <w:t xml:space="preserve">"תכירו לו אותי, ואעדכן אתכם."</w:t>
+            </w:r>
+          </w:p>
+        </w:tc>
+        <w:tc>
+          <w:tcPr>
+            <w:tcW w:type="dxa" w:w="1200"/>
+            <w:tcBorders>
+              <w:top w:val="single" w:color="C9DCF8" w:sz="4"/>
+              <w:left w:val="single" w:color="C9DCF8" w:sz="4"/>
+              <w:bottom w:val="single" w:color="C9DCF8" w:sz="4"/>
+              <w:right w:val="single" w:color="C9DCF8" w:sz="4"/>
+            </w:tcBorders>
+            <w:tcMar>
+              <w:top w:type="dxa" w:w="70"/>
+              <w:left w:type="dxa" w:w="110"/>
+              <w:bottom w:type="dxa" w:w="70"/>
+              <w:right w:type="dxa" w:w="110"/>
+            </w:tcMar>
+          </w:tcPr>
+          <w:p>
+            <w:pPr>
+              <w:bidi/>
+              <w:spacing w:after="30" w:before="0" w:line="276"/>
+              <w:jc w:val="start"/>
+            </w:pPr>
+            <w:r>
+              <w:rPr>
+                <w:rFonts w:ascii="Arial" w:cs="Arial" w:eastAsia="Arial" w:hAnsi="Arial"/>
+                <w:color w:val="0A0A0A"/>
+                <w:sz w:val="20"/>
+                <w:szCs w:val="20"/>
+                <w:rtl/>
+              </w:rPr>
+              <w:t xml:space="preserve">8</w:t>
+            </w:r>
+          </w:p>
+        </w:tc>
+      </w:tr>
+      <w:tr>
+        <w:trPr>
+          <w:cantSplit/>
+          <w:tblHeader w:val="false"/>
+        </w:trPr>
+        <w:tc>
+          <w:tcPr>
+            <w:tcW w:type="dxa" w:w="3600"/>
+            <w:tcBorders>
+              <w:top w:val="single" w:color="C9DCF8" w:sz="4"/>
+              <w:left w:val="single" w:color="C9DCF8" w:sz="4"/>
+              <w:bottom w:val="single" w:color="C9DCF8" w:sz="4"/>
+              <w:right w:val="single" w:color="C9DCF8" w:sz="4"/>
+            </w:tcBorders>
+            <w:tcMar>
+              <w:top w:type="dxa" w:w="70"/>
+              <w:left w:type="dxa" w:w="110"/>
+              <w:bottom w:type="dxa" w:w="70"/>
+              <w:right w:type="dxa" w:w="110"/>
+            </w:tcMar>
+          </w:tcPr>
+          <w:p>
+            <w:pPr>
+              <w:bidi/>
+              <w:spacing w:after="30" w:before="0" w:line="276"/>
+              <w:jc w:val="start"/>
+            </w:pPr>
+            <w:r>
+              <w:rPr>
+                <w:rFonts w:ascii="Arial" w:cs="Arial" w:eastAsia="Arial" w:hAnsi="Arial"/>
+                <w:color w:val="0A0A0A"/>
+                <w:sz w:val="20"/>
+                <w:szCs w:val="20"/>
+                <w:rtl/>
+              </w:rPr>
+              <w:t xml:space="preserve">טריגר הפניה כללי מדי</w:t>
+            </w:r>
+          </w:p>
+        </w:tc>
+        <w:tc>
+          <w:tcPr>
+            <w:tcW w:type="dxa" w:w="4838"/>
+            <w:tcBorders>
+              <w:top w:val="single" w:color="C9DCF8" w:sz="4"/>
+              <w:left w:val="single" w:color="C9DCF8" w:sz="4"/>
+              <w:bottom w:val="single" w:color="C9DCF8" w:sz="4"/>
+              <w:right w:val="single" w:color="C9DCF8" w:sz="4"/>
+            </w:tcBorders>
+            <w:tcMar>
+              <w:top w:type="dxa" w:w="70"/>
+              <w:left w:type="dxa" w:w="110"/>
+              <w:bottom w:type="dxa" w:w="70"/>
+              <w:right w:type="dxa" w:w="110"/>
+            </w:tcMar>
+          </w:tcPr>
+          <w:p>
+            <w:pPr>
+              <w:bidi/>
+              <w:spacing w:after="30" w:before="0" w:line="276"/>
+              <w:jc w:val="start"/>
+            </w:pPr>
+            <w:r>
+              <w:rPr>
+                <w:rFonts w:ascii="Arial" w:cs="Arial" w:eastAsia="Arial" w:hAnsi="Arial"/>
+                <w:color w:val="0A0A0A"/>
+                <w:sz w:val="20"/>
+                <w:szCs w:val="20"/>
+                <w:rtl/>
+              </w:rPr>
+              <w:t xml:space="preserve">משפט מוחשי ששומעים מלקוחות: "שמעתם 'הבנק אמר לא'?"</w:t>
+            </w:r>
+          </w:p>
+        </w:tc>
+        <w:tc>
+          <w:tcPr>
+            <w:tcW w:type="dxa" w:w="1200"/>
+            <w:tcBorders>
+              <w:top w:val="single" w:color="C9DCF8" w:sz="4"/>
+              <w:left w:val="single" w:color="C9DCF8" w:sz="4"/>
+              <w:bottom w:val="single" w:color="C9DCF8" w:sz="4"/>
+              <w:right w:val="single" w:color="C9DCF8" w:sz="4"/>
+            </w:tcBorders>
+            <w:tcMar>
+              <w:top w:type="dxa" w:w="70"/>
+              <w:left w:type="dxa" w:w="110"/>
+              <w:bottom w:type="dxa" w:w="70"/>
+              <w:right w:type="dxa" w:w="110"/>
+            </w:tcMar>
+          </w:tcPr>
+          <w:p>
+            <w:pPr>
+              <w:bidi/>
+              <w:spacing w:after="30" w:before="0" w:line="276"/>
+              <w:jc w:val="start"/>
+            </w:pPr>
+            <w:r>
+              <w:rPr>
+                <w:rFonts w:ascii="Arial" w:cs="Arial" w:eastAsia="Arial" w:hAnsi="Arial"/>
+                <w:color w:val="0A0A0A"/>
+                <w:sz w:val="20"/>
+                <w:szCs w:val="20"/>
+                <w:rtl/>
+              </w:rPr>
+              <w:t xml:space="preserve">8</w:t>
+            </w:r>
+          </w:p>
+        </w:tc>
+      </w:tr>
+      <w:tr>
+        <w:trPr>
+          <w:cantSplit/>
+          <w:tblHeader w:val="false"/>
+        </w:trPr>
+        <w:tc>
+          <w:tcPr>
+            <w:tcW w:type="dxa" w:w="3600"/>
+            <w:tcBorders>
+              <w:top w:val="single" w:color="C9DCF8" w:sz="4"/>
+              <w:left w:val="single" w:color="C9DCF8" w:sz="4"/>
+              <w:bottom w:val="single" w:color="C9DCF8" w:sz="4"/>
+              <w:right w:val="single" w:color="C9DCF8" w:sz="4"/>
+            </w:tcBorders>
+            <w:tcMar>
+              <w:top w:type="dxa" w:w="70"/>
+              <w:left w:type="dxa" w:w="110"/>
+              <w:bottom w:type="dxa" w:w="70"/>
+              <w:right w:type="dxa" w:w="110"/>
+            </w:tcMar>
+          </w:tcPr>
+          <w:p>
+            <w:pPr>
+              <w:bidi/>
+              <w:spacing w:after="30" w:before="0" w:line="276"/>
+              <w:jc w:val="start"/>
+            </w:pPr>
+            <w:r>
+              <w:rPr>
+                <w:rFonts w:ascii="Arial" w:cs="Arial" w:eastAsia="Arial" w:hAnsi="Arial"/>
+                <w:color w:val="0A0A0A"/>
+                <w:sz w:val="20"/>
+                <w:szCs w:val="20"/>
+                <w:rtl/>
+              </w:rPr>
+              <w:t xml:space="preserve">חסרה תחושה של מוקד ידע למגוון מקרים</w:t>
+            </w:r>
+          </w:p>
+        </w:tc>
+        <w:tc>
+          <w:tcPr>
+            <w:tcW w:type="dxa" w:w="4838"/>
+            <w:tcBorders>
+              <w:top w:val="single" w:color="C9DCF8" w:sz="4"/>
+              <w:left w:val="single" w:color="C9DCF8" w:sz="4"/>
+              <w:bottom w:val="single" w:color="C9DCF8" w:sz="4"/>
+              <w:right w:val="single" w:color="C9DCF8" w:sz="4"/>
+            </w:tcBorders>
+            <w:tcMar>
+              <w:top w:type="dxa" w:w="70"/>
+              <w:left w:type="dxa" w:w="110"/>
+              <w:bottom w:type="dxa" w:w="70"/>
+              <w:right w:type="dxa" w:w="110"/>
+            </w:tcMar>
+          </w:tcPr>
+          <w:p>
+            <w:pPr>
+              <w:bidi/>
+              <w:spacing w:after="30" w:before="0" w:line="276"/>
+              <w:jc w:val="start"/>
+            </w:pPr>
+            <w:r>
+              <w:rPr>
+                <w:rFonts w:ascii="Arial" w:cs="Arial" w:eastAsia="Arial" w:hAnsi="Arial"/>
+                <w:color w:val="0A0A0A"/>
+                <w:sz w:val="20"/>
+                <w:szCs w:val="20"/>
+                <w:rtl/>
+              </w:rPr>
+              <w:t xml:space="preserve">שורת התגיות "מקרים שאני פוגש כל הזמן", עם 7 סוגי אנשים</w:t>
+            </w:r>
+          </w:p>
+        </w:tc>
+        <w:tc>
+          <w:tcPr>
+            <w:tcW w:type="dxa" w:w="1200"/>
+            <w:tcBorders>
+              <w:top w:val="single" w:color="C9DCF8" w:sz="4"/>
+              <w:left w:val="single" w:color="C9DCF8" w:sz="4"/>
+              <w:bottom w:val="single" w:color="C9DCF8" w:sz="4"/>
+              <w:right w:val="single" w:color="C9DCF8" w:sz="4"/>
+            </w:tcBorders>
+            <w:tcMar>
+              <w:top w:type="dxa" w:w="70"/>
+              <w:left w:type="dxa" w:w="110"/>
+              <w:bottom w:type="dxa" w:w="70"/>
+              <w:right w:type="dxa" w:w="110"/>
+            </w:tcMar>
+          </w:tcPr>
+          <w:p>
+            <w:pPr>
+              <w:bidi/>
+              <w:spacing w:after="30" w:before="0" w:line="276"/>
+              <w:jc w:val="start"/>
+            </w:pPr>
+            <w:r>
+              <w:rPr>
+                <w:rFonts w:ascii="Arial" w:cs="Arial" w:eastAsia="Arial" w:hAnsi="Arial"/>
+                <w:color w:val="0A0A0A"/>
+                <w:sz w:val="20"/>
+                <w:szCs w:val="20"/>
+                <w:rtl/>
+              </w:rPr>
+              <w:t xml:space="preserve">5</w:t>
+            </w:r>
+          </w:p>
+        </w:tc>
+      </w:tr>
+      <w:tr>
+        <w:trPr>
+          <w:cantSplit/>
+          <w:tblHeader w:val="false"/>
+        </w:trPr>
+        <w:tc>
+          <w:tcPr>
+            <w:tcW w:type="dxa" w:w="3600"/>
+            <w:tcBorders>
+              <w:top w:val="single" w:color="C9DCF8" w:sz="4"/>
+              <w:left w:val="single" w:color="C9DCF8" w:sz="4"/>
+              <w:bottom w:val="single" w:color="C9DCF8" w:sz="4"/>
+              <w:right w:val="single" w:color="C9DCF8" w:sz="4"/>
+            </w:tcBorders>
+            <w:tcMar>
+              <w:top w:type="dxa" w:w="70"/>
+              <w:left w:type="dxa" w:w="110"/>
+              <w:bottom w:type="dxa" w:w="70"/>
+              <w:right w:type="dxa" w:w="110"/>
+            </w:tcMar>
+          </w:tcPr>
+          <w:p>
+            <w:pPr>
+              <w:bidi/>
+              <w:spacing w:after="30" w:before="0" w:line="276"/>
+              <w:jc w:val="start"/>
+            </w:pPr>
+            <w:r>
+              <w:rPr>
+                <w:rFonts w:ascii="Arial" w:cs="Arial" w:eastAsia="Arial" w:hAnsi="Arial"/>
+                <w:color w:val="0A0A0A"/>
+                <w:sz w:val="20"/>
+                <w:szCs w:val="20"/>
+                <w:rtl/>
+              </w:rPr>
+              <w:t xml:space="preserve">חסרה הוכחה חברתית</w:t>
+            </w:r>
+          </w:p>
+        </w:tc>
+        <w:tc>
+          <w:tcPr>
+            <w:tcW w:type="dxa" w:w="4838"/>
+            <w:tcBorders>
+              <w:top w:val="single" w:color="C9DCF8" w:sz="4"/>
+              <w:left w:val="single" w:color="C9DCF8" w:sz="4"/>
+              <w:bottom w:val="single" w:color="C9DCF8" w:sz="4"/>
+              <w:right w:val="single" w:color="C9DCF8" w:sz="4"/>
+            </w:tcBorders>
+            <w:tcMar>
+              <w:top w:type="dxa" w:w="70"/>
+              <w:left w:type="dxa" w:w="110"/>
+              <w:bottom w:type="dxa" w:w="70"/>
+              <w:right w:type="dxa" w:w="110"/>
+            </w:tcMar>
+          </w:tcPr>
+          <w:p>
+            <w:pPr>
+              <w:bidi/>
+              <w:spacing w:after="30" w:before="0" w:line="276"/>
+              <w:jc w:val="start"/>
+            </w:pPr>
+            <w:r>
+              <w:rPr>
+                <w:rFonts w:ascii="Arial" w:cs="Arial" w:eastAsia="Arial" w:hAnsi="Arial"/>
+                <w:color w:val="0A0A0A"/>
+                <w:sz w:val="20"/>
+                <w:szCs w:val="20"/>
+                <w:rtl/>
+              </w:rPr>
+              <w:t xml:space="preserve">עדות לקוח אמיתית (פתוח)</w:t>
+            </w:r>
+          </w:p>
+        </w:tc>
+        <w:tc>
+          <w:tcPr>
+            <w:tcW w:type="dxa" w:w="1200"/>
+            <w:tcBorders>
+              <w:top w:val="single" w:color="C9DCF8" w:sz="4"/>
+              <w:left w:val="single" w:color="C9DCF8" w:sz="4"/>
+              <w:bottom w:val="single" w:color="C9DCF8" w:sz="4"/>
+              <w:right w:val="single" w:color="C9DCF8" w:sz="4"/>
+            </w:tcBorders>
+            <w:tcMar>
+              <w:top w:type="dxa" w:w="70"/>
+              <w:left w:type="dxa" w:w="110"/>
+              <w:bottom w:type="dxa" w:w="70"/>
+              <w:right w:type="dxa" w:w="110"/>
+            </w:tcMar>
+          </w:tcPr>
+          <w:p>
+            <w:pPr>
+              <w:bidi/>
+              <w:spacing w:after="30" w:before="0" w:line="276"/>
+              <w:jc w:val="start"/>
+            </w:pPr>
+            <w:r>
+              <w:rPr>
+                <w:rFonts w:ascii="Arial" w:cs="Arial" w:eastAsia="Arial" w:hAnsi="Arial"/>
+                <w:color w:val="0A0A0A"/>
+                <w:sz w:val="20"/>
+                <w:szCs w:val="20"/>
+                <w:rtl/>
+              </w:rPr>
+              <w:t xml:space="preserve">6</w:t>
+            </w:r>
+          </w:p>
+        </w:tc>
+      </w:tr>
+    </w:tbl>
+    <w:p>
+      <w:pPr>
+        <w:pStyle w:val="Heading1"/>
+        <w:keepNext/>
+        <w:pBdr>
+          <w:bottom w:val="single" w:color="1EC8C8" w:sz="12" w:space="6"/>
+        </w:pBdr>
+        <w:bidi/>
+        <w:spacing w:after="160" w:before="360"/>
+      </w:pPr>
+      <w:r>
+        <w:rPr>
+          <w:rFonts w:ascii="Arial" w:cs="Arial" w:eastAsia="Arial" w:hAnsi="Arial"/>
+          <w:b/>
+          <w:bCs/>
+          <w:color w:val="004AAD"/>
+          <w:sz w:val="34"/>
+          <w:szCs w:val="34"/>
+          <w:rtl/>
+        </w:rPr>
+        <w:t xml:space="preserve">10. לאשר לפני עיצוב ודפוס</w:t>
       </w:r>
     </w:p>
     <w:p>

</xml_diff>

<commit_message>
Brochure copy: '3 apartments by 30' proof (panel 3), learned-what-nobody-taught line (panel 6)
Co-Authored-By: Claude Opus 5.5 <noreply@anthropic.com>
Claude-Session: https://claude.ai/code/session_01KhCungy6SpcQ77bdWEeQSw
</commit_message>
<xml_diff>
--- a/brochure/MAKESENSE-brochure-copy.docx
+++ b/brochure/MAKESENSE-brochure-copy.docx
@@ -8505,7 +8505,7 @@
                 <w:szCs w:val="20"/>
                 <w:rtl/>
               </w:rPr>
-              <w:t xml:space="preserve">אני משקיע נדל"ן בעצמי. השאלה היא כמה נכון לקחת.</w:t>
+              <w:t xml:space="preserve">קניתי 3 דירות עד גיל 30. השאלה היא תמיד כמה נכון לקחת.</w:t>
             </w:r>
           </w:p>
         </w:tc>
@@ -12409,7 +12409,7 @@
                 <w:szCs w:val="20"/>
                 <w:rtl/>
               </w:rPr>
-              <w:t xml:space="preserve">אז בחרתי ללמוד, להתמקצע, ולעמוד לצד מי שצריך.</w:t>
+              <w:t xml:space="preserve">למדתי את מה שאף אחד לא לימד אותנו. היום אני עומד לצד מי שצריך.</w:t>
             </w:r>
           </w:p>
         </w:tc>
@@ -15464,7 +15464,7 @@
           <w:szCs w:val="21"/>
           <w:rtl/>
         </w:rPr>
-        <w:t xml:space="preserve">"אני משקיע נדל"ן בעצמי" עובר לפאנל 3,</w:t>
+        <w:t xml:space="preserve">"קניתי 3 דירות עד גיל 30" נמצא בפאנל 3,</w:t>
       </w:r>
       <w:r>
         <w:rPr>
@@ -15474,7 +15474,7 @@
           <w:szCs w:val="21"/>
           <w:rtl/>
         </w:rPr>
-        <w:t xml:space="preserve"> ושם הוא משמש הוכחה.</w:t>
+        <w:t xml:space="preserve"> ושם הוא משמש הוכחה מוחשית.</w:t>
       </w:r>
     </w:p>
     <w:p>

</xml_diff>

<commit_message>
Brochure panel 8: partner referral line (docx)
Co-Authored-By: Claude Opus 5.5 <noreply@anthropic.com>
Claude-Session: https://claude.ai/code/session_01KhCungy6SpcQ77bdWEeQSw
</commit_message>
<xml_diff>
--- a/brochure/MAKESENSE-brochure-copy.docx
+++ b/brochure/MAKESENSE-brochure-copy.docx
@@ -15060,7 +15060,7 @@
                 <w:szCs w:val="20"/>
                 <w:rtl/>
               </w:rPr>
-              <w:t xml:space="preserve">שמעתם "הבנק אמר לא"? תכירו לו אותי, ואעדכן אתכם.</w:t>
+              <w:t xml:space="preserve">מכירים מישהו שתקוע מול הבנק? תפנו אותו אליי, ואעדכן אתכם בכל שלב.</w:t>
             </w:r>
           </w:p>
         </w:tc>
@@ -16418,7 +16418,7 @@
                 <w:szCs w:val="20"/>
                 <w:rtl/>
               </w:rPr>
-              <w:t xml:space="preserve">משפט מוחשי ששומעים מלקוחות: "שמעתם 'הבנק אמר לא'?"</w:t>
+              <w:t xml:space="preserve">"מכירים מישהו שתקוע מול הבנק? תפנו אותו אליי."</w:t>
             </w:r>
           </w:p>
         </w:tc>

</xml_diff>

<commit_message>
Brochure: real client testimonials (panels 3, 6) + testimonial bank
Co-Authored-By: Claude Opus 5.5 <noreply@anthropic.com>
Claude-Session: https://claude.ai/code/session_01KhCungy6SpcQ77bdWEeQSw
</commit_message>
<xml_diff>
--- a/brochure/MAKESENSE-brochure-copy.docx
+++ b/brochure/MAKESENSE-brochure-copy.docx
@@ -8583,7 +8583,7 @@
                 <w:szCs w:val="20"/>
                 <w:rtl/>
               </w:rPr>
-              <w:t xml:space="preserve">3 מסרים (שורת אייקונים)</w:t>
+              <w:t xml:space="preserve">עדות (שורה אחת)</w:t>
             </w:r>
           </w:p>
         </w:tc>
@@ -8618,7 +8618,7 @@
                 <w:szCs w:val="20"/>
                 <w:rtl/>
               </w:rPr>
-              <w:t xml:space="preserve">בדיקת כדאיות · הון עצמי מנכס קיים · תכנון המימון</w:t>
+              <w:t xml:space="preserve">"ידע להנחות אותנו בצורה ברורה לאורך כל התהליך." · בן, נכס להשקעה</w:t>
             </w:r>
           </w:p>
         </w:tc>
@@ -8653,7 +8653,7 @@
                 <w:szCs w:val="20"/>
                 <w:rtl/>
               </w:rPr>
-              <w:t xml:space="preserve">9.5pt · אפשר להסיר (ראו ביקורת)</w:t>
+              <w:t xml:space="preserve">9.4pt · כחול</w:t>
             </w:r>
           </w:p>
         </w:tc>
@@ -12409,7 +12409,7 @@
                 <w:szCs w:val="20"/>
                 <w:rtl/>
               </w:rPr>
-              <w:t xml:space="preserve">למדתי את מה שאף אחד לא לימד אותנו. היום אני עומד לצד מי שצריך.</w:t>
+              <w:t xml:space="preserve">למדתי את מה שאף אחד לא לימד אותנו.</w:t>
             </w:r>
           </w:p>
         </w:tc>
@@ -12487,6 +12487,119 @@
                 <w:szCs w:val="20"/>
                 <w:rtl/>
               </w:rPr>
+              <w:t xml:space="preserve">נתונים (שורה אחת)</w:t>
+            </w:r>
+          </w:p>
+        </w:tc>
+        <w:tc>
+          <w:tcPr>
+            <w:tcW w:type="dxa" w:w="4838"/>
+            <w:tcBorders>
+              <w:top w:val="single" w:color="C9DCF8" w:sz="4"/>
+              <w:left w:val="single" w:color="C9DCF8" w:sz="4"/>
+              <w:bottom w:val="single" w:color="C9DCF8" w:sz="4"/>
+              <w:right w:val="single" w:color="C9DCF8" w:sz="4"/>
+            </w:tcBorders>
+            <w:tcMar>
+              <w:top w:type="dxa" w:w="70"/>
+              <w:left w:type="dxa" w:w="110"/>
+              <w:bottom w:type="dxa" w:w="70"/>
+              <w:right w:type="dxa" w:w="110"/>
+            </w:tcMar>
+          </w:tcPr>
+          <w:p>
+            <w:pPr>
+              <w:bidi/>
+              <w:spacing w:after="30" w:before="0" w:line="276"/>
+              <w:jc w:val="start"/>
+            </w:pPr>
+            <w:r>
+              <w:rPr>
+                <w:rFonts w:ascii="Arial" w:cs="Arial" w:eastAsia="Arial" w:hAnsi="Arial"/>
+                <w:b w:val="false"/>
+                <w:color w:val="0A0A0A"/>
+                <w:sz w:val="20"/>
+                <w:szCs w:val="20"/>
+                <w:rtl/>
+              </w:rPr>
+              <w:t xml:space="preserve">B.A כלכלה + M.B.A · חבר בהתאחדות יועצי המשכנתאות</w:t>
+            </w:r>
+          </w:p>
+        </w:tc>
+        <w:tc>
+          <w:tcPr>
+            <w:tcW w:type="dxa" w:w="2600"/>
+            <w:tcBorders>
+              <w:top w:val="single" w:color="C9DCF8" w:sz="4"/>
+              <w:left w:val="single" w:color="C9DCF8" w:sz="4"/>
+              <w:bottom w:val="single" w:color="C9DCF8" w:sz="4"/>
+              <w:right w:val="single" w:color="C9DCF8" w:sz="4"/>
+            </w:tcBorders>
+            <w:tcMar>
+              <w:top w:type="dxa" w:w="70"/>
+              <w:left w:type="dxa" w:w="110"/>
+              <w:bottom w:type="dxa" w:w="70"/>
+              <w:right w:type="dxa" w:w="110"/>
+            </w:tcMar>
+          </w:tcPr>
+          <w:p>
+            <w:pPr>
+              <w:bidi/>
+              <w:spacing w:after="30" w:before="0" w:line="276"/>
+              <w:jc w:val="start"/>
+            </w:pPr>
+            <w:r>
+              <w:rPr>
+                <w:rFonts w:ascii="Arial" w:cs="Arial" w:eastAsia="Arial" w:hAnsi="Arial"/>
+                <w:b w:val="false"/>
+                <w:color w:val="0A0A0A"/>
+                <w:sz w:val="20"/>
+                <w:szCs w:val="20"/>
+                <w:rtl/>
+              </w:rPr>
+              <w:t xml:space="preserve">9pt · אפור</w:t>
+            </w:r>
+          </w:p>
+        </w:tc>
+      </w:tr>
+      <w:tr>
+        <w:trPr>
+          <w:cantSplit/>
+          <w:tblHeader w:val="false"/>
+        </w:trPr>
+        <w:tc>
+          <w:tcPr>
+            <w:tcW w:type="dxa" w:w="2200"/>
+            <w:tcBorders>
+              <w:top w:val="single" w:color="C9DCF8" w:sz="4"/>
+              <w:left w:val="single" w:color="C9DCF8" w:sz="4"/>
+              <w:bottom w:val="single" w:color="C9DCF8" w:sz="4"/>
+              <w:right w:val="single" w:color="C9DCF8" w:sz="4"/>
+            </w:tcBorders>
+            <w:shd w:fill="EAF2FE" w:color="auto" w:val="clear"/>
+            <w:tcMar>
+              <w:top w:type="dxa" w:w="70"/>
+              <w:left w:type="dxa" w:w="110"/>
+              <w:bottom w:type="dxa" w:w="70"/>
+              <w:right w:type="dxa" w:w="110"/>
+            </w:tcMar>
+          </w:tcPr>
+          <w:p>
+            <w:pPr>
+              <w:bidi/>
+              <w:spacing w:after="30" w:before="0" w:line="276"/>
+              <w:jc w:val="start"/>
+            </w:pPr>
+            <w:r>
+              <w:rPr>
+                <w:rFonts w:ascii="Arial" w:cs="Arial" w:eastAsia="Arial" w:hAnsi="Arial"/>
+                <w:b/>
+                <w:bCs/>
+                <w:color w:val="0A0A0A"/>
+                <w:sz w:val="20"/>
+                <w:szCs w:val="20"/>
+                <w:rtl/>
+              </w:rPr>
               <w:t xml:space="preserve">עדות לקוח (שורה אחת)</w:t>
             </w:r>
           </w:p>
@@ -12516,13 +12629,25 @@
             <w:r>
               <w:rPr>
                 <w:rFonts w:ascii="Arial" w:cs="Arial" w:eastAsia="Arial" w:hAnsi="Arial"/>
+                <w:b/>
+                <w:bCs/>
+                <w:color w:val="0A0A0A"/>
+                <w:sz w:val="20"/>
+                <w:szCs w:val="20"/>
+                <w:rtl/>
+              </w:rPr>
+              <w:t xml:space="preserve">"יש לו המון ידע, והמון סבלנות."</w:t>
+            </w:r>
+            <w:r>
+              <w:rPr>
+                <w:rFonts w:ascii="Arial" w:cs="Arial" w:eastAsia="Arial" w:hAnsi="Arial"/>
                 <w:b w:val="false"/>
                 <w:color w:val="0A0A0A"/>
                 <w:sz w:val="20"/>
                 <w:szCs w:val="20"/>
                 <w:rtl/>
               </w:rPr>
-              <w:t xml:space="preserve">[עדות אמיתית: משפט אחד ושם פרטי]</w:t>
+              <w:t xml:space="preserve"> · יונתן, הגיע עם מצב מורכב מהסטנדרט</w:t>
             </w:r>
           </w:p>
         </w:tc>
@@ -12557,7 +12682,7 @@
                 <w:szCs w:val="20"/>
                 <w:rtl/>
               </w:rPr>
-              <w:t xml:space="preserve">10pt · עד שתתקבל: B.A כלכלה + M.B.A · חבר בהתאחדות</w:t>
+              <w:t xml:space="preserve">9.4pt · כחול</w:t>
             </w:r>
           </w:p>
         </w:tc>
@@ -16634,7 +16759,7 @@
                 <w:szCs w:val="20"/>
                 <w:rtl/>
               </w:rPr>
-              <w:t xml:space="preserve">עדות לקוח אמיתית (פתוח)</w:t>
+              <w:t xml:space="preserve">עדויות אמיתיות של יונתן ובן (צריך אישור שם)</w:t>
             </w:r>
           </w:p>
         </w:tc>
@@ -16668,7 +16793,7 @@
                 <w:szCs w:val="20"/>
                 <w:rtl/>
               </w:rPr>
-              <w:t xml:space="preserve">6</w:t>
+              <w:t xml:space="preserve">3, 6</w:t>
             </w:r>
           </w:p>
         </w:tc>
@@ -16715,7 +16840,7 @@
           <w:szCs w:val="21"/>
           <w:rtl/>
         </w:rPr>
-        <w:t xml:space="preserve">הוצאת הפירמידה מהעלון.</w:t>
+        <w:t xml:space="preserve">אישור מיונתן ומבן להשתמש בשם הפרטי ובציטוט.</w:t>
       </w:r>
     </w:p>
     <w:p>
@@ -16736,7 +16861,7 @@
           <w:szCs w:val="21"/>
           <w:rtl/>
         </w:rPr>
-        <w:t xml:space="preserve">הכיתוב "יועץ פיננסי עצמאי" מתחת לשם.</w:t>
+        <w:t xml:space="preserve">הוצאת הפירמידה מהעלון.</w:t>
       </w:r>
     </w:p>
     <w:p>
@@ -16757,7 +16882,7 @@
           <w:szCs w:val="21"/>
           <w:rtl/>
         </w:rPr>
-        <w:t xml:space="preserve">"במרחק שיחה" בשלושה פאנלים, או בגב בלבד.</w:t>
+        <w:t xml:space="preserve">הכיתוב "יועץ פיננסי עצמאי" מתחת לשם.</w:t>
       </w:r>
     </w:p>
     <w:p>
@@ -16778,7 +16903,7 @@
           <w:szCs w:val="21"/>
           <w:rtl/>
         </w:rPr>
-        <w:t xml:space="preserve">עדות לקוח אמיתית (שורה אחת עם שם פרטי), אם יש.</w:t>
+        <w:t xml:space="preserve">"במרחק שיחה" בשלושה פאנלים, או בגב בלבד.</w:t>
       </w:r>
     </w:p>
     <w:p>
@@ -16799,7 +16924,7 @@
           <w:szCs w:val="21"/>
           <w:rtl/>
         </w:rPr>
-        <w:t xml:space="preserve">קישור ה-QR: wa.me/972524415395, עם הודעה כתובה מראש.</w:t>
+        <w:t xml:space="preserve">עדות לקוח אמיתית (שורה אחת עם שם פרטי), אם יש.</w:t>
       </w:r>
     </w:p>
     <w:p>
@@ -16820,6 +16945,27 @@
           <w:szCs w:val="21"/>
           <w:rtl/>
         </w:rPr>
+        <w:t xml:space="preserve">קישור ה-QR: wa.me/972524415395, עם הודעה כתובה מראש.</w:t>
+      </w:r>
+    </w:p>
+    <w:p>
+      <w:pPr>
+        <w:pStyle w:val="ListParagraph"/>
+        <w:numPr>
+          <w:ilvl w:val="0"/>
+          <w:numId w:val="2"/>
+        </w:numPr>
+        <w:bidi/>
+        <w:spacing w:after="60" w:line="290"/>
+      </w:pPr>
+      <w:r>
+        <w:rPr>
+          <w:rFonts w:ascii="Arial" w:cs="Arial" w:eastAsia="Arial" w:hAnsi="Arial"/>
+          <w:color w:val="0A0A0A"/>
+          <w:sz w:val="21"/>
+          <w:szCs w:val="21"/>
+          <w:rtl/>
+        </w:rPr>
         <w:t xml:space="preserve">צילום של שיראל ברזולוציה גבוהה (300dpi בגודל ההדפסה).</w:t>
       </w:r>
     </w:p>
@@ -19874,6 +20020,686 @@
           <w:sz w:val="15"/>
           <w:szCs w:val="15"/>
         </w:rPr>
+        <w:t xml:space="preserve">              "role": "testimonial",</w:t>
+      </w:r>
+    </w:p>
+    <w:p>
+      <w:pPr>
+        <w:shd w:fill="F4F6FA" w:color="auto" w:val="clear"/>
+        <w:bidi w:val="false"/>
+        <w:spacing w:after="0" w:line="230"/>
+        <w:jc w:val="left"/>
+      </w:pPr>
+      <w:r>
+        <w:rPr>
+          <w:rFonts w:ascii="Consolas" w:cs="Consolas" w:eastAsia="Consolas" w:hAnsi="Consolas"/>
+          <w:color w:val="1F2937"/>
+          <w:sz w:val="15"/>
+          <w:szCs w:val="15"/>
+        </w:rPr>
+        <w:t xml:space="preserve">              "size_pt": 9.4,</w:t>
+      </w:r>
+    </w:p>
+    <w:p>
+      <w:pPr>
+        <w:shd w:fill="F4F6FA" w:color="auto" w:val="clear"/>
+        <w:bidi w:val="false"/>
+        <w:spacing w:after="0" w:line="230"/>
+        <w:jc w:val="left"/>
+      </w:pPr>
+      <w:r>
+        <w:rPr>
+          <w:rFonts w:ascii="Consolas" w:cs="Consolas" w:eastAsia="Consolas" w:hAnsi="Consolas"/>
+          <w:color w:val="1F2937"/>
+          <w:sz w:val="15"/>
+          <w:szCs w:val="15"/>
+        </w:rPr>
+        <w:t xml:space="preserve">              "value": "ידע להנחות אותנו בצורה ברורה לאורך כל התהליך.",</w:t>
+      </w:r>
+    </w:p>
+    <w:p>
+      <w:pPr>
+        <w:shd w:fill="F4F6FA" w:color="auto" w:val="clear"/>
+        <w:bidi w:val="false"/>
+        <w:spacing w:after="0" w:line="230"/>
+        <w:jc w:val="left"/>
+      </w:pPr>
+      <w:r>
+        <w:rPr>
+          <w:rFonts w:ascii="Consolas" w:cs="Consolas" w:eastAsia="Consolas" w:hAnsi="Consolas"/>
+          <w:color w:val="1F2937"/>
+          <w:sz w:val="15"/>
+          <w:szCs w:val="15"/>
+        </w:rPr>
+        <w:t xml:space="preserve">              "by": "בן, נכס להשקעה"</w:t>
+      </w:r>
+    </w:p>
+    <w:p>
+      <w:pPr>
+        <w:shd w:fill="F4F6FA" w:color="auto" w:val="clear"/>
+        <w:bidi w:val="false"/>
+        <w:spacing w:after="0" w:line="230"/>
+        <w:jc w:val="left"/>
+      </w:pPr>
+      <w:r>
+        <w:rPr>
+          <w:rFonts w:ascii="Consolas" w:cs="Consolas" w:eastAsia="Consolas" w:hAnsi="Consolas"/>
+          <w:color w:val="1F2937"/>
+          <w:sz w:val="15"/>
+          <w:szCs w:val="15"/>
+        </w:rPr>
+        <w:t xml:space="preserve">            },</w:t>
+      </w:r>
+    </w:p>
+    <w:p>
+      <w:pPr>
+        <w:shd w:fill="F4F6FA" w:color="auto" w:val="clear"/>
+        <w:bidi w:val="false"/>
+        <w:spacing w:after="0" w:line="230"/>
+        <w:jc w:val="left"/>
+      </w:pPr>
+      <w:r>
+        <w:rPr>
+          <w:rFonts w:ascii="Consolas" w:cs="Consolas" w:eastAsia="Consolas" w:hAnsi="Consolas"/>
+          <w:color w:val="1F2937"/>
+          <w:sz w:val="15"/>
+          <w:szCs w:val="15"/>
+        </w:rPr>
+        <w:t xml:space="preserve">            {</w:t>
+      </w:r>
+    </w:p>
+    <w:p>
+      <w:pPr>
+        <w:shd w:fill="F4F6FA" w:color="auto" w:val="clear"/>
+        <w:bidi w:val="false"/>
+        <w:spacing w:after="0" w:line="230"/>
+        <w:jc w:val="left"/>
+      </w:pPr>
+      <w:r>
+        <w:rPr>
+          <w:rFonts w:ascii="Consolas" w:cs="Consolas" w:eastAsia="Consolas" w:hAnsi="Consolas"/>
+          <w:color w:val="1F2937"/>
+          <w:sz w:val="15"/>
+          <w:szCs w:val="15"/>
+        </w:rPr>
+        <w:t xml:space="preserve">              "role": "cta",</w:t>
+      </w:r>
+    </w:p>
+    <w:p>
+      <w:pPr>
+        <w:shd w:fill="F4F6FA" w:color="auto" w:val="clear"/>
+        <w:bidi w:val="false"/>
+        <w:spacing w:after="0" w:line="230"/>
+        <w:jc w:val="left"/>
+      </w:pPr>
+      <w:r>
+        <w:rPr>
+          <w:rFonts w:ascii="Consolas" w:cs="Consolas" w:eastAsia="Consolas" w:hAnsi="Consolas"/>
+          <w:color w:val="1F2937"/>
+          <w:sz w:val="15"/>
+          <w:szCs w:val="15"/>
+        </w:rPr>
+        <w:t xml:space="preserve">              "size_pt": 11,</w:t>
+      </w:r>
+    </w:p>
+    <w:p>
+      <w:pPr>
+        <w:shd w:fill="F4F6FA" w:color="auto" w:val="clear"/>
+        <w:bidi w:val="false"/>
+        <w:spacing w:after="0" w:line="230"/>
+        <w:jc w:val="left"/>
+      </w:pPr>
+      <w:r>
+        <w:rPr>
+          <w:rFonts w:ascii="Consolas" w:cs="Consolas" w:eastAsia="Consolas" w:hAnsi="Consolas"/>
+          <w:color w:val="1F2937"/>
+          <w:sz w:val="15"/>
+          <w:szCs w:val="15"/>
+        </w:rPr>
+        <w:t xml:space="preserve">              "value": "הנכס הבא, במרחק שיחה · 052-441-5395"</w:t>
+      </w:r>
+    </w:p>
+    <w:p>
+      <w:pPr>
+        <w:shd w:fill="F4F6FA" w:color="auto" w:val="clear"/>
+        <w:bidi w:val="false"/>
+        <w:spacing w:after="0" w:line="230"/>
+        <w:jc w:val="left"/>
+      </w:pPr>
+      <w:r>
+        <w:rPr>
+          <w:rFonts w:ascii="Consolas" w:cs="Consolas" w:eastAsia="Consolas" w:hAnsi="Consolas"/>
+          <w:color w:val="1F2937"/>
+          <w:sz w:val="15"/>
+          <w:szCs w:val="15"/>
+        </w:rPr>
+        <w:t xml:space="preserve">            }</w:t>
+      </w:r>
+    </w:p>
+    <w:p>
+      <w:pPr>
+        <w:shd w:fill="F4F6FA" w:color="auto" w:val="clear"/>
+        <w:bidi w:val="false"/>
+        <w:spacing w:after="0" w:line="230"/>
+        <w:jc w:val="left"/>
+      </w:pPr>
+      <w:r>
+        <w:rPr>
+          <w:rFonts w:ascii="Consolas" w:cs="Consolas" w:eastAsia="Consolas" w:hAnsi="Consolas"/>
+          <w:color w:val="1F2937"/>
+          <w:sz w:val="15"/>
+          <w:szCs w:val="15"/>
+        </w:rPr>
+        <w:t xml:space="preserve">          ],</w:t>
+      </w:r>
+    </w:p>
+    <w:p>
+      <w:pPr>
+        <w:shd w:fill="F4F6FA" w:color="auto" w:val="clear"/>
+        <w:bidi w:val="false"/>
+        <w:spacing w:after="0" w:line="230"/>
+        <w:jc w:val="left"/>
+      </w:pPr>
+      <w:r>
+        <w:rPr>
+          <w:rFonts w:ascii="Consolas" w:cs="Consolas" w:eastAsia="Consolas" w:hAnsi="Consolas"/>
+          <w:color w:val="1F2937"/>
+          <w:sz w:val="15"/>
+          <w:szCs w:val="15"/>
+        </w:rPr>
+        <w:t xml:space="preserve">          "visuals": [</w:t>
+      </w:r>
+    </w:p>
+    <w:p>
+      <w:pPr>
+        <w:shd w:fill="F4F6FA" w:color="auto" w:val="clear"/>
+        <w:bidi w:val="false"/>
+        <w:spacing w:after="0" w:line="230"/>
+        <w:jc w:val="left"/>
+      </w:pPr>
+      <w:r>
+        <w:rPr>
+          <w:rFonts w:ascii="Consolas" w:cs="Consolas" w:eastAsia="Consolas" w:hAnsi="Consolas"/>
+          <w:color w:val="1F2937"/>
+          <w:sz w:val="15"/>
+          <w:szCs w:val="15"/>
+        </w:rPr>
+        <w:t xml:space="preserve">            "one large thin-line icon: calculator + house, left side"</w:t>
+      </w:r>
+    </w:p>
+    <w:p>
+      <w:pPr>
+        <w:shd w:fill="F4F6FA" w:color="auto" w:val="clear"/>
+        <w:bidi w:val="false"/>
+        <w:spacing w:after="0" w:line="230"/>
+        <w:jc w:val="left"/>
+      </w:pPr>
+      <w:r>
+        <w:rPr>
+          <w:rFonts w:ascii="Consolas" w:cs="Consolas" w:eastAsia="Consolas" w:hAnsi="Consolas"/>
+          <w:color w:val="1F2937"/>
+          <w:sz w:val="15"/>
+          <w:szCs w:val="15"/>
+        </w:rPr>
+        <w:t xml:space="preserve">          ]</w:t>
+      </w:r>
+    </w:p>
+    <w:p>
+      <w:pPr>
+        <w:shd w:fill="F4F6FA" w:color="auto" w:val="clear"/>
+        <w:bidi w:val="false"/>
+        <w:spacing w:after="0" w:line="230"/>
+        <w:jc w:val="left"/>
+      </w:pPr>
+      <w:r>
+        <w:rPr>
+          <w:rFonts w:ascii="Consolas" w:cs="Consolas" w:eastAsia="Consolas" w:hAnsi="Consolas"/>
+          <w:color w:val="1F2937"/>
+          <w:sz w:val="15"/>
+          <w:szCs w:val="15"/>
+        </w:rPr>
+        <w:t xml:space="preserve">        },</w:t>
+      </w:r>
+    </w:p>
+    <w:p>
+      <w:pPr>
+        <w:shd w:fill="F4F6FA" w:color="auto" w:val="clear"/>
+        <w:bidi w:val="false"/>
+        <w:spacing w:after="0" w:line="230"/>
+        <w:jc w:val="left"/>
+      </w:pPr>
+      <w:r>
+        <w:rPr>
+          <w:rFonts w:ascii="Consolas" w:cs="Consolas" w:eastAsia="Consolas" w:hAnsi="Consolas"/>
+          <w:color w:val="1F2937"/>
+          <w:sz w:val="15"/>
+          <w:szCs w:val="15"/>
+        </w:rPr>
+        <w:t xml:space="preserve">        {</w:t>
+      </w:r>
+    </w:p>
+    <w:p>
+      <w:pPr>
+        <w:shd w:fill="F4F6FA" w:color="auto" w:val="clear"/>
+        <w:bidi w:val="false"/>
+        <w:spacing w:after="0" w:line="230"/>
+        <w:jc w:val="left"/>
+      </w:pPr>
+      <w:r>
+        <w:rPr>
+          <w:rFonts w:ascii="Consolas" w:cs="Consolas" w:eastAsia="Consolas" w:hAnsi="Consolas"/>
+          <w:color w:val="1F2937"/>
+          <w:sz w:val="15"/>
+          <w:szCs w:val="15"/>
+        </w:rPr>
+        <w:t xml:space="preserve">          "id": "panel_4",</w:t>
+      </w:r>
+    </w:p>
+    <w:p>
+      <w:pPr>
+        <w:shd w:fill="F4F6FA" w:color="auto" w:val="clear"/>
+        <w:bidi w:val="false"/>
+        <w:spacing w:after="0" w:line="230"/>
+        <w:jc w:val="left"/>
+      </w:pPr>
+      <w:r>
+        <w:rPr>
+          <w:rFonts w:ascii="Consolas" w:cs="Consolas" w:eastAsia="Consolas" w:hAnsi="Consolas"/>
+          <w:color w:val="1F2937"/>
+          <w:sz w:val="15"/>
+          <w:szCs w:val="15"/>
+        </w:rPr>
+        <w:t xml:space="preserve">          "role": "service: business financing (back cover when folded)",</w:t>
+      </w:r>
+    </w:p>
+    <w:p>
+      <w:pPr>
+        <w:shd w:fill="F4F6FA" w:color="auto" w:val="clear"/>
+        <w:bidi w:val="false"/>
+        <w:spacing w:after="0" w:line="230"/>
+        <w:jc w:val="left"/>
+      </w:pPr>
+      <w:r>
+        <w:rPr>
+          <w:rFonts w:ascii="Consolas" w:cs="Consolas" w:eastAsia="Consolas" w:hAnsi="Consolas"/>
+          <w:color w:val="1F2937"/>
+          <w:sz w:val="15"/>
+          <w:szCs w:val="15"/>
+        </w:rPr>
+        <w:t xml:space="preserve">          "audience": "self-employed, companies, BNI members",</w:t>
+      </w:r>
+    </w:p>
+    <w:p>
+      <w:pPr>
+        <w:shd w:fill="F4F6FA" w:color="auto" w:val="clear"/>
+        <w:bidi w:val="false"/>
+        <w:spacing w:after="0" w:line="230"/>
+        <w:jc w:val="left"/>
+      </w:pPr>
+      <w:r>
+        <w:rPr>
+          <w:rFonts w:ascii="Consolas" w:cs="Consolas" w:eastAsia="Consolas" w:hAnsi="Consolas"/>
+          <w:color w:val="1F2937"/>
+          <w:sz w:val="15"/>
+          <w:szCs w:val="15"/>
+        </w:rPr>
+        <w:t xml:space="preserve">          "background": "dark_gradient",</w:t>
+      </w:r>
+    </w:p>
+    <w:p>
+      <w:pPr>
+        <w:shd w:fill="F4F6FA" w:color="auto" w:val="clear"/>
+        <w:bidi w:val="false"/>
+        <w:spacing w:after="0" w:line="230"/>
+        <w:jc w:val="left"/>
+      </w:pPr>
+      <w:r>
+        <w:rPr>
+          <w:rFonts w:ascii="Consolas" w:cs="Consolas" w:eastAsia="Consolas" w:hAnsi="Consolas"/>
+          <w:color w:val="1F2937"/>
+          <w:sz w:val="15"/>
+          <w:szCs w:val="15"/>
+        </w:rPr>
+        <w:t xml:space="preserve">          "text": [</w:t>
+      </w:r>
+    </w:p>
+    <w:p>
+      <w:pPr>
+        <w:shd w:fill="F4F6FA" w:color="auto" w:val="clear"/>
+        <w:bidi w:val="false"/>
+        <w:spacing w:after="0" w:line="230"/>
+        <w:jc w:val="left"/>
+      </w:pPr>
+      <w:r>
+        <w:rPr>
+          <w:rFonts w:ascii="Consolas" w:cs="Consolas" w:eastAsia="Consolas" w:hAnsi="Consolas"/>
+          <w:color w:val="1F2937"/>
+          <w:sz w:val="15"/>
+          <w:szCs w:val="15"/>
+        </w:rPr>
+        <w:t xml:space="preserve">            {</w:t>
+      </w:r>
+    </w:p>
+    <w:p>
+      <w:pPr>
+        <w:shd w:fill="F4F6FA" w:color="auto" w:val="clear"/>
+        <w:bidi w:val="false"/>
+        <w:spacing w:after="0" w:line="230"/>
+        <w:jc w:val="left"/>
+      </w:pPr>
+      <w:r>
+        <w:rPr>
+          <w:rFonts w:ascii="Consolas" w:cs="Consolas" w:eastAsia="Consolas" w:hAnsi="Consolas"/>
+          <w:color w:val="1F2937"/>
+          <w:sz w:val="15"/>
+          <w:szCs w:val="15"/>
+        </w:rPr>
+        <w:t xml:space="preserve">              "role": "headline",</w:t>
+      </w:r>
+    </w:p>
+    <w:p>
+      <w:pPr>
+        <w:shd w:fill="F4F6FA" w:color="auto" w:val="clear"/>
+        <w:bidi w:val="false"/>
+        <w:spacing w:after="0" w:line="230"/>
+        <w:jc w:val="left"/>
+      </w:pPr>
+      <w:r>
+        <w:rPr>
+          <w:rFonts w:ascii="Consolas" w:cs="Consolas" w:eastAsia="Consolas" w:hAnsi="Consolas"/>
+          <w:color w:val="1F2937"/>
+          <w:sz w:val="15"/>
+          <w:szCs w:val="15"/>
+        </w:rPr>
+        <w:t xml:space="preserve">              "lines": 1,</w:t>
+      </w:r>
+    </w:p>
+    <w:p>
+      <w:pPr>
+        <w:shd w:fill="F4F6FA" w:color="auto" w:val="clear"/>
+        <w:bidi w:val="false"/>
+        <w:spacing w:after="0" w:line="230"/>
+        <w:jc w:val="left"/>
+      </w:pPr>
+      <w:r>
+        <w:rPr>
+          <w:rFonts w:ascii="Consolas" w:cs="Consolas" w:eastAsia="Consolas" w:hAnsi="Consolas"/>
+          <w:color w:val="1F2937"/>
+          <w:sz w:val="15"/>
+          <w:szCs w:val="15"/>
+        </w:rPr>
+        <w:t xml:space="preserve">              "size_pt": 24,</w:t>
+      </w:r>
+    </w:p>
+    <w:p>
+      <w:pPr>
+        <w:shd w:fill="F4F6FA" w:color="auto" w:val="clear"/>
+        <w:bidi w:val="false"/>
+        <w:spacing w:after="0" w:line="230"/>
+        <w:jc w:val="left"/>
+      </w:pPr>
+      <w:r>
+        <w:rPr>
+          <w:rFonts w:ascii="Consolas" w:cs="Consolas" w:eastAsia="Consolas" w:hAnsi="Consolas"/>
+          <w:color w:val="1F2937"/>
+          <w:sz w:val="15"/>
+          <w:szCs w:val="15"/>
+        </w:rPr>
+        <w:t xml:space="preserve">              "weight": "black",</w:t>
+      </w:r>
+    </w:p>
+    <w:p>
+      <w:pPr>
+        <w:shd w:fill="F4F6FA" w:color="auto" w:val="clear"/>
+        <w:bidi w:val="false"/>
+        <w:spacing w:after="0" w:line="230"/>
+        <w:jc w:val="left"/>
+      </w:pPr>
+      <w:r>
+        <w:rPr>
+          <w:rFonts w:ascii="Consolas" w:cs="Consolas" w:eastAsia="Consolas" w:hAnsi="Consolas"/>
+          <w:color w:val="1F2937"/>
+          <w:sz w:val="15"/>
+          <w:szCs w:val="15"/>
+        </w:rPr>
+        <w:t xml:space="preserve">              "color": "#FFFFFF",</w:t>
+      </w:r>
+    </w:p>
+    <w:p>
+      <w:pPr>
+        <w:shd w:fill="F4F6FA" w:color="auto" w:val="clear"/>
+        <w:bidi w:val="false"/>
+        <w:spacing w:after="0" w:line="230"/>
+        <w:jc w:val="left"/>
+      </w:pPr>
+      <w:r>
+        <w:rPr>
+          <w:rFonts w:ascii="Consolas" w:cs="Consolas" w:eastAsia="Consolas" w:hAnsi="Consolas"/>
+          <w:color w:val="1F2937"/>
+          <w:sz w:val="15"/>
+          <w:szCs w:val="15"/>
+        </w:rPr>
+        <w:t xml:space="preserve">              "highlight": {</w:t>
+      </w:r>
+    </w:p>
+    <w:p>
+      <w:pPr>
+        <w:shd w:fill="F4F6FA" w:color="auto" w:val="clear"/>
+        <w:bidi w:val="false"/>
+        <w:spacing w:after="0" w:line="230"/>
+        <w:jc w:val="left"/>
+      </w:pPr>
+      <w:r>
+        <w:rPr>
+          <w:rFonts w:ascii="Consolas" w:cs="Consolas" w:eastAsia="Consolas" w:hAnsi="Consolas"/>
+          <w:color w:val="1F2937"/>
+          <w:sz w:val="15"/>
+          <w:szCs w:val="15"/>
+        </w:rPr>
+        <w:t xml:space="preserve">                "word": "התזרים לא",</w:t>
+      </w:r>
+    </w:p>
+    <w:p>
+      <w:pPr>
+        <w:shd w:fill="F4F6FA" w:color="auto" w:val="clear"/>
+        <w:bidi w:val="false"/>
+        <w:spacing w:after="0" w:line="230"/>
+        <w:jc w:val="left"/>
+      </w:pPr>
+      <w:r>
+        <w:rPr>
+          <w:rFonts w:ascii="Consolas" w:cs="Consolas" w:eastAsia="Consolas" w:hAnsi="Consolas"/>
+          <w:color w:val="1F2937"/>
+          <w:sz w:val="15"/>
+          <w:szCs w:val="15"/>
+        </w:rPr>
+        <w:t xml:space="preserve">                "color": "#1EC8C8"</w:t>
+      </w:r>
+    </w:p>
+    <w:p>
+      <w:pPr>
+        <w:shd w:fill="F4F6FA" w:color="auto" w:val="clear"/>
+        <w:bidi w:val="false"/>
+        <w:spacing w:after="0" w:line="230"/>
+        <w:jc w:val="left"/>
+      </w:pPr>
+      <w:r>
+        <w:rPr>
+          <w:rFonts w:ascii="Consolas" w:cs="Consolas" w:eastAsia="Consolas" w:hAnsi="Consolas"/>
+          <w:color w:val="1F2937"/>
+          <w:sz w:val="15"/>
+          <w:szCs w:val="15"/>
+        </w:rPr>
+        <w:t xml:space="preserve">              },</w:t>
+      </w:r>
+    </w:p>
+    <w:p>
+      <w:pPr>
+        <w:shd w:fill="F4F6FA" w:color="auto" w:val="clear"/>
+        <w:bidi w:val="false"/>
+        <w:spacing w:after="0" w:line="230"/>
+        <w:jc w:val="left"/>
+      </w:pPr>
+      <w:r>
+        <w:rPr>
+          <w:rFonts w:ascii="Consolas" w:cs="Consolas" w:eastAsia="Consolas" w:hAnsi="Consolas"/>
+          <w:color w:val="1F2937"/>
+          <w:sz w:val="15"/>
+          <w:szCs w:val="15"/>
+        </w:rPr>
+        <w:t xml:space="preserve">              "value": "העסק מוכן לצמוח. התזרים לא."</w:t>
+      </w:r>
+    </w:p>
+    <w:p>
+      <w:pPr>
+        <w:shd w:fill="F4F6FA" w:color="auto" w:val="clear"/>
+        <w:bidi w:val="false"/>
+        <w:spacing w:after="0" w:line="230"/>
+        <w:jc w:val="left"/>
+      </w:pPr>
+      <w:r>
+        <w:rPr>
+          <w:rFonts w:ascii="Consolas" w:cs="Consolas" w:eastAsia="Consolas" w:hAnsi="Consolas"/>
+          <w:color w:val="1F2937"/>
+          <w:sz w:val="15"/>
+          <w:szCs w:val="15"/>
+        </w:rPr>
+        <w:t xml:space="preserve">            },</w:t>
+      </w:r>
+    </w:p>
+    <w:p>
+      <w:pPr>
+        <w:shd w:fill="F4F6FA" w:color="auto" w:val="clear"/>
+        <w:bidi w:val="false"/>
+        <w:spacing w:after="0" w:line="230"/>
+        <w:jc w:val="left"/>
+      </w:pPr>
+      <w:r>
+        <w:rPr>
+          <w:rFonts w:ascii="Consolas" w:cs="Consolas" w:eastAsia="Consolas" w:hAnsi="Consolas"/>
+          <w:color w:val="1F2937"/>
+          <w:sz w:val="15"/>
+          <w:szCs w:val="15"/>
+        </w:rPr>
+        <w:t xml:space="preserve">            {</w:t>
+      </w:r>
+    </w:p>
+    <w:p>
+      <w:pPr>
+        <w:shd w:fill="F4F6FA" w:color="auto" w:val="clear"/>
+        <w:bidi w:val="false"/>
+        <w:spacing w:after="0" w:line="230"/>
+        <w:jc w:val="left"/>
+      </w:pPr>
+      <w:r>
+        <w:rPr>
+          <w:rFonts w:ascii="Consolas" w:cs="Consolas" w:eastAsia="Consolas" w:hAnsi="Consolas"/>
+          <w:color w:val="1F2937"/>
+          <w:sz w:val="15"/>
+          <w:szCs w:val="15"/>
+        </w:rPr>
+        <w:t xml:space="preserve">              "role": "value",</w:t>
+      </w:r>
+    </w:p>
+    <w:p>
+      <w:pPr>
+        <w:shd w:fill="F4F6FA" w:color="auto" w:val="clear"/>
+        <w:bidi w:val="false"/>
+        <w:spacing w:after="0" w:line="230"/>
+        <w:jc w:val="left"/>
+      </w:pPr>
+      <w:r>
+        <w:rPr>
+          <w:rFonts w:ascii="Consolas" w:cs="Consolas" w:eastAsia="Consolas" w:hAnsi="Consolas"/>
+          <w:color w:val="1F2937"/>
+          <w:sz w:val="15"/>
+          <w:szCs w:val="15"/>
+        </w:rPr>
+        <w:t xml:space="preserve">              "lines": 2,</w:t>
+      </w:r>
+    </w:p>
+    <w:p>
+      <w:pPr>
+        <w:shd w:fill="F4F6FA" w:color="auto" w:val="clear"/>
+        <w:bidi w:val="false"/>
+        <w:spacing w:after="0" w:line="230"/>
+        <w:jc w:val="left"/>
+      </w:pPr>
+      <w:r>
+        <w:rPr>
+          <w:rFonts w:ascii="Consolas" w:cs="Consolas" w:eastAsia="Consolas" w:hAnsi="Consolas"/>
+          <w:color w:val="1F2937"/>
+          <w:sz w:val="15"/>
+          <w:szCs w:val="15"/>
+        </w:rPr>
+        <w:t xml:space="preserve">              "size_pt": 11,</w:t>
+      </w:r>
+    </w:p>
+    <w:p>
+      <w:pPr>
+        <w:shd w:fill="F4F6FA" w:color="auto" w:val="clear"/>
+        <w:bidi w:val="false"/>
+        <w:spacing w:after="0" w:line="230"/>
+        <w:jc w:val="left"/>
+      </w:pPr>
+      <w:r>
+        <w:rPr>
+          <w:rFonts w:ascii="Consolas" w:cs="Consolas" w:eastAsia="Consolas" w:hAnsi="Consolas"/>
+          <w:color w:val="1F2937"/>
+          <w:sz w:val="15"/>
+          <w:szCs w:val="15"/>
+        </w:rPr>
+        <w:t xml:space="preserve">              "value": "מימון נכון משרת את תוכנית הצמיחה, ולא חונק את התזרים."</w:t>
+      </w:r>
+    </w:p>
+    <w:p>
+      <w:pPr>
+        <w:shd w:fill="F4F6FA" w:color="auto" w:val="clear"/>
+        <w:bidi w:val="false"/>
+        <w:spacing w:after="0" w:line="230"/>
+        <w:jc w:val="left"/>
+      </w:pPr>
+      <w:r>
+        <w:rPr>
+          <w:rFonts w:ascii="Consolas" w:cs="Consolas" w:eastAsia="Consolas" w:hAnsi="Consolas"/>
+          <w:color w:val="1F2937"/>
+          <w:sz w:val="15"/>
+          <w:szCs w:val="15"/>
+        </w:rPr>
+        <w:t xml:space="preserve">            },</w:t>
+      </w:r>
+    </w:p>
+    <w:p>
+      <w:pPr>
+        <w:shd w:fill="F4F6FA" w:color="auto" w:val="clear"/>
+        <w:bidi w:val="false"/>
+        <w:spacing w:after="0" w:line="230"/>
+        <w:jc w:val="left"/>
+      </w:pPr>
+      <w:r>
+        <w:rPr>
+          <w:rFonts w:ascii="Consolas" w:cs="Consolas" w:eastAsia="Consolas" w:hAnsi="Consolas"/>
+          <w:color w:val="1F2937"/>
+          <w:sz w:val="15"/>
+          <w:szCs w:val="15"/>
+        </w:rPr>
+        <w:t xml:space="preserve">            {</w:t>
+      </w:r>
+    </w:p>
+    <w:p>
+      <w:pPr>
+        <w:shd w:fill="F4F6FA" w:color="auto" w:val="clear"/>
+        <w:bidi w:val="false"/>
+        <w:spacing w:after="0" w:line="230"/>
+        <w:jc w:val="left"/>
+      </w:pPr>
+      <w:r>
+        <w:rPr>
+          <w:rFonts w:ascii="Consolas" w:cs="Consolas" w:eastAsia="Consolas" w:hAnsi="Consolas"/>
+          <w:color w:val="1F2937"/>
+          <w:sz w:val="15"/>
+          <w:szCs w:val="15"/>
+        </w:rPr>
         <w:t xml:space="preserve">              "role": "icon_row",</w:t>
       </w:r>
     </w:p>
@@ -19891,23 +20717,6 @@
           <w:sz w:val="15"/>
           <w:szCs w:val="15"/>
         </w:rPr>
-        <w:t xml:space="preserve">              "optional": true,</w:t>
-      </w:r>
-    </w:p>
-    <w:p>
-      <w:pPr>
-        <w:shd w:fill="F4F6FA" w:color="auto" w:val="clear"/>
-        <w:bidi w:val="false"/>
-        <w:spacing w:after="0" w:line="230"/>
-        <w:jc w:val="left"/>
-      </w:pPr>
-      <w:r>
-        <w:rPr>
-          <w:rFonts w:ascii="Consolas" w:cs="Consolas" w:eastAsia="Consolas" w:hAnsi="Consolas"/>
-          <w:color w:val="1F2937"/>
-          <w:sz w:val="15"/>
-          <w:szCs w:val="15"/>
-        </w:rPr>
         <w:t xml:space="preserve">              "size_pt": 9.5,</w:t>
       </w:r>
     </w:p>
@@ -19942,41 +20751,41 @@
           <w:sz w:val="15"/>
           <w:szCs w:val="15"/>
         </w:rPr>
-        <w:t xml:space="preserve">                "בדיקת כדאיות",</w:t>
-      </w:r>
-    </w:p>
-    <w:p>
-      <w:pPr>
-        <w:shd w:fill="F4F6FA" w:color="auto" w:val="clear"/>
-        <w:bidi w:val="false"/>
-        <w:spacing w:after="0" w:line="230"/>
-        <w:jc w:val="left"/>
-      </w:pPr>
-      <w:r>
-        <w:rPr>
-          <w:rFonts w:ascii="Consolas" w:cs="Consolas" w:eastAsia="Consolas" w:hAnsi="Consolas"/>
-          <w:color w:val="1F2937"/>
-          <w:sz w:val="15"/>
-          <w:szCs w:val="15"/>
-        </w:rPr>
-        <w:t xml:space="preserve">                "הון עצמי מנכס קיים",</w:t>
-      </w:r>
-    </w:p>
-    <w:p>
-      <w:pPr>
-        <w:shd w:fill="F4F6FA" w:color="auto" w:val="clear"/>
-        <w:bidi w:val="false"/>
-        <w:spacing w:after="0" w:line="230"/>
-        <w:jc w:val="left"/>
-      </w:pPr>
-      <w:r>
-        <w:rPr>
-          <w:rFonts w:ascii="Consolas" w:cs="Consolas" w:eastAsia="Consolas" w:hAnsi="Consolas"/>
-          <w:color w:val="1F2937"/>
-          <w:sz w:val="15"/>
-          <w:szCs w:val="15"/>
-        </w:rPr>
-        <w:t xml:space="preserve">                "תכנון המימון"</w:t>
+        <w:t xml:space="preserve">                "בחינת חלופות מימון",</w:t>
+      </w:r>
+    </w:p>
+    <w:p>
+      <w:pPr>
+        <w:shd w:fill="F4F6FA" w:color="auto" w:val="clear"/>
+        <w:bidi w:val="false"/>
+        <w:spacing w:after="0" w:line="230"/>
+        <w:jc w:val="left"/>
+      </w:pPr>
+      <w:r>
+        <w:rPr>
+          <w:rFonts w:ascii="Consolas" w:cs="Consolas" w:eastAsia="Consolas" w:hAnsi="Consolas"/>
+          <w:color w:val="1F2937"/>
+          <w:sz w:val="15"/>
+          <w:szCs w:val="15"/>
+        </w:rPr>
+        <w:t xml:space="preserve">                "החזר לפי התזרים",</w:t>
+      </w:r>
+    </w:p>
+    <w:p>
+      <w:pPr>
+        <w:shd w:fill="F4F6FA" w:color="auto" w:val="clear"/>
+        <w:bidi w:val="false"/>
+        <w:spacing w:after="0" w:line="230"/>
+        <w:jc w:val="left"/>
+      </w:pPr>
+      <w:r>
+        <w:rPr>
+          <w:rFonts w:ascii="Consolas" w:cs="Consolas" w:eastAsia="Consolas" w:hAnsi="Consolas"/>
+          <w:color w:val="1F2937"/>
+          <w:sz w:val="15"/>
+          <w:szCs w:val="15"/>
+        </w:rPr>
+        <w:t xml:space="preserve">                "העלות הכוללת, לא רק הריבית"</w:t>
       </w:r>
     </w:p>
     <w:p>
@@ -20078,7 +20887,7 @@
           <w:sz w:val="15"/>
           <w:szCs w:val="15"/>
         </w:rPr>
-        <w:t xml:space="preserve">              "value": "הנכס הבא, במרחק שיחה · 052-441-5395"</w:t>
+        <w:t xml:space="preserve">              "value": "הצמיחה הבאה, במרחק שיחה · 052-441-5395"</w:t>
       </w:r>
     </w:p>
     <w:p>
@@ -20146,7 +20955,976 @@
           <w:sz w:val="15"/>
           <w:szCs w:val="15"/>
         </w:rPr>
-        <w:t xml:space="preserve">            "one large thin-line icon: calculator + house, left side"</w:t>
+        <w:t xml:space="preserve">            "single thin turquoise rising line across panel",</w:t>
+      </w:r>
+    </w:p>
+    <w:p>
+      <w:pPr>
+        <w:shd w:fill="F4F6FA" w:color="auto" w:val="clear"/>
+        <w:bidi w:val="false"/>
+        <w:spacing w:after="0" w:line="230"/>
+        <w:jc w:val="left"/>
+      </w:pPr>
+      <w:r>
+        <w:rPr>
+          <w:rFonts w:ascii="Consolas" w:cs="Consolas" w:eastAsia="Consolas" w:hAnsi="Consolas"/>
+          <w:color w:val="1F2937"/>
+          <w:sz w:val="15"/>
+          <w:szCs w:val="15"/>
+        </w:rPr>
+        <w:t xml:space="preserve">            "white logo in corner"</w:t>
+      </w:r>
+    </w:p>
+    <w:p>
+      <w:pPr>
+        <w:shd w:fill="F4F6FA" w:color="auto" w:val="clear"/>
+        <w:bidi w:val="false"/>
+        <w:spacing w:after="0" w:line="230"/>
+        <w:jc w:val="left"/>
+      </w:pPr>
+      <w:r>
+        <w:rPr>
+          <w:rFonts w:ascii="Consolas" w:cs="Consolas" w:eastAsia="Consolas" w:hAnsi="Consolas"/>
+          <w:color w:val="1F2937"/>
+          <w:sz w:val="15"/>
+          <w:szCs w:val="15"/>
+        </w:rPr>
+        <w:t xml:space="preserve">          ],</w:t>
+      </w:r>
+    </w:p>
+    <w:p>
+      <w:pPr>
+        <w:shd w:fill="F4F6FA" w:color="auto" w:val="clear"/>
+        <w:bidi w:val="false"/>
+        <w:spacing w:after="0" w:line="230"/>
+        <w:jc w:val="left"/>
+      </w:pPr>
+      <w:r>
+        <w:rPr>
+          <w:rFonts w:ascii="Consolas" w:cs="Consolas" w:eastAsia="Consolas" w:hAnsi="Consolas"/>
+          <w:color w:val="1F2937"/>
+          <w:sz w:val="15"/>
+          <w:szCs w:val="15"/>
+        </w:rPr>
+        <w:t xml:space="preserve">          "fine_print": "כל מקרה נבחן לגופו ובכפוף לאישור הגוף המממן."</w:t>
+      </w:r>
+    </w:p>
+    <w:p>
+      <w:pPr>
+        <w:shd w:fill="F4F6FA" w:color="auto" w:val="clear"/>
+        <w:bidi w:val="false"/>
+        <w:spacing w:after="0" w:line="230"/>
+        <w:jc w:val="left"/>
+      </w:pPr>
+      <w:r>
+        <w:rPr>
+          <w:rFonts w:ascii="Consolas" w:cs="Consolas" w:eastAsia="Consolas" w:hAnsi="Consolas"/>
+          <w:color w:val="1F2937"/>
+          <w:sz w:val="15"/>
+          <w:szCs w:val="15"/>
+        </w:rPr>
+        <w:t xml:space="preserve">        }</w:t>
+      </w:r>
+    </w:p>
+    <w:p>
+      <w:pPr>
+        <w:shd w:fill="F4F6FA" w:color="auto" w:val="clear"/>
+        <w:bidi w:val="false"/>
+        <w:spacing w:after="0" w:line="230"/>
+        <w:jc w:val="left"/>
+      </w:pPr>
+      <w:r>
+        <w:rPr>
+          <w:rFonts w:ascii="Consolas" w:cs="Consolas" w:eastAsia="Consolas" w:hAnsi="Consolas"/>
+          <w:color w:val="1F2937"/>
+          <w:sz w:val="15"/>
+          <w:szCs w:val="15"/>
+        </w:rPr>
+        <w:t xml:space="preserve">      ]</w:t>
+      </w:r>
+    </w:p>
+    <w:p>
+      <w:pPr>
+        <w:shd w:fill="F4F6FA" w:color="auto" w:val="clear"/>
+        <w:bidi w:val="false"/>
+        <w:spacing w:after="0" w:line="230"/>
+        <w:jc w:val="left"/>
+      </w:pPr>
+      <w:r>
+        <w:rPr>
+          <w:rFonts w:ascii="Consolas" w:cs="Consolas" w:eastAsia="Consolas" w:hAnsi="Consolas"/>
+          <w:color w:val="1F2937"/>
+          <w:sz w:val="15"/>
+          <w:szCs w:val="15"/>
+        </w:rPr>
+        <w:t xml:space="preserve">    },</w:t>
+      </w:r>
+    </w:p>
+    <w:p>
+      <w:pPr>
+        <w:shd w:fill="F4F6FA" w:color="auto" w:val="clear"/>
+        <w:bidi w:val="false"/>
+        <w:spacing w:after="0" w:line="230"/>
+        <w:jc w:val="left"/>
+      </w:pPr>
+      <w:r>
+        <w:rPr>
+          <w:rFonts w:ascii="Consolas" w:cs="Consolas" w:eastAsia="Consolas" w:hAnsi="Consolas"/>
+          <w:color w:val="1F2937"/>
+          <w:sz w:val="15"/>
+          <w:szCs w:val="15"/>
+        </w:rPr>
+        <w:t xml:space="preserve">    {</w:t>
+      </w:r>
+    </w:p>
+    <w:p>
+      <w:pPr>
+        <w:shd w:fill="F4F6FA" w:color="auto" w:val="clear"/>
+        <w:bidi w:val="false"/>
+        <w:spacing w:after="0" w:line="230"/>
+        <w:jc w:val="left"/>
+      </w:pPr>
+      <w:r>
+        <w:rPr>
+          <w:rFonts w:ascii="Consolas" w:cs="Consolas" w:eastAsia="Consolas" w:hAnsi="Consolas"/>
+          <w:color w:val="1F2937"/>
+          <w:sz w:val="15"/>
+          <w:szCs w:val="15"/>
+        </w:rPr>
+        <w:t xml:space="preserve">      "side": "inside",</w:t>
+      </w:r>
+    </w:p>
+    <w:p>
+      <w:pPr>
+        <w:shd w:fill="F4F6FA" w:color="auto" w:val="clear"/>
+        <w:bidi w:val="false"/>
+        <w:spacing w:after="0" w:line="230"/>
+        <w:jc w:val="left"/>
+      </w:pPr>
+      <w:r>
+        <w:rPr>
+          <w:rFonts w:ascii="Consolas" w:cs="Consolas" w:eastAsia="Consolas" w:hAnsi="Consolas"/>
+          <w:color w:val="1F2937"/>
+          <w:sz w:val="15"/>
+          <w:szCs w:val="15"/>
+        </w:rPr>
+        <w:t xml:space="preserve">      "character": "story, emotional, personal",</w:t>
+      </w:r>
+    </w:p>
+    <w:p>
+      <w:pPr>
+        <w:shd w:fill="F4F6FA" w:color="auto" w:val="clear"/>
+        <w:bidi w:val="false"/>
+        <w:spacing w:after="0" w:line="230"/>
+        <w:jc w:val="left"/>
+      </w:pPr>
+      <w:r>
+        <w:rPr>
+          <w:rFonts w:ascii="Consolas" w:cs="Consolas" w:eastAsia="Consolas" w:hAnsi="Consolas"/>
+          <w:color w:val="1F2937"/>
+          <w:sz w:val="15"/>
+          <w:szCs w:val="15"/>
+        </w:rPr>
+        <w:t xml:space="preserve">      "order": "top_to_bottom",</w:t>
+      </w:r>
+    </w:p>
+    <w:p>
+      <w:pPr>
+        <w:shd w:fill="F4F6FA" w:color="auto" w:val="clear"/>
+        <w:bidi w:val="false"/>
+        <w:spacing w:after="0" w:line="230"/>
+        <w:jc w:val="left"/>
+      </w:pPr>
+      <w:r>
+        <w:rPr>
+          <w:rFonts w:ascii="Consolas" w:cs="Consolas" w:eastAsia="Consolas" w:hAnsi="Consolas"/>
+          <w:color w:val="1F2937"/>
+          <w:sz w:val="15"/>
+          <w:szCs w:val="15"/>
+        </w:rPr>
+        <w:t xml:space="preserve">      "panels": [</w:t>
+      </w:r>
+    </w:p>
+    <w:p>
+      <w:pPr>
+        <w:shd w:fill="F4F6FA" w:color="auto" w:val="clear"/>
+        <w:bidi w:val="false"/>
+        <w:spacing w:after="0" w:line="230"/>
+        <w:jc w:val="left"/>
+      </w:pPr>
+      <w:r>
+        <w:rPr>
+          <w:rFonts w:ascii="Consolas" w:cs="Consolas" w:eastAsia="Consolas" w:hAnsi="Consolas"/>
+          <w:color w:val="1F2937"/>
+          <w:sz w:val="15"/>
+          <w:szCs w:val="15"/>
+        </w:rPr>
+        <w:t xml:space="preserve">        {</w:t>
+      </w:r>
+    </w:p>
+    <w:p>
+      <w:pPr>
+        <w:shd w:fill="F4F6FA" w:color="auto" w:val="clear"/>
+        <w:bidi w:val="false"/>
+        <w:spacing w:after="0" w:line="230"/>
+        <w:jc w:val="left"/>
+      </w:pPr>
+      <w:r>
+        <w:rPr>
+          <w:rFonts w:ascii="Consolas" w:cs="Consolas" w:eastAsia="Consolas" w:hAnsi="Consolas"/>
+          <w:color w:val="1F2937"/>
+          <w:sz w:val="15"/>
+          <w:szCs w:val="15"/>
+        </w:rPr>
+        <w:t xml:space="preserve">          "id": "panel_5",</w:t>
+      </w:r>
+    </w:p>
+    <w:p>
+      <w:pPr>
+        <w:shd w:fill="F4F6FA" w:color="auto" w:val="clear"/>
+        <w:bidi w:val="false"/>
+        <w:spacing w:after="0" w:line="230"/>
+        <w:jc w:val="left"/>
+      </w:pPr>
+      <w:r>
+        <w:rPr>
+          <w:rFonts w:ascii="Consolas" w:cs="Consolas" w:eastAsia="Consolas" w:hAnsi="Consolas"/>
+          <w:color w:val="1F2937"/>
+          <w:sz w:val="15"/>
+          <w:szCs w:val="15"/>
+        </w:rPr>
+        <w:t xml:space="preserve">          "role": "pain &amp; identification",</w:t>
+      </w:r>
+    </w:p>
+    <w:p>
+      <w:pPr>
+        <w:shd w:fill="F4F6FA" w:color="auto" w:val="clear"/>
+        <w:bidi w:val="false"/>
+        <w:spacing w:after="0" w:line="230"/>
+        <w:jc w:val="left"/>
+      </w:pPr>
+      <w:r>
+        <w:rPr>
+          <w:rFonts w:ascii="Consolas" w:cs="Consolas" w:eastAsia="Consolas" w:hAnsi="Consolas"/>
+          <w:color w:val="1F2937"/>
+          <w:sz w:val="15"/>
+          <w:szCs w:val="15"/>
+        </w:rPr>
+        <w:t xml:space="preserve">          "background": "#FFFFFF",</w:t>
+      </w:r>
+    </w:p>
+    <w:p>
+      <w:pPr>
+        <w:shd w:fill="F4F6FA" w:color="auto" w:val="clear"/>
+        <w:bidi w:val="false"/>
+        <w:spacing w:after="0" w:line="230"/>
+        <w:jc w:val="left"/>
+      </w:pPr>
+      <w:r>
+        <w:rPr>
+          <w:rFonts w:ascii="Consolas" w:cs="Consolas" w:eastAsia="Consolas" w:hAnsi="Consolas"/>
+          <w:color w:val="1F2937"/>
+          <w:sz w:val="15"/>
+          <w:szCs w:val="15"/>
+        </w:rPr>
+        <w:t xml:space="preserve">          "priority": "most important panel",</w:t>
+      </w:r>
+    </w:p>
+    <w:p>
+      <w:pPr>
+        <w:shd w:fill="F4F6FA" w:color="auto" w:val="clear"/>
+        <w:bidi w:val="false"/>
+        <w:spacing w:after="0" w:line="230"/>
+        <w:jc w:val="left"/>
+      </w:pPr>
+      <w:r>
+        <w:rPr>
+          <w:rFonts w:ascii="Consolas" w:cs="Consolas" w:eastAsia="Consolas" w:hAnsi="Consolas"/>
+          <w:color w:val="1F2937"/>
+          <w:sz w:val="15"/>
+          <w:szCs w:val="15"/>
+        </w:rPr>
+        <w:t xml:space="preserve">          "text": [</w:t>
+      </w:r>
+    </w:p>
+    <w:p>
+      <w:pPr>
+        <w:shd w:fill="F4F6FA" w:color="auto" w:val="clear"/>
+        <w:bidi w:val="false"/>
+        <w:spacing w:after="0" w:line="230"/>
+        <w:jc w:val="left"/>
+      </w:pPr>
+      <w:r>
+        <w:rPr>
+          <w:rFonts w:ascii="Consolas" w:cs="Consolas" w:eastAsia="Consolas" w:hAnsi="Consolas"/>
+          <w:color w:val="1F2937"/>
+          <w:sz w:val="15"/>
+          <w:szCs w:val="15"/>
+        </w:rPr>
+        <w:t xml:space="preserve">            {</w:t>
+      </w:r>
+    </w:p>
+    <w:p>
+      <w:pPr>
+        <w:shd w:fill="F4F6FA" w:color="auto" w:val="clear"/>
+        <w:bidi w:val="false"/>
+        <w:spacing w:after="0" w:line="230"/>
+        <w:jc w:val="left"/>
+      </w:pPr>
+      <w:r>
+        <w:rPr>
+          <w:rFonts w:ascii="Consolas" w:cs="Consolas" w:eastAsia="Consolas" w:hAnsi="Consolas"/>
+          <w:color w:val="1F2937"/>
+          <w:sz w:val="15"/>
+          <w:szCs w:val="15"/>
+        </w:rPr>
+        <w:t xml:space="preserve">              "role": "opening",</w:t>
+      </w:r>
+    </w:p>
+    <w:p>
+      <w:pPr>
+        <w:shd w:fill="F4F6FA" w:color="auto" w:val="clear"/>
+        <w:bidi w:val="false"/>
+        <w:spacing w:after="0" w:line="230"/>
+        <w:jc w:val="left"/>
+      </w:pPr>
+      <w:r>
+        <w:rPr>
+          <w:rFonts w:ascii="Consolas" w:cs="Consolas" w:eastAsia="Consolas" w:hAnsi="Consolas"/>
+          <w:color w:val="1F2937"/>
+          <w:sz w:val="15"/>
+          <w:szCs w:val="15"/>
+        </w:rPr>
+        <w:t xml:space="preserve">              "size_pt": 12,</w:t>
+      </w:r>
+    </w:p>
+    <w:p>
+      <w:pPr>
+        <w:shd w:fill="F4F6FA" w:color="auto" w:val="clear"/>
+        <w:bidi w:val="false"/>
+        <w:spacing w:after="0" w:line="230"/>
+        <w:jc w:val="left"/>
+      </w:pPr>
+      <w:r>
+        <w:rPr>
+          <w:rFonts w:ascii="Consolas" w:cs="Consolas" w:eastAsia="Consolas" w:hAnsi="Consolas"/>
+          <w:color w:val="1F2937"/>
+          <w:sz w:val="15"/>
+          <w:szCs w:val="15"/>
+        </w:rPr>
+        <w:t xml:space="preserve">              "value": "כשזה מגיע לכסף גדול, קל להרגיש לבד מול המערכת."</w:t>
+      </w:r>
+    </w:p>
+    <w:p>
+      <w:pPr>
+        <w:shd w:fill="F4F6FA" w:color="auto" w:val="clear"/>
+        <w:bidi w:val="false"/>
+        <w:spacing w:after="0" w:line="230"/>
+        <w:jc w:val="left"/>
+      </w:pPr>
+      <w:r>
+        <w:rPr>
+          <w:rFonts w:ascii="Consolas" w:cs="Consolas" w:eastAsia="Consolas" w:hAnsi="Consolas"/>
+          <w:color w:val="1F2937"/>
+          <w:sz w:val="15"/>
+          <w:szCs w:val="15"/>
+        </w:rPr>
+        <w:t xml:space="preserve">            },</w:t>
+      </w:r>
+    </w:p>
+    <w:p>
+      <w:pPr>
+        <w:shd w:fill="F4F6FA" w:color="auto" w:val="clear"/>
+        <w:bidi w:val="false"/>
+        <w:spacing w:after="0" w:line="230"/>
+        <w:jc w:val="left"/>
+      </w:pPr>
+      <w:r>
+        <w:rPr>
+          <w:rFonts w:ascii="Consolas" w:cs="Consolas" w:eastAsia="Consolas" w:hAnsi="Consolas"/>
+          <w:color w:val="1F2937"/>
+          <w:sz w:val="15"/>
+          <w:szCs w:val="15"/>
+        </w:rPr>
+        <w:t xml:space="preserve">            {</w:t>
+      </w:r>
+    </w:p>
+    <w:p>
+      <w:pPr>
+        <w:shd w:fill="F4F6FA" w:color="auto" w:val="clear"/>
+        <w:bidi w:val="false"/>
+        <w:spacing w:after="0" w:line="230"/>
+        <w:jc w:val="left"/>
+      </w:pPr>
+      <w:r>
+        <w:rPr>
+          <w:rFonts w:ascii="Consolas" w:cs="Consolas" w:eastAsia="Consolas" w:hAnsi="Consolas"/>
+          <w:color w:val="1F2937"/>
+          <w:sz w:val="15"/>
+          <w:szCs w:val="15"/>
+        </w:rPr>
+        <w:t xml:space="preserve">              "role": "speech_bubbles",</w:t>
+      </w:r>
+    </w:p>
+    <w:p>
+      <w:pPr>
+        <w:shd w:fill="F4F6FA" w:color="auto" w:val="clear"/>
+        <w:bidi w:val="false"/>
+        <w:spacing w:after="0" w:line="230"/>
+        <w:jc w:val="left"/>
+      </w:pPr>
+      <w:r>
+        <w:rPr>
+          <w:rFonts w:ascii="Consolas" w:cs="Consolas" w:eastAsia="Consolas" w:hAnsi="Consolas"/>
+          <w:color w:val="1F2937"/>
+          <w:sz w:val="15"/>
+          <w:szCs w:val="15"/>
+        </w:rPr>
+        <w:t xml:space="preserve">              "size_pt": 10,</w:t>
+      </w:r>
+    </w:p>
+    <w:p>
+      <w:pPr>
+        <w:shd w:fill="F4F6FA" w:color="auto" w:val="clear"/>
+        <w:bidi w:val="false"/>
+        <w:spacing w:after="0" w:line="230"/>
+        <w:jc w:val="left"/>
+      </w:pPr>
+      <w:r>
+        <w:rPr>
+          <w:rFonts w:ascii="Consolas" w:cs="Consolas" w:eastAsia="Consolas" w:hAnsi="Consolas"/>
+          <w:color w:val="1F2937"/>
+          <w:sz w:val="15"/>
+          <w:szCs w:val="15"/>
+        </w:rPr>
+        <w:t xml:space="preserve">              "items": [</w:t>
+      </w:r>
+    </w:p>
+    <w:p>
+      <w:pPr>
+        <w:shd w:fill="F4F6FA" w:color="auto" w:val="clear"/>
+        <w:bidi w:val="false"/>
+        <w:spacing w:after="0" w:line="230"/>
+        <w:jc w:val="left"/>
+      </w:pPr>
+      <w:r>
+        <w:rPr>
+          <w:rFonts w:ascii="Consolas" w:cs="Consolas" w:eastAsia="Consolas" w:hAnsi="Consolas"/>
+          <w:color w:val="1F2937"/>
+          <w:sz w:val="15"/>
+          <w:szCs w:val="15"/>
+        </w:rPr>
+        <w:t xml:space="preserve">                "הבנק אמר לא.",</w:t>
+      </w:r>
+    </w:p>
+    <w:p>
+      <w:pPr>
+        <w:shd w:fill="F4F6FA" w:color="auto" w:val="clear"/>
+        <w:bidi w:val="false"/>
+        <w:spacing w:after="0" w:line="230"/>
+        <w:jc w:val="left"/>
+      </w:pPr>
+      <w:r>
+        <w:rPr>
+          <w:rFonts w:ascii="Consolas" w:cs="Consolas" w:eastAsia="Consolas" w:hAnsi="Consolas"/>
+          <w:color w:val="1F2937"/>
+          <w:sz w:val="15"/>
+          <w:szCs w:val="15"/>
+        </w:rPr>
+        <w:t xml:space="preserve">                "ההחזר רק עולה.",</w:t>
+      </w:r>
+    </w:p>
+    <w:p>
+      <w:pPr>
+        <w:shd w:fill="F4F6FA" w:color="auto" w:val="clear"/>
+        <w:bidi w:val="false"/>
+        <w:spacing w:after="0" w:line="230"/>
+        <w:jc w:val="left"/>
+      </w:pPr>
+      <w:r>
+        <w:rPr>
+          <w:rFonts w:ascii="Consolas" w:cs="Consolas" w:eastAsia="Consolas" w:hAnsi="Consolas"/>
+          <w:color w:val="1F2937"/>
+          <w:sz w:val="15"/>
+          <w:szCs w:val="15"/>
+        </w:rPr>
+        <w:t xml:space="preserve">                "העסק צריך אוויר."</w:t>
+      </w:r>
+    </w:p>
+    <w:p>
+      <w:pPr>
+        <w:shd w:fill="F4F6FA" w:color="auto" w:val="clear"/>
+        <w:bidi w:val="false"/>
+        <w:spacing w:after="0" w:line="230"/>
+        <w:jc w:val="left"/>
+      </w:pPr>
+      <w:r>
+        <w:rPr>
+          <w:rFonts w:ascii="Consolas" w:cs="Consolas" w:eastAsia="Consolas" w:hAnsi="Consolas"/>
+          <w:color w:val="1F2937"/>
+          <w:sz w:val="15"/>
+          <w:szCs w:val="15"/>
+        </w:rPr>
+        <w:t xml:space="preserve">              ]</w:t>
+      </w:r>
+    </w:p>
+    <w:p>
+      <w:pPr>
+        <w:shd w:fill="F4F6FA" w:color="auto" w:val="clear"/>
+        <w:bidi w:val="false"/>
+        <w:spacing w:after="0" w:line="230"/>
+        <w:jc w:val="left"/>
+      </w:pPr>
+      <w:r>
+        <w:rPr>
+          <w:rFonts w:ascii="Consolas" w:cs="Consolas" w:eastAsia="Consolas" w:hAnsi="Consolas"/>
+          <w:color w:val="1F2937"/>
+          <w:sz w:val="15"/>
+          <w:szCs w:val="15"/>
+        </w:rPr>
+        <w:t xml:space="preserve">            },</w:t>
+      </w:r>
+    </w:p>
+    <w:p>
+      <w:pPr>
+        <w:shd w:fill="F4F6FA" w:color="auto" w:val="clear"/>
+        <w:bidi w:val="false"/>
+        <w:spacing w:after="0" w:line="230"/>
+        <w:jc w:val="left"/>
+      </w:pPr>
+      <w:r>
+        <w:rPr>
+          <w:rFonts w:ascii="Consolas" w:cs="Consolas" w:eastAsia="Consolas" w:hAnsi="Consolas"/>
+          <w:color w:val="1F2937"/>
+          <w:sz w:val="15"/>
+          <w:szCs w:val="15"/>
+        </w:rPr>
+        <w:t xml:space="preserve">            {</w:t>
+      </w:r>
+    </w:p>
+    <w:p>
+      <w:pPr>
+        <w:shd w:fill="F4F6FA" w:color="auto" w:val="clear"/>
+        <w:bidi w:val="false"/>
+        <w:spacing w:after="0" w:line="230"/>
+        <w:jc w:val="left"/>
+      </w:pPr>
+      <w:r>
+        <w:rPr>
+          <w:rFonts w:ascii="Consolas" w:cs="Consolas" w:eastAsia="Consolas" w:hAnsi="Consolas"/>
+          <w:color w:val="1F2937"/>
+          <w:sz w:val="15"/>
+          <w:szCs w:val="15"/>
+        </w:rPr>
+        <w:t xml:space="preserve">              "role": "headline",</w:t>
+      </w:r>
+    </w:p>
+    <w:p>
+      <w:pPr>
+        <w:shd w:fill="F4F6FA" w:color="auto" w:val="clear"/>
+        <w:bidi w:val="false"/>
+        <w:spacing w:after="0" w:line="230"/>
+        <w:jc w:val="left"/>
+      </w:pPr>
+      <w:r>
+        <w:rPr>
+          <w:rFonts w:ascii="Consolas" w:cs="Consolas" w:eastAsia="Consolas" w:hAnsi="Consolas"/>
+          <w:color w:val="1F2937"/>
+          <w:sz w:val="15"/>
+          <w:szCs w:val="15"/>
+        </w:rPr>
+        <w:t xml:space="preserve">              "lines": 2,</w:t>
+      </w:r>
+    </w:p>
+    <w:p>
+      <w:pPr>
+        <w:shd w:fill="F4F6FA" w:color="auto" w:val="clear"/>
+        <w:bidi w:val="false"/>
+        <w:spacing w:after="0" w:line="230"/>
+        <w:jc w:val="left"/>
+      </w:pPr>
+      <w:r>
+        <w:rPr>
+          <w:rFonts w:ascii="Consolas" w:cs="Consolas" w:eastAsia="Consolas" w:hAnsi="Consolas"/>
+          <w:color w:val="1F2937"/>
+          <w:sz w:val="15"/>
+          <w:szCs w:val="15"/>
+        </w:rPr>
+        <w:t xml:space="preserve">              "size_pt": 30,</w:t>
+      </w:r>
+    </w:p>
+    <w:p>
+      <w:pPr>
+        <w:shd w:fill="F4F6FA" w:color="auto" w:val="clear"/>
+        <w:bidi w:val="false"/>
+        <w:spacing w:after="0" w:line="230"/>
+        <w:jc w:val="left"/>
+      </w:pPr>
+      <w:r>
+        <w:rPr>
+          <w:rFonts w:ascii="Consolas" w:cs="Consolas" w:eastAsia="Consolas" w:hAnsi="Consolas"/>
+          <w:color w:val="1F2937"/>
+          <w:sz w:val="15"/>
+          <w:szCs w:val="15"/>
+        </w:rPr>
+        <w:t xml:space="preserve">              "weight": "black",</w:t>
+      </w:r>
+    </w:p>
+    <w:p>
+      <w:pPr>
+        <w:shd w:fill="F4F6FA" w:color="auto" w:val="clear"/>
+        <w:bidi w:val="false"/>
+        <w:spacing w:after="0" w:line="230"/>
+        <w:jc w:val="left"/>
+      </w:pPr>
+      <w:r>
+        <w:rPr>
+          <w:rFonts w:ascii="Consolas" w:cs="Consolas" w:eastAsia="Consolas" w:hAnsi="Consolas"/>
+          <w:color w:val="1F2937"/>
+          <w:sz w:val="15"/>
+          <w:szCs w:val="15"/>
+        </w:rPr>
+        <w:t xml:space="preserve">              "highlight": {</w:t>
+      </w:r>
+    </w:p>
+    <w:p>
+      <w:pPr>
+        <w:shd w:fill="F4F6FA" w:color="auto" w:val="clear"/>
+        <w:bidi w:val="false"/>
+        <w:spacing w:after="0" w:line="230"/>
+        <w:jc w:val="left"/>
+      </w:pPr>
+      <w:r>
+        <w:rPr>
+          <w:rFonts w:ascii="Consolas" w:cs="Consolas" w:eastAsia="Consolas" w:hAnsi="Consolas"/>
+          <w:color w:val="1F2937"/>
+          <w:sz w:val="15"/>
+          <w:szCs w:val="15"/>
+        </w:rPr>
+        <w:t xml:space="preserve">                "phrase": "מי מייצג אתכם?",</w:t>
+      </w:r>
+    </w:p>
+    <w:p>
+      <w:pPr>
+        <w:shd w:fill="F4F6FA" w:color="auto" w:val="clear"/>
+        <w:bidi w:val="false"/>
+        <w:spacing w:after="0" w:line="230"/>
+        <w:jc w:val="left"/>
+      </w:pPr>
+      <w:r>
+        <w:rPr>
+          <w:rFonts w:ascii="Consolas" w:cs="Consolas" w:eastAsia="Consolas" w:hAnsi="Consolas"/>
+          <w:color w:val="1F2937"/>
+          <w:sz w:val="15"/>
+          <w:szCs w:val="15"/>
+        </w:rPr>
+        <w:t xml:space="preserve">                "color": "#004AAD"</w:t>
+      </w:r>
+    </w:p>
+    <w:p>
+      <w:pPr>
+        <w:shd w:fill="F4F6FA" w:color="auto" w:val="clear"/>
+        <w:bidi w:val="false"/>
+        <w:spacing w:after="0" w:line="230"/>
+        <w:jc w:val="left"/>
+      </w:pPr>
+      <w:r>
+        <w:rPr>
+          <w:rFonts w:ascii="Consolas" w:cs="Consolas" w:eastAsia="Consolas" w:hAnsi="Consolas"/>
+          <w:color w:val="1F2937"/>
+          <w:sz w:val="15"/>
+          <w:szCs w:val="15"/>
+        </w:rPr>
+        <w:t xml:space="preserve">              },</w:t>
+      </w:r>
+    </w:p>
+    <w:p>
+      <w:pPr>
+        <w:shd w:fill="F4F6FA" w:color="auto" w:val="clear"/>
+        <w:bidi w:val="false"/>
+        <w:spacing w:after="0" w:line="230"/>
+        <w:jc w:val="left"/>
+      </w:pPr>
+      <w:r>
+        <w:rPr>
+          <w:rFonts w:ascii="Consolas" w:cs="Consolas" w:eastAsia="Consolas" w:hAnsi="Consolas"/>
+          <w:color w:val="1F2937"/>
+          <w:sz w:val="15"/>
+          <w:szCs w:val="15"/>
+        </w:rPr>
+        <w:t xml:space="preserve">              "value": "הבנק מייצג את הבנק. מי מייצג אתכם?"</w:t>
+      </w:r>
+    </w:p>
+    <w:p>
+      <w:pPr>
+        <w:shd w:fill="F4F6FA" w:color="auto" w:val="clear"/>
+        <w:bidi w:val="false"/>
+        <w:spacing w:after="0" w:line="230"/>
+        <w:jc w:val="left"/>
+      </w:pPr>
+      <w:r>
+        <w:rPr>
+          <w:rFonts w:ascii="Consolas" w:cs="Consolas" w:eastAsia="Consolas" w:hAnsi="Consolas"/>
+          <w:color w:val="1F2937"/>
+          <w:sz w:val="15"/>
+          <w:szCs w:val="15"/>
+        </w:rPr>
+        <w:t xml:space="preserve">            },</w:t>
+      </w:r>
+    </w:p>
+    <w:p>
+      <w:pPr>
+        <w:shd w:fill="F4F6FA" w:color="auto" w:val="clear"/>
+        <w:bidi w:val="false"/>
+        <w:spacing w:after="0" w:line="230"/>
+        <w:jc w:val="left"/>
+      </w:pPr>
+      <w:r>
+        <w:rPr>
+          <w:rFonts w:ascii="Consolas" w:cs="Consolas" w:eastAsia="Consolas" w:hAnsi="Consolas"/>
+          <w:color w:val="1F2937"/>
+          <w:sz w:val="15"/>
+          <w:szCs w:val="15"/>
+        </w:rPr>
+        <w:t xml:space="preserve">            {</w:t>
+      </w:r>
+    </w:p>
+    <w:p>
+      <w:pPr>
+        <w:shd w:fill="F4F6FA" w:color="auto" w:val="clear"/>
+        <w:bidi w:val="false"/>
+        <w:spacing w:after="0" w:line="230"/>
+        <w:jc w:val="left"/>
+      </w:pPr>
+      <w:r>
+        <w:rPr>
+          <w:rFonts w:ascii="Consolas" w:cs="Consolas" w:eastAsia="Consolas" w:hAnsi="Consolas"/>
+          <w:color w:val="1F2937"/>
+          <w:sz w:val="15"/>
+          <w:szCs w:val="15"/>
+        </w:rPr>
+        <w:t xml:space="preserve">              "role": "tags",</w:t>
+      </w:r>
+    </w:p>
+    <w:p>
+      <w:pPr>
+        <w:shd w:fill="F4F6FA" w:color="auto" w:val="clear"/>
+        <w:bidi w:val="false"/>
+        <w:spacing w:after="0" w:line="230"/>
+        <w:jc w:val="left"/>
+      </w:pPr>
+      <w:r>
+        <w:rPr>
+          <w:rFonts w:ascii="Consolas" w:cs="Consolas" w:eastAsia="Consolas" w:hAnsi="Consolas"/>
+          <w:color w:val="1F2937"/>
+          <w:sz w:val="15"/>
+          <w:szCs w:val="15"/>
+        </w:rPr>
+        <w:t xml:space="preserve">              "size_pt": 8.5,</w:t>
+      </w:r>
+    </w:p>
+    <w:p>
+      <w:pPr>
+        <w:shd w:fill="F4F6FA" w:color="auto" w:val="clear"/>
+        <w:bidi w:val="false"/>
+        <w:spacing w:after="0" w:line="230"/>
+        <w:jc w:val="left"/>
+      </w:pPr>
+      <w:r>
+        <w:rPr>
+          <w:rFonts w:ascii="Consolas" w:cs="Consolas" w:eastAsia="Consolas" w:hAnsi="Consolas"/>
+          <w:color w:val="1F2937"/>
+          <w:sz w:val="15"/>
+          <w:szCs w:val="15"/>
+        </w:rPr>
+        <w:t xml:space="preserve">              "label": "מקרים שאני פוגש כל הזמן:",</w:t>
+      </w:r>
+    </w:p>
+    <w:p>
+      <w:pPr>
+        <w:shd w:fill="F4F6FA" w:color="auto" w:val="clear"/>
+        <w:bidi w:val="false"/>
+        <w:spacing w:after="0" w:line="230"/>
+        <w:jc w:val="left"/>
+      </w:pPr>
+      <w:r>
+        <w:rPr>
+          <w:rFonts w:ascii="Consolas" w:cs="Consolas" w:eastAsia="Consolas" w:hAnsi="Consolas"/>
+          <w:color w:val="1F2937"/>
+          <w:sz w:val="15"/>
+          <w:szCs w:val="15"/>
+        </w:rPr>
+        <w:t xml:space="preserve">              "items": [</w:t>
+      </w:r>
+    </w:p>
+    <w:p>
+      <w:pPr>
+        <w:shd w:fill="F4F6FA" w:color="auto" w:val="clear"/>
+        <w:bidi w:val="false"/>
+        <w:spacing w:after="0" w:line="230"/>
+        <w:jc w:val="left"/>
+      </w:pPr>
+      <w:r>
+        <w:rPr>
+          <w:rFonts w:ascii="Consolas" w:cs="Consolas" w:eastAsia="Consolas" w:hAnsi="Consolas"/>
+          <w:color w:val="1F2937"/>
+          <w:sz w:val="15"/>
+          <w:szCs w:val="15"/>
+        </w:rPr>
+        <w:t xml:space="preserve">                "זוגות צעירים",</w:t>
+      </w:r>
+    </w:p>
+    <w:p>
+      <w:pPr>
+        <w:shd w:fill="F4F6FA" w:color="auto" w:val="clear"/>
+        <w:bidi w:val="false"/>
+        <w:spacing w:after="0" w:line="230"/>
+        <w:jc w:val="left"/>
+      </w:pPr>
+      <w:r>
+        <w:rPr>
+          <w:rFonts w:ascii="Consolas" w:cs="Consolas" w:eastAsia="Consolas" w:hAnsi="Consolas"/>
+          <w:color w:val="1F2937"/>
+          <w:sz w:val="15"/>
+          <w:szCs w:val="15"/>
+        </w:rPr>
+        <w:t xml:space="preserve">                "משפרי דיור",</w:t>
+      </w:r>
+    </w:p>
+    <w:p>
+      <w:pPr>
+        <w:shd w:fill="F4F6FA" w:color="auto" w:val="clear"/>
+        <w:bidi w:val="false"/>
+        <w:spacing w:after="0" w:line="230"/>
+        <w:jc w:val="left"/>
+      </w:pPr>
+      <w:r>
+        <w:rPr>
+          <w:rFonts w:ascii="Consolas" w:cs="Consolas" w:eastAsia="Consolas" w:hAnsi="Consolas"/>
+          <w:color w:val="1F2937"/>
+          <w:sz w:val="15"/>
+          <w:szCs w:val="15"/>
+        </w:rPr>
+        <w:t xml:space="preserve">                "מסורבי בנקים",</w:t>
+      </w:r>
+    </w:p>
+    <w:p>
+      <w:pPr>
+        <w:shd w:fill="F4F6FA" w:color="auto" w:val="clear"/>
+        <w:bidi w:val="false"/>
+        <w:spacing w:after="0" w:line="230"/>
+        <w:jc w:val="left"/>
+      </w:pPr>
+      <w:r>
+        <w:rPr>
+          <w:rFonts w:ascii="Consolas" w:cs="Consolas" w:eastAsia="Consolas" w:hAnsi="Consolas"/>
+          <w:color w:val="1F2937"/>
+          <w:sz w:val="15"/>
+          <w:szCs w:val="15"/>
+        </w:rPr>
+        <w:t xml:space="preserve">                "עצמאים",</w:t>
+      </w:r>
+    </w:p>
+    <w:p>
+      <w:pPr>
+        <w:shd w:fill="F4F6FA" w:color="auto" w:val="clear"/>
+        <w:bidi w:val="false"/>
+        <w:spacing w:after="0" w:line="230"/>
+        <w:jc w:val="left"/>
+      </w:pPr>
+      <w:r>
+        <w:rPr>
+          <w:rFonts w:ascii="Consolas" w:cs="Consolas" w:eastAsia="Consolas" w:hAnsi="Consolas"/>
+          <w:color w:val="1F2937"/>
+          <w:sz w:val="15"/>
+          <w:szCs w:val="15"/>
+        </w:rPr>
+        <w:t xml:space="preserve">                "בעלי עסקים",</w:t>
+      </w:r>
+    </w:p>
+    <w:p>
+      <w:pPr>
+        <w:shd w:fill="F4F6FA" w:color="auto" w:val="clear"/>
+        <w:bidi w:val="false"/>
+        <w:spacing w:after="0" w:line="230"/>
+        <w:jc w:val="left"/>
+      </w:pPr>
+      <w:r>
+        <w:rPr>
+          <w:rFonts w:ascii="Consolas" w:cs="Consolas" w:eastAsia="Consolas" w:hAnsi="Consolas"/>
+          <w:color w:val="1F2937"/>
+          <w:sz w:val="15"/>
+          <w:szCs w:val="15"/>
+        </w:rPr>
+        <w:t xml:space="preserve">                "משקיעי נדל\"ן",</w:t>
+      </w:r>
+    </w:p>
+    <w:p>
+      <w:pPr>
+        <w:shd w:fill="F4F6FA" w:color="auto" w:val="clear"/>
+        <w:bidi w:val="false"/>
+        <w:spacing w:after="0" w:line="230"/>
+        <w:jc w:val="left"/>
+      </w:pPr>
+      <w:r>
+        <w:rPr>
+          <w:rFonts w:ascii="Consolas" w:cs="Consolas" w:eastAsia="Consolas" w:hAnsi="Consolas"/>
+          <w:color w:val="1F2937"/>
+          <w:sz w:val="15"/>
+          <w:szCs w:val="15"/>
+        </w:rPr>
+        <w:t xml:space="preserve">                "בני 55+"</w:t>
+      </w:r>
+    </w:p>
+    <w:p>
+      <w:pPr>
+        <w:shd w:fill="F4F6FA" w:color="auto" w:val="clear"/>
+        <w:bidi w:val="false"/>
+        <w:spacing w:after="0" w:line="230"/>
+        <w:jc w:val="left"/>
+      </w:pPr>
+      <w:r>
+        <w:rPr>
+          <w:rFonts w:ascii="Consolas" w:cs="Consolas" w:eastAsia="Consolas" w:hAnsi="Consolas"/>
+          <w:color w:val="1F2937"/>
+          <w:sz w:val="15"/>
+          <w:szCs w:val="15"/>
+        </w:rPr>
+        <w:t xml:space="preserve">              ],</w:t>
+      </w:r>
+    </w:p>
+    <w:p>
+      <w:pPr>
+        <w:shd w:fill="F4F6FA" w:color="auto" w:val="clear"/>
+        <w:bidi w:val="false"/>
+        <w:spacing w:after="0" w:line="230"/>
+        <w:jc w:val="left"/>
+      </w:pPr>
+      <w:r>
+        <w:rPr>
+          <w:rFonts w:ascii="Consolas" w:cs="Consolas" w:eastAsia="Consolas" w:hAnsi="Consolas"/>
+          <w:color w:val="1F2937"/>
+          <w:sz w:val="15"/>
+          <w:szCs w:val="15"/>
+        </w:rPr>
+        <w:t xml:space="preserve">              "drop_if_overflow": "בני 55+"</w:t>
+      </w:r>
+    </w:p>
+    <w:p>
+      <w:pPr>
+        <w:shd w:fill="F4F6FA" w:color="auto" w:val="clear"/>
+        <w:bidi w:val="false"/>
+        <w:spacing w:after="0" w:line="230"/>
+        <w:jc w:val="left"/>
+      </w:pPr>
+      <w:r>
+        <w:rPr>
+          <w:rFonts w:ascii="Consolas" w:cs="Consolas" w:eastAsia="Consolas" w:hAnsi="Consolas"/>
+          <w:color w:val="1F2937"/>
+          <w:sz w:val="15"/>
+          <w:szCs w:val="15"/>
+        </w:rPr>
+        <w:t xml:space="preserve">            }</w:t>
       </w:r>
     </w:p>
     <w:p>
@@ -20214,58 +21992,58 @@
           <w:sz w:val="15"/>
           <w:szCs w:val="15"/>
         </w:rPr>
-        <w:t xml:space="preserve">          "id": "panel_4",</w:t>
-      </w:r>
-    </w:p>
-    <w:p>
-      <w:pPr>
-        <w:shd w:fill="F4F6FA" w:color="auto" w:val="clear"/>
-        <w:bidi w:val="false"/>
-        <w:spacing w:after="0" w:line="230"/>
-        <w:jc w:val="left"/>
-      </w:pPr>
-      <w:r>
-        <w:rPr>
-          <w:rFonts w:ascii="Consolas" w:cs="Consolas" w:eastAsia="Consolas" w:hAnsi="Consolas"/>
-          <w:color w:val="1F2937"/>
-          <w:sz w:val="15"/>
-          <w:szCs w:val="15"/>
-        </w:rPr>
-        <w:t xml:space="preserve">          "role": "service: business financing (back cover when folded)",</w:t>
-      </w:r>
-    </w:p>
-    <w:p>
-      <w:pPr>
-        <w:shd w:fill="F4F6FA" w:color="auto" w:val="clear"/>
-        <w:bidi w:val="false"/>
-        <w:spacing w:after="0" w:line="230"/>
-        <w:jc w:val="left"/>
-      </w:pPr>
-      <w:r>
-        <w:rPr>
-          <w:rFonts w:ascii="Consolas" w:cs="Consolas" w:eastAsia="Consolas" w:hAnsi="Consolas"/>
-          <w:color w:val="1F2937"/>
-          <w:sz w:val="15"/>
-          <w:szCs w:val="15"/>
-        </w:rPr>
-        <w:t xml:space="preserve">          "audience": "self-employed, companies, BNI members",</w:t>
-      </w:r>
-    </w:p>
-    <w:p>
-      <w:pPr>
-        <w:shd w:fill="F4F6FA" w:color="auto" w:val="clear"/>
-        <w:bidi w:val="false"/>
-        <w:spacing w:after="0" w:line="230"/>
-        <w:jc w:val="left"/>
-      </w:pPr>
-      <w:r>
-        <w:rPr>
-          <w:rFonts w:ascii="Consolas" w:cs="Consolas" w:eastAsia="Consolas" w:hAnsi="Consolas"/>
-          <w:color w:val="1F2937"/>
-          <w:sz w:val="15"/>
-          <w:szCs w:val="15"/>
-        </w:rPr>
-        <w:t xml:space="preserve">          "background": "dark_gradient",</w:t>
+        <w:t xml:space="preserve">          "id": "panel_6",</w:t>
+      </w:r>
+    </w:p>
+    <w:p>
+      <w:pPr>
+        <w:shd w:fill="F4F6FA" w:color="auto" w:val="clear"/>
+        <w:bidi w:val="false"/>
+        <w:spacing w:after="0" w:line="230"/>
+        <w:jc w:val="left"/>
+      </w:pPr>
+      <w:r>
+        <w:rPr>
+          <w:rFonts w:ascii="Consolas" w:cs="Consolas" w:eastAsia="Consolas" w:hAnsi="Consolas"/>
+          <w:color w:val="1F2937"/>
+          <w:sz w:val="15"/>
+          <w:szCs w:val="15"/>
+        </w:rPr>
+        <w:t xml:space="preserve">          "role": "Shirel story",</w:t>
+      </w:r>
+    </w:p>
+    <w:p>
+      <w:pPr>
+        <w:shd w:fill="F4F6FA" w:color="auto" w:val="clear"/>
+        <w:bidi w:val="false"/>
+        <w:spacing w:after="0" w:line="230"/>
+        <w:jc w:val="left"/>
+      </w:pPr>
+      <w:r>
+        <w:rPr>
+          <w:rFonts w:ascii="Consolas" w:cs="Consolas" w:eastAsia="Consolas" w:hAnsi="Consolas"/>
+          <w:color w:val="1F2937"/>
+          <w:sz w:val="15"/>
+          <w:szCs w:val="15"/>
+        </w:rPr>
+        <w:t xml:space="preserve">          "background": "#F4F8FF",</w:t>
+      </w:r>
+    </w:p>
+    <w:p>
+      <w:pPr>
+        <w:shd w:fill="F4F6FA" w:color="auto" w:val="clear"/>
+        <w:bidi w:val="false"/>
+        <w:spacing w:after="0" w:line="230"/>
+        <w:jc w:val="left"/>
+      </w:pPr>
+      <w:r>
+        <w:rPr>
+          <w:rFonts w:ascii="Consolas" w:cs="Consolas" w:eastAsia="Consolas" w:hAnsi="Consolas"/>
+          <w:color w:val="1F2937"/>
+          <w:sz w:val="15"/>
+          <w:szCs w:val="15"/>
+        </w:rPr>
+        <w:t xml:space="preserve">          "layout": "photo half, text half",</w:t>
       </w:r>
     </w:p>
     <w:p>
@@ -20333,143 +22111,41 @@
           <w:sz w:val="15"/>
           <w:szCs w:val="15"/>
         </w:rPr>
-        <w:t xml:space="preserve">              "lines": 1,</w:t>
-      </w:r>
-    </w:p>
-    <w:p>
-      <w:pPr>
-        <w:shd w:fill="F4F6FA" w:color="auto" w:val="clear"/>
-        <w:bidi w:val="false"/>
-        <w:spacing w:after="0" w:line="230"/>
-        <w:jc w:val="left"/>
-      </w:pPr>
-      <w:r>
-        <w:rPr>
-          <w:rFonts w:ascii="Consolas" w:cs="Consolas" w:eastAsia="Consolas" w:hAnsi="Consolas"/>
-          <w:color w:val="1F2937"/>
-          <w:sz w:val="15"/>
-          <w:szCs w:val="15"/>
-        </w:rPr>
-        <w:t xml:space="preserve">              "size_pt": 24,</w:t>
-      </w:r>
-    </w:p>
-    <w:p>
-      <w:pPr>
-        <w:shd w:fill="F4F6FA" w:color="auto" w:val="clear"/>
-        <w:bidi w:val="false"/>
-        <w:spacing w:after="0" w:line="230"/>
-        <w:jc w:val="left"/>
-      </w:pPr>
-      <w:r>
-        <w:rPr>
-          <w:rFonts w:ascii="Consolas" w:cs="Consolas" w:eastAsia="Consolas" w:hAnsi="Consolas"/>
-          <w:color w:val="1F2937"/>
-          <w:sz w:val="15"/>
-          <w:szCs w:val="15"/>
-        </w:rPr>
-        <w:t xml:space="preserve">              "weight": "black",</w:t>
-      </w:r>
-    </w:p>
-    <w:p>
-      <w:pPr>
-        <w:shd w:fill="F4F6FA" w:color="auto" w:val="clear"/>
-        <w:bidi w:val="false"/>
-        <w:spacing w:after="0" w:line="230"/>
-        <w:jc w:val="left"/>
-      </w:pPr>
-      <w:r>
-        <w:rPr>
-          <w:rFonts w:ascii="Consolas" w:cs="Consolas" w:eastAsia="Consolas" w:hAnsi="Consolas"/>
-          <w:color w:val="1F2937"/>
-          <w:sz w:val="15"/>
-          <w:szCs w:val="15"/>
-        </w:rPr>
-        <w:t xml:space="preserve">              "color": "#FFFFFF",</w:t>
-      </w:r>
-    </w:p>
-    <w:p>
-      <w:pPr>
-        <w:shd w:fill="F4F6FA" w:color="auto" w:val="clear"/>
-        <w:bidi w:val="false"/>
-        <w:spacing w:after="0" w:line="230"/>
-        <w:jc w:val="left"/>
-      </w:pPr>
-      <w:r>
-        <w:rPr>
-          <w:rFonts w:ascii="Consolas" w:cs="Consolas" w:eastAsia="Consolas" w:hAnsi="Consolas"/>
-          <w:color w:val="1F2937"/>
-          <w:sz w:val="15"/>
-          <w:szCs w:val="15"/>
-        </w:rPr>
-        <w:t xml:space="preserve">              "highlight": {</w:t>
-      </w:r>
-    </w:p>
-    <w:p>
-      <w:pPr>
-        <w:shd w:fill="F4F6FA" w:color="auto" w:val="clear"/>
-        <w:bidi w:val="false"/>
-        <w:spacing w:after="0" w:line="230"/>
-        <w:jc w:val="left"/>
-      </w:pPr>
-      <w:r>
-        <w:rPr>
-          <w:rFonts w:ascii="Consolas" w:cs="Consolas" w:eastAsia="Consolas" w:hAnsi="Consolas"/>
-          <w:color w:val="1F2937"/>
-          <w:sz w:val="15"/>
-          <w:szCs w:val="15"/>
-        </w:rPr>
-        <w:t xml:space="preserve">                "word": "התזרים לא",</w:t>
-      </w:r>
-    </w:p>
-    <w:p>
-      <w:pPr>
-        <w:shd w:fill="F4F6FA" w:color="auto" w:val="clear"/>
-        <w:bidi w:val="false"/>
-        <w:spacing w:after="0" w:line="230"/>
-        <w:jc w:val="left"/>
-      </w:pPr>
-      <w:r>
-        <w:rPr>
-          <w:rFonts w:ascii="Consolas" w:cs="Consolas" w:eastAsia="Consolas" w:hAnsi="Consolas"/>
-          <w:color w:val="1F2937"/>
-          <w:sz w:val="15"/>
-          <w:szCs w:val="15"/>
-        </w:rPr>
-        <w:t xml:space="preserve">                "color": "#1EC8C8"</w:t>
-      </w:r>
-    </w:p>
-    <w:p>
-      <w:pPr>
-        <w:shd w:fill="F4F6FA" w:color="auto" w:val="clear"/>
-        <w:bidi w:val="false"/>
-        <w:spacing w:after="0" w:line="230"/>
-        <w:jc w:val="left"/>
-      </w:pPr>
-      <w:r>
-        <w:rPr>
-          <w:rFonts w:ascii="Consolas" w:cs="Consolas" w:eastAsia="Consolas" w:hAnsi="Consolas"/>
-          <w:color w:val="1F2937"/>
-          <w:sz w:val="15"/>
-          <w:szCs w:val="15"/>
-        </w:rPr>
-        <w:t xml:space="preserve">              },</w:t>
-      </w:r>
-    </w:p>
-    <w:p>
-      <w:pPr>
-        <w:shd w:fill="F4F6FA" w:color="auto" w:val="clear"/>
-        <w:bidi w:val="false"/>
-        <w:spacing w:after="0" w:line="230"/>
-        <w:jc w:val="left"/>
-      </w:pPr>
-      <w:r>
-        <w:rPr>
-          <w:rFonts w:ascii="Consolas" w:cs="Consolas" w:eastAsia="Consolas" w:hAnsi="Consolas"/>
-          <w:color w:val="1F2937"/>
-          <w:sz w:val="15"/>
-          <w:szCs w:val="15"/>
-        </w:rPr>
-        <w:t xml:space="preserve">              "value": "העסק מוכן לצמוח. התזרים לא."</w:t>
+        <w:t xml:space="preserve">              "lines": 2,</w:t>
+      </w:r>
+    </w:p>
+    <w:p>
+      <w:pPr>
+        <w:shd w:fill="F4F6FA" w:color="auto" w:val="clear"/>
+        <w:bidi w:val="false"/>
+        <w:spacing w:after="0" w:line="230"/>
+        <w:jc w:val="left"/>
+      </w:pPr>
+      <w:r>
+        <w:rPr>
+          <w:rFonts w:ascii="Consolas" w:cs="Consolas" w:eastAsia="Consolas" w:hAnsi="Consolas"/>
+          <w:color w:val="1F2937"/>
+          <w:sz w:val="15"/>
+          <w:szCs w:val="15"/>
+        </w:rPr>
+        <w:t xml:space="preserve">              "size_pt": 23,</w:t>
+      </w:r>
+    </w:p>
+    <w:p>
+      <w:pPr>
+        <w:shd w:fill="F4F6FA" w:color="auto" w:val="clear"/>
+        <w:bidi w:val="false"/>
+        <w:spacing w:after="0" w:line="230"/>
+        <w:jc w:val="left"/>
+      </w:pPr>
+      <w:r>
+        <w:rPr>
+          <w:rFonts w:ascii="Consolas" w:cs="Consolas" w:eastAsia="Consolas" w:hAnsi="Consolas"/>
+          <w:color w:val="1F2937"/>
+          <w:sz w:val="15"/>
+          <w:szCs w:val="15"/>
+        </w:rPr>
+        <w:t xml:space="preserve">              "value": "ראיתי מקרוב מה טעות פיננסית עושה למשפחה."</w:t>
       </w:r>
     </w:p>
     <w:p>
@@ -20537,23 +22213,6 @@
           <w:sz w:val="15"/>
           <w:szCs w:val="15"/>
         </w:rPr>
-        <w:t xml:space="preserve">              "lines": 2,</w:t>
-      </w:r>
-    </w:p>
-    <w:p>
-      <w:pPr>
-        <w:shd w:fill="F4F6FA" w:color="auto" w:val="clear"/>
-        <w:bidi w:val="false"/>
-        <w:spacing w:after="0" w:line="230"/>
-        <w:jc w:val="left"/>
-      </w:pPr>
-      <w:r>
-        <w:rPr>
-          <w:rFonts w:ascii="Consolas" w:cs="Consolas" w:eastAsia="Consolas" w:hAnsi="Consolas"/>
-          <w:color w:val="1F2937"/>
-          <w:sz w:val="15"/>
-          <w:szCs w:val="15"/>
-        </w:rPr>
         <w:t xml:space="preserve">              "size_pt": 11,</w:t>
       </w:r>
     </w:p>
@@ -20571,7 +22230,7 @@
           <w:sz w:val="15"/>
           <w:szCs w:val="15"/>
         </w:rPr>
-        <w:t xml:space="preserve">              "value": "מימון נכון משרת את תוכנית הצמיחה, ולא חונק את התזרים."</w:t>
+        <w:t xml:space="preserve">              "value": "למדתי את מה שאף אחד לא לימד אותנו."</w:t>
       </w:r>
     </w:p>
     <w:p>
@@ -20622,109 +22281,41 @@
           <w:sz w:val="15"/>
           <w:szCs w:val="15"/>
         </w:rPr>
-        <w:t xml:space="preserve">              "role": "icon_row",</w:t>
-      </w:r>
-    </w:p>
-    <w:p>
-      <w:pPr>
-        <w:shd w:fill="F4F6FA" w:color="auto" w:val="clear"/>
-        <w:bidi w:val="false"/>
-        <w:spacing w:after="0" w:line="230"/>
-        <w:jc w:val="left"/>
-      </w:pPr>
-      <w:r>
-        <w:rPr>
-          <w:rFonts w:ascii="Consolas" w:cs="Consolas" w:eastAsia="Consolas" w:hAnsi="Consolas"/>
-          <w:color w:val="1F2937"/>
-          <w:sz w:val="15"/>
-          <w:szCs w:val="15"/>
-        </w:rPr>
-        <w:t xml:space="preserve">              "size_pt": 9.5,</w:t>
-      </w:r>
-    </w:p>
-    <w:p>
-      <w:pPr>
-        <w:shd w:fill="F4F6FA" w:color="auto" w:val="clear"/>
-        <w:bidi w:val="false"/>
-        <w:spacing w:after="0" w:line="230"/>
-        <w:jc w:val="left"/>
-      </w:pPr>
-      <w:r>
-        <w:rPr>
-          <w:rFonts w:ascii="Consolas" w:cs="Consolas" w:eastAsia="Consolas" w:hAnsi="Consolas"/>
-          <w:color w:val="1F2937"/>
-          <w:sz w:val="15"/>
-          <w:szCs w:val="15"/>
-        </w:rPr>
-        <w:t xml:space="preserve">              "items": [</w:t>
-      </w:r>
-    </w:p>
-    <w:p>
-      <w:pPr>
-        <w:shd w:fill="F4F6FA" w:color="auto" w:val="clear"/>
-        <w:bidi w:val="false"/>
-        <w:spacing w:after="0" w:line="230"/>
-        <w:jc w:val="left"/>
-      </w:pPr>
-      <w:r>
-        <w:rPr>
-          <w:rFonts w:ascii="Consolas" w:cs="Consolas" w:eastAsia="Consolas" w:hAnsi="Consolas"/>
-          <w:color w:val="1F2937"/>
-          <w:sz w:val="15"/>
-          <w:szCs w:val="15"/>
-        </w:rPr>
-        <w:t xml:space="preserve">                "בחינת חלופות מימון",</w:t>
-      </w:r>
-    </w:p>
-    <w:p>
-      <w:pPr>
-        <w:shd w:fill="F4F6FA" w:color="auto" w:val="clear"/>
-        <w:bidi w:val="false"/>
-        <w:spacing w:after="0" w:line="230"/>
-        <w:jc w:val="left"/>
-      </w:pPr>
-      <w:r>
-        <w:rPr>
-          <w:rFonts w:ascii="Consolas" w:cs="Consolas" w:eastAsia="Consolas" w:hAnsi="Consolas"/>
-          <w:color w:val="1F2937"/>
-          <w:sz w:val="15"/>
-          <w:szCs w:val="15"/>
-        </w:rPr>
-        <w:t xml:space="preserve">                "החזר לפי התזרים",</w:t>
-      </w:r>
-    </w:p>
-    <w:p>
-      <w:pPr>
-        <w:shd w:fill="F4F6FA" w:color="auto" w:val="clear"/>
-        <w:bidi w:val="false"/>
-        <w:spacing w:after="0" w:line="230"/>
-        <w:jc w:val="left"/>
-      </w:pPr>
-      <w:r>
-        <w:rPr>
-          <w:rFonts w:ascii="Consolas" w:cs="Consolas" w:eastAsia="Consolas" w:hAnsi="Consolas"/>
-          <w:color w:val="1F2937"/>
-          <w:sz w:val="15"/>
-          <w:szCs w:val="15"/>
-        </w:rPr>
-        <w:t xml:space="preserve">                "העלות הכוללת, לא רק הריבית"</w:t>
-      </w:r>
-    </w:p>
-    <w:p>
-      <w:pPr>
-        <w:shd w:fill="F4F6FA" w:color="auto" w:val="clear"/>
-        <w:bidi w:val="false"/>
-        <w:spacing w:after="0" w:line="230"/>
-        <w:jc w:val="left"/>
-      </w:pPr>
-      <w:r>
-        <w:rPr>
-          <w:rFonts w:ascii="Consolas" w:cs="Consolas" w:eastAsia="Consolas" w:hAnsi="Consolas"/>
-          <w:color w:val="1F2937"/>
-          <w:sz w:val="15"/>
-          <w:szCs w:val="15"/>
-        </w:rPr>
-        <w:t xml:space="preserve">              ]</w:t>
+        <w:t xml:space="preserve">              "role": "credentials",</w:t>
+      </w:r>
+    </w:p>
+    <w:p>
+      <w:pPr>
+        <w:shd w:fill="F4F6FA" w:color="auto" w:val="clear"/>
+        <w:bidi w:val="false"/>
+        <w:spacing w:after="0" w:line="230"/>
+        <w:jc w:val="left"/>
+      </w:pPr>
+      <w:r>
+        <w:rPr>
+          <w:rFonts w:ascii="Consolas" w:cs="Consolas" w:eastAsia="Consolas" w:hAnsi="Consolas"/>
+          <w:color w:val="1F2937"/>
+          <w:sz w:val="15"/>
+          <w:szCs w:val="15"/>
+        </w:rPr>
+        <w:t xml:space="preserve">              "size_pt": 9,</w:t>
+      </w:r>
+    </w:p>
+    <w:p>
+      <w:pPr>
+        <w:shd w:fill="F4F6FA" w:color="auto" w:val="clear"/>
+        <w:bidi w:val="false"/>
+        <w:spacing w:after="0" w:line="230"/>
+        <w:jc w:val="left"/>
+      </w:pPr>
+      <w:r>
+        <w:rPr>
+          <w:rFonts w:ascii="Consolas" w:cs="Consolas" w:eastAsia="Consolas" w:hAnsi="Consolas"/>
+          <w:color w:val="1F2937"/>
+          <w:sz w:val="15"/>
+          <w:szCs w:val="15"/>
+        </w:rPr>
+        <w:t xml:space="preserve">              "value": "B.A כלכלה + M.B.A · חבר בהתאחדות יועצי המשכנתאות"</w:t>
       </w:r>
     </w:p>
     <w:p>
@@ -20775,1434 +22366,6 @@
           <w:sz w:val="15"/>
           <w:szCs w:val="15"/>
         </w:rPr>
-        <w:t xml:space="preserve">              "role": "cta",</w:t>
-      </w:r>
-    </w:p>
-    <w:p>
-      <w:pPr>
-        <w:shd w:fill="F4F6FA" w:color="auto" w:val="clear"/>
-        <w:bidi w:val="false"/>
-        <w:spacing w:after="0" w:line="230"/>
-        <w:jc w:val="left"/>
-      </w:pPr>
-      <w:r>
-        <w:rPr>
-          <w:rFonts w:ascii="Consolas" w:cs="Consolas" w:eastAsia="Consolas" w:hAnsi="Consolas"/>
-          <w:color w:val="1F2937"/>
-          <w:sz w:val="15"/>
-          <w:szCs w:val="15"/>
-        </w:rPr>
-        <w:t xml:space="preserve">              "size_pt": 11,</w:t>
-      </w:r>
-    </w:p>
-    <w:p>
-      <w:pPr>
-        <w:shd w:fill="F4F6FA" w:color="auto" w:val="clear"/>
-        <w:bidi w:val="false"/>
-        <w:spacing w:after="0" w:line="230"/>
-        <w:jc w:val="left"/>
-      </w:pPr>
-      <w:r>
-        <w:rPr>
-          <w:rFonts w:ascii="Consolas" w:cs="Consolas" w:eastAsia="Consolas" w:hAnsi="Consolas"/>
-          <w:color w:val="1F2937"/>
-          <w:sz w:val="15"/>
-          <w:szCs w:val="15"/>
-        </w:rPr>
-        <w:t xml:space="preserve">              "value": "הצמיחה הבאה, במרחק שיחה · 052-441-5395"</w:t>
-      </w:r>
-    </w:p>
-    <w:p>
-      <w:pPr>
-        <w:shd w:fill="F4F6FA" w:color="auto" w:val="clear"/>
-        <w:bidi w:val="false"/>
-        <w:spacing w:after="0" w:line="230"/>
-        <w:jc w:val="left"/>
-      </w:pPr>
-      <w:r>
-        <w:rPr>
-          <w:rFonts w:ascii="Consolas" w:cs="Consolas" w:eastAsia="Consolas" w:hAnsi="Consolas"/>
-          <w:color w:val="1F2937"/>
-          <w:sz w:val="15"/>
-          <w:szCs w:val="15"/>
-        </w:rPr>
-        <w:t xml:space="preserve">            }</w:t>
-      </w:r>
-    </w:p>
-    <w:p>
-      <w:pPr>
-        <w:shd w:fill="F4F6FA" w:color="auto" w:val="clear"/>
-        <w:bidi w:val="false"/>
-        <w:spacing w:after="0" w:line="230"/>
-        <w:jc w:val="left"/>
-      </w:pPr>
-      <w:r>
-        <w:rPr>
-          <w:rFonts w:ascii="Consolas" w:cs="Consolas" w:eastAsia="Consolas" w:hAnsi="Consolas"/>
-          <w:color w:val="1F2937"/>
-          <w:sz w:val="15"/>
-          <w:szCs w:val="15"/>
-        </w:rPr>
-        <w:t xml:space="preserve">          ],</w:t>
-      </w:r>
-    </w:p>
-    <w:p>
-      <w:pPr>
-        <w:shd w:fill="F4F6FA" w:color="auto" w:val="clear"/>
-        <w:bidi w:val="false"/>
-        <w:spacing w:after="0" w:line="230"/>
-        <w:jc w:val="left"/>
-      </w:pPr>
-      <w:r>
-        <w:rPr>
-          <w:rFonts w:ascii="Consolas" w:cs="Consolas" w:eastAsia="Consolas" w:hAnsi="Consolas"/>
-          <w:color w:val="1F2937"/>
-          <w:sz w:val="15"/>
-          <w:szCs w:val="15"/>
-        </w:rPr>
-        <w:t xml:space="preserve">          "visuals": [</w:t>
-      </w:r>
-    </w:p>
-    <w:p>
-      <w:pPr>
-        <w:shd w:fill="F4F6FA" w:color="auto" w:val="clear"/>
-        <w:bidi w:val="false"/>
-        <w:spacing w:after="0" w:line="230"/>
-        <w:jc w:val="left"/>
-      </w:pPr>
-      <w:r>
-        <w:rPr>
-          <w:rFonts w:ascii="Consolas" w:cs="Consolas" w:eastAsia="Consolas" w:hAnsi="Consolas"/>
-          <w:color w:val="1F2937"/>
-          <w:sz w:val="15"/>
-          <w:szCs w:val="15"/>
-        </w:rPr>
-        <w:t xml:space="preserve">            "single thin turquoise rising line across panel",</w:t>
-      </w:r>
-    </w:p>
-    <w:p>
-      <w:pPr>
-        <w:shd w:fill="F4F6FA" w:color="auto" w:val="clear"/>
-        <w:bidi w:val="false"/>
-        <w:spacing w:after="0" w:line="230"/>
-        <w:jc w:val="left"/>
-      </w:pPr>
-      <w:r>
-        <w:rPr>
-          <w:rFonts w:ascii="Consolas" w:cs="Consolas" w:eastAsia="Consolas" w:hAnsi="Consolas"/>
-          <w:color w:val="1F2937"/>
-          <w:sz w:val="15"/>
-          <w:szCs w:val="15"/>
-        </w:rPr>
-        <w:t xml:space="preserve">            "white logo in corner"</w:t>
-      </w:r>
-    </w:p>
-    <w:p>
-      <w:pPr>
-        <w:shd w:fill="F4F6FA" w:color="auto" w:val="clear"/>
-        <w:bidi w:val="false"/>
-        <w:spacing w:after="0" w:line="230"/>
-        <w:jc w:val="left"/>
-      </w:pPr>
-      <w:r>
-        <w:rPr>
-          <w:rFonts w:ascii="Consolas" w:cs="Consolas" w:eastAsia="Consolas" w:hAnsi="Consolas"/>
-          <w:color w:val="1F2937"/>
-          <w:sz w:val="15"/>
-          <w:szCs w:val="15"/>
-        </w:rPr>
-        <w:t xml:space="preserve">          ],</w:t>
-      </w:r>
-    </w:p>
-    <w:p>
-      <w:pPr>
-        <w:shd w:fill="F4F6FA" w:color="auto" w:val="clear"/>
-        <w:bidi w:val="false"/>
-        <w:spacing w:after="0" w:line="230"/>
-        <w:jc w:val="left"/>
-      </w:pPr>
-      <w:r>
-        <w:rPr>
-          <w:rFonts w:ascii="Consolas" w:cs="Consolas" w:eastAsia="Consolas" w:hAnsi="Consolas"/>
-          <w:color w:val="1F2937"/>
-          <w:sz w:val="15"/>
-          <w:szCs w:val="15"/>
-        </w:rPr>
-        <w:t xml:space="preserve">          "fine_print": "כל מקרה נבחן לגופו ובכפוף לאישור הגוף המממן."</w:t>
-      </w:r>
-    </w:p>
-    <w:p>
-      <w:pPr>
-        <w:shd w:fill="F4F6FA" w:color="auto" w:val="clear"/>
-        <w:bidi w:val="false"/>
-        <w:spacing w:after="0" w:line="230"/>
-        <w:jc w:val="left"/>
-      </w:pPr>
-      <w:r>
-        <w:rPr>
-          <w:rFonts w:ascii="Consolas" w:cs="Consolas" w:eastAsia="Consolas" w:hAnsi="Consolas"/>
-          <w:color w:val="1F2937"/>
-          <w:sz w:val="15"/>
-          <w:szCs w:val="15"/>
-        </w:rPr>
-        <w:t xml:space="preserve">        }</w:t>
-      </w:r>
-    </w:p>
-    <w:p>
-      <w:pPr>
-        <w:shd w:fill="F4F6FA" w:color="auto" w:val="clear"/>
-        <w:bidi w:val="false"/>
-        <w:spacing w:after="0" w:line="230"/>
-        <w:jc w:val="left"/>
-      </w:pPr>
-      <w:r>
-        <w:rPr>
-          <w:rFonts w:ascii="Consolas" w:cs="Consolas" w:eastAsia="Consolas" w:hAnsi="Consolas"/>
-          <w:color w:val="1F2937"/>
-          <w:sz w:val="15"/>
-          <w:szCs w:val="15"/>
-        </w:rPr>
-        <w:t xml:space="preserve">      ]</w:t>
-      </w:r>
-    </w:p>
-    <w:p>
-      <w:pPr>
-        <w:shd w:fill="F4F6FA" w:color="auto" w:val="clear"/>
-        <w:bidi w:val="false"/>
-        <w:spacing w:after="0" w:line="230"/>
-        <w:jc w:val="left"/>
-      </w:pPr>
-      <w:r>
-        <w:rPr>
-          <w:rFonts w:ascii="Consolas" w:cs="Consolas" w:eastAsia="Consolas" w:hAnsi="Consolas"/>
-          <w:color w:val="1F2937"/>
-          <w:sz w:val="15"/>
-          <w:szCs w:val="15"/>
-        </w:rPr>
-        <w:t xml:space="preserve">    },</w:t>
-      </w:r>
-    </w:p>
-    <w:p>
-      <w:pPr>
-        <w:shd w:fill="F4F6FA" w:color="auto" w:val="clear"/>
-        <w:bidi w:val="false"/>
-        <w:spacing w:after="0" w:line="230"/>
-        <w:jc w:val="left"/>
-      </w:pPr>
-      <w:r>
-        <w:rPr>
-          <w:rFonts w:ascii="Consolas" w:cs="Consolas" w:eastAsia="Consolas" w:hAnsi="Consolas"/>
-          <w:color w:val="1F2937"/>
-          <w:sz w:val="15"/>
-          <w:szCs w:val="15"/>
-        </w:rPr>
-        <w:t xml:space="preserve">    {</w:t>
-      </w:r>
-    </w:p>
-    <w:p>
-      <w:pPr>
-        <w:shd w:fill="F4F6FA" w:color="auto" w:val="clear"/>
-        <w:bidi w:val="false"/>
-        <w:spacing w:after="0" w:line="230"/>
-        <w:jc w:val="left"/>
-      </w:pPr>
-      <w:r>
-        <w:rPr>
-          <w:rFonts w:ascii="Consolas" w:cs="Consolas" w:eastAsia="Consolas" w:hAnsi="Consolas"/>
-          <w:color w:val="1F2937"/>
-          <w:sz w:val="15"/>
-          <w:szCs w:val="15"/>
-        </w:rPr>
-        <w:t xml:space="preserve">      "side": "inside",</w:t>
-      </w:r>
-    </w:p>
-    <w:p>
-      <w:pPr>
-        <w:shd w:fill="F4F6FA" w:color="auto" w:val="clear"/>
-        <w:bidi w:val="false"/>
-        <w:spacing w:after="0" w:line="230"/>
-        <w:jc w:val="left"/>
-      </w:pPr>
-      <w:r>
-        <w:rPr>
-          <w:rFonts w:ascii="Consolas" w:cs="Consolas" w:eastAsia="Consolas" w:hAnsi="Consolas"/>
-          <w:color w:val="1F2937"/>
-          <w:sz w:val="15"/>
-          <w:szCs w:val="15"/>
-        </w:rPr>
-        <w:t xml:space="preserve">      "character": "story, emotional, personal",</w:t>
-      </w:r>
-    </w:p>
-    <w:p>
-      <w:pPr>
-        <w:shd w:fill="F4F6FA" w:color="auto" w:val="clear"/>
-        <w:bidi w:val="false"/>
-        <w:spacing w:after="0" w:line="230"/>
-        <w:jc w:val="left"/>
-      </w:pPr>
-      <w:r>
-        <w:rPr>
-          <w:rFonts w:ascii="Consolas" w:cs="Consolas" w:eastAsia="Consolas" w:hAnsi="Consolas"/>
-          <w:color w:val="1F2937"/>
-          <w:sz w:val="15"/>
-          <w:szCs w:val="15"/>
-        </w:rPr>
-        <w:t xml:space="preserve">      "order": "top_to_bottom",</w:t>
-      </w:r>
-    </w:p>
-    <w:p>
-      <w:pPr>
-        <w:shd w:fill="F4F6FA" w:color="auto" w:val="clear"/>
-        <w:bidi w:val="false"/>
-        <w:spacing w:after="0" w:line="230"/>
-        <w:jc w:val="left"/>
-      </w:pPr>
-      <w:r>
-        <w:rPr>
-          <w:rFonts w:ascii="Consolas" w:cs="Consolas" w:eastAsia="Consolas" w:hAnsi="Consolas"/>
-          <w:color w:val="1F2937"/>
-          <w:sz w:val="15"/>
-          <w:szCs w:val="15"/>
-        </w:rPr>
-        <w:t xml:space="preserve">      "panels": [</w:t>
-      </w:r>
-    </w:p>
-    <w:p>
-      <w:pPr>
-        <w:shd w:fill="F4F6FA" w:color="auto" w:val="clear"/>
-        <w:bidi w:val="false"/>
-        <w:spacing w:after="0" w:line="230"/>
-        <w:jc w:val="left"/>
-      </w:pPr>
-      <w:r>
-        <w:rPr>
-          <w:rFonts w:ascii="Consolas" w:cs="Consolas" w:eastAsia="Consolas" w:hAnsi="Consolas"/>
-          <w:color w:val="1F2937"/>
-          <w:sz w:val="15"/>
-          <w:szCs w:val="15"/>
-        </w:rPr>
-        <w:t xml:space="preserve">        {</w:t>
-      </w:r>
-    </w:p>
-    <w:p>
-      <w:pPr>
-        <w:shd w:fill="F4F6FA" w:color="auto" w:val="clear"/>
-        <w:bidi w:val="false"/>
-        <w:spacing w:after="0" w:line="230"/>
-        <w:jc w:val="left"/>
-      </w:pPr>
-      <w:r>
-        <w:rPr>
-          <w:rFonts w:ascii="Consolas" w:cs="Consolas" w:eastAsia="Consolas" w:hAnsi="Consolas"/>
-          <w:color w:val="1F2937"/>
-          <w:sz w:val="15"/>
-          <w:szCs w:val="15"/>
-        </w:rPr>
-        <w:t xml:space="preserve">          "id": "panel_5",</w:t>
-      </w:r>
-    </w:p>
-    <w:p>
-      <w:pPr>
-        <w:shd w:fill="F4F6FA" w:color="auto" w:val="clear"/>
-        <w:bidi w:val="false"/>
-        <w:spacing w:after="0" w:line="230"/>
-        <w:jc w:val="left"/>
-      </w:pPr>
-      <w:r>
-        <w:rPr>
-          <w:rFonts w:ascii="Consolas" w:cs="Consolas" w:eastAsia="Consolas" w:hAnsi="Consolas"/>
-          <w:color w:val="1F2937"/>
-          <w:sz w:val="15"/>
-          <w:szCs w:val="15"/>
-        </w:rPr>
-        <w:t xml:space="preserve">          "role": "pain &amp; identification",</w:t>
-      </w:r>
-    </w:p>
-    <w:p>
-      <w:pPr>
-        <w:shd w:fill="F4F6FA" w:color="auto" w:val="clear"/>
-        <w:bidi w:val="false"/>
-        <w:spacing w:after="0" w:line="230"/>
-        <w:jc w:val="left"/>
-      </w:pPr>
-      <w:r>
-        <w:rPr>
-          <w:rFonts w:ascii="Consolas" w:cs="Consolas" w:eastAsia="Consolas" w:hAnsi="Consolas"/>
-          <w:color w:val="1F2937"/>
-          <w:sz w:val="15"/>
-          <w:szCs w:val="15"/>
-        </w:rPr>
-        <w:t xml:space="preserve">          "background": "#FFFFFF",</w:t>
-      </w:r>
-    </w:p>
-    <w:p>
-      <w:pPr>
-        <w:shd w:fill="F4F6FA" w:color="auto" w:val="clear"/>
-        <w:bidi w:val="false"/>
-        <w:spacing w:after="0" w:line="230"/>
-        <w:jc w:val="left"/>
-      </w:pPr>
-      <w:r>
-        <w:rPr>
-          <w:rFonts w:ascii="Consolas" w:cs="Consolas" w:eastAsia="Consolas" w:hAnsi="Consolas"/>
-          <w:color w:val="1F2937"/>
-          <w:sz w:val="15"/>
-          <w:szCs w:val="15"/>
-        </w:rPr>
-        <w:t xml:space="preserve">          "priority": "most important panel",</w:t>
-      </w:r>
-    </w:p>
-    <w:p>
-      <w:pPr>
-        <w:shd w:fill="F4F6FA" w:color="auto" w:val="clear"/>
-        <w:bidi w:val="false"/>
-        <w:spacing w:after="0" w:line="230"/>
-        <w:jc w:val="left"/>
-      </w:pPr>
-      <w:r>
-        <w:rPr>
-          <w:rFonts w:ascii="Consolas" w:cs="Consolas" w:eastAsia="Consolas" w:hAnsi="Consolas"/>
-          <w:color w:val="1F2937"/>
-          <w:sz w:val="15"/>
-          <w:szCs w:val="15"/>
-        </w:rPr>
-        <w:t xml:space="preserve">          "text": [</w:t>
-      </w:r>
-    </w:p>
-    <w:p>
-      <w:pPr>
-        <w:shd w:fill="F4F6FA" w:color="auto" w:val="clear"/>
-        <w:bidi w:val="false"/>
-        <w:spacing w:after="0" w:line="230"/>
-        <w:jc w:val="left"/>
-      </w:pPr>
-      <w:r>
-        <w:rPr>
-          <w:rFonts w:ascii="Consolas" w:cs="Consolas" w:eastAsia="Consolas" w:hAnsi="Consolas"/>
-          <w:color w:val="1F2937"/>
-          <w:sz w:val="15"/>
-          <w:szCs w:val="15"/>
-        </w:rPr>
-        <w:t xml:space="preserve">            {</w:t>
-      </w:r>
-    </w:p>
-    <w:p>
-      <w:pPr>
-        <w:shd w:fill="F4F6FA" w:color="auto" w:val="clear"/>
-        <w:bidi w:val="false"/>
-        <w:spacing w:after="0" w:line="230"/>
-        <w:jc w:val="left"/>
-      </w:pPr>
-      <w:r>
-        <w:rPr>
-          <w:rFonts w:ascii="Consolas" w:cs="Consolas" w:eastAsia="Consolas" w:hAnsi="Consolas"/>
-          <w:color w:val="1F2937"/>
-          <w:sz w:val="15"/>
-          <w:szCs w:val="15"/>
-        </w:rPr>
-        <w:t xml:space="preserve">              "role": "opening",</w:t>
-      </w:r>
-    </w:p>
-    <w:p>
-      <w:pPr>
-        <w:shd w:fill="F4F6FA" w:color="auto" w:val="clear"/>
-        <w:bidi w:val="false"/>
-        <w:spacing w:after="0" w:line="230"/>
-        <w:jc w:val="left"/>
-      </w:pPr>
-      <w:r>
-        <w:rPr>
-          <w:rFonts w:ascii="Consolas" w:cs="Consolas" w:eastAsia="Consolas" w:hAnsi="Consolas"/>
-          <w:color w:val="1F2937"/>
-          <w:sz w:val="15"/>
-          <w:szCs w:val="15"/>
-        </w:rPr>
-        <w:t xml:space="preserve">              "size_pt": 12,</w:t>
-      </w:r>
-    </w:p>
-    <w:p>
-      <w:pPr>
-        <w:shd w:fill="F4F6FA" w:color="auto" w:val="clear"/>
-        <w:bidi w:val="false"/>
-        <w:spacing w:after="0" w:line="230"/>
-        <w:jc w:val="left"/>
-      </w:pPr>
-      <w:r>
-        <w:rPr>
-          <w:rFonts w:ascii="Consolas" w:cs="Consolas" w:eastAsia="Consolas" w:hAnsi="Consolas"/>
-          <w:color w:val="1F2937"/>
-          <w:sz w:val="15"/>
-          <w:szCs w:val="15"/>
-        </w:rPr>
-        <w:t xml:space="preserve">              "value": "כשזה מגיע לכסף גדול, קל להרגיש לבד מול המערכת."</w:t>
-      </w:r>
-    </w:p>
-    <w:p>
-      <w:pPr>
-        <w:shd w:fill="F4F6FA" w:color="auto" w:val="clear"/>
-        <w:bidi w:val="false"/>
-        <w:spacing w:after="0" w:line="230"/>
-        <w:jc w:val="left"/>
-      </w:pPr>
-      <w:r>
-        <w:rPr>
-          <w:rFonts w:ascii="Consolas" w:cs="Consolas" w:eastAsia="Consolas" w:hAnsi="Consolas"/>
-          <w:color w:val="1F2937"/>
-          <w:sz w:val="15"/>
-          <w:szCs w:val="15"/>
-        </w:rPr>
-        <w:t xml:space="preserve">            },</w:t>
-      </w:r>
-    </w:p>
-    <w:p>
-      <w:pPr>
-        <w:shd w:fill="F4F6FA" w:color="auto" w:val="clear"/>
-        <w:bidi w:val="false"/>
-        <w:spacing w:after="0" w:line="230"/>
-        <w:jc w:val="left"/>
-      </w:pPr>
-      <w:r>
-        <w:rPr>
-          <w:rFonts w:ascii="Consolas" w:cs="Consolas" w:eastAsia="Consolas" w:hAnsi="Consolas"/>
-          <w:color w:val="1F2937"/>
-          <w:sz w:val="15"/>
-          <w:szCs w:val="15"/>
-        </w:rPr>
-        <w:t xml:space="preserve">            {</w:t>
-      </w:r>
-    </w:p>
-    <w:p>
-      <w:pPr>
-        <w:shd w:fill="F4F6FA" w:color="auto" w:val="clear"/>
-        <w:bidi w:val="false"/>
-        <w:spacing w:after="0" w:line="230"/>
-        <w:jc w:val="left"/>
-      </w:pPr>
-      <w:r>
-        <w:rPr>
-          <w:rFonts w:ascii="Consolas" w:cs="Consolas" w:eastAsia="Consolas" w:hAnsi="Consolas"/>
-          <w:color w:val="1F2937"/>
-          <w:sz w:val="15"/>
-          <w:szCs w:val="15"/>
-        </w:rPr>
-        <w:t xml:space="preserve">              "role": "speech_bubbles",</w:t>
-      </w:r>
-    </w:p>
-    <w:p>
-      <w:pPr>
-        <w:shd w:fill="F4F6FA" w:color="auto" w:val="clear"/>
-        <w:bidi w:val="false"/>
-        <w:spacing w:after="0" w:line="230"/>
-        <w:jc w:val="left"/>
-      </w:pPr>
-      <w:r>
-        <w:rPr>
-          <w:rFonts w:ascii="Consolas" w:cs="Consolas" w:eastAsia="Consolas" w:hAnsi="Consolas"/>
-          <w:color w:val="1F2937"/>
-          <w:sz w:val="15"/>
-          <w:szCs w:val="15"/>
-        </w:rPr>
-        <w:t xml:space="preserve">              "size_pt": 10,</w:t>
-      </w:r>
-    </w:p>
-    <w:p>
-      <w:pPr>
-        <w:shd w:fill="F4F6FA" w:color="auto" w:val="clear"/>
-        <w:bidi w:val="false"/>
-        <w:spacing w:after="0" w:line="230"/>
-        <w:jc w:val="left"/>
-      </w:pPr>
-      <w:r>
-        <w:rPr>
-          <w:rFonts w:ascii="Consolas" w:cs="Consolas" w:eastAsia="Consolas" w:hAnsi="Consolas"/>
-          <w:color w:val="1F2937"/>
-          <w:sz w:val="15"/>
-          <w:szCs w:val="15"/>
-        </w:rPr>
-        <w:t xml:space="preserve">              "items": [</w:t>
-      </w:r>
-    </w:p>
-    <w:p>
-      <w:pPr>
-        <w:shd w:fill="F4F6FA" w:color="auto" w:val="clear"/>
-        <w:bidi w:val="false"/>
-        <w:spacing w:after="0" w:line="230"/>
-        <w:jc w:val="left"/>
-      </w:pPr>
-      <w:r>
-        <w:rPr>
-          <w:rFonts w:ascii="Consolas" w:cs="Consolas" w:eastAsia="Consolas" w:hAnsi="Consolas"/>
-          <w:color w:val="1F2937"/>
-          <w:sz w:val="15"/>
-          <w:szCs w:val="15"/>
-        </w:rPr>
-        <w:t xml:space="preserve">                "הבנק אמר לא.",</w:t>
-      </w:r>
-    </w:p>
-    <w:p>
-      <w:pPr>
-        <w:shd w:fill="F4F6FA" w:color="auto" w:val="clear"/>
-        <w:bidi w:val="false"/>
-        <w:spacing w:after="0" w:line="230"/>
-        <w:jc w:val="left"/>
-      </w:pPr>
-      <w:r>
-        <w:rPr>
-          <w:rFonts w:ascii="Consolas" w:cs="Consolas" w:eastAsia="Consolas" w:hAnsi="Consolas"/>
-          <w:color w:val="1F2937"/>
-          <w:sz w:val="15"/>
-          <w:szCs w:val="15"/>
-        </w:rPr>
-        <w:t xml:space="preserve">                "ההחזר רק עולה.",</w:t>
-      </w:r>
-    </w:p>
-    <w:p>
-      <w:pPr>
-        <w:shd w:fill="F4F6FA" w:color="auto" w:val="clear"/>
-        <w:bidi w:val="false"/>
-        <w:spacing w:after="0" w:line="230"/>
-        <w:jc w:val="left"/>
-      </w:pPr>
-      <w:r>
-        <w:rPr>
-          <w:rFonts w:ascii="Consolas" w:cs="Consolas" w:eastAsia="Consolas" w:hAnsi="Consolas"/>
-          <w:color w:val="1F2937"/>
-          <w:sz w:val="15"/>
-          <w:szCs w:val="15"/>
-        </w:rPr>
-        <w:t xml:space="preserve">                "העסק צריך אוויר."</w:t>
-      </w:r>
-    </w:p>
-    <w:p>
-      <w:pPr>
-        <w:shd w:fill="F4F6FA" w:color="auto" w:val="clear"/>
-        <w:bidi w:val="false"/>
-        <w:spacing w:after="0" w:line="230"/>
-        <w:jc w:val="left"/>
-      </w:pPr>
-      <w:r>
-        <w:rPr>
-          <w:rFonts w:ascii="Consolas" w:cs="Consolas" w:eastAsia="Consolas" w:hAnsi="Consolas"/>
-          <w:color w:val="1F2937"/>
-          <w:sz w:val="15"/>
-          <w:szCs w:val="15"/>
-        </w:rPr>
-        <w:t xml:space="preserve">              ]</w:t>
-      </w:r>
-    </w:p>
-    <w:p>
-      <w:pPr>
-        <w:shd w:fill="F4F6FA" w:color="auto" w:val="clear"/>
-        <w:bidi w:val="false"/>
-        <w:spacing w:after="0" w:line="230"/>
-        <w:jc w:val="left"/>
-      </w:pPr>
-      <w:r>
-        <w:rPr>
-          <w:rFonts w:ascii="Consolas" w:cs="Consolas" w:eastAsia="Consolas" w:hAnsi="Consolas"/>
-          <w:color w:val="1F2937"/>
-          <w:sz w:val="15"/>
-          <w:szCs w:val="15"/>
-        </w:rPr>
-        <w:t xml:space="preserve">            },</w:t>
-      </w:r>
-    </w:p>
-    <w:p>
-      <w:pPr>
-        <w:shd w:fill="F4F6FA" w:color="auto" w:val="clear"/>
-        <w:bidi w:val="false"/>
-        <w:spacing w:after="0" w:line="230"/>
-        <w:jc w:val="left"/>
-      </w:pPr>
-      <w:r>
-        <w:rPr>
-          <w:rFonts w:ascii="Consolas" w:cs="Consolas" w:eastAsia="Consolas" w:hAnsi="Consolas"/>
-          <w:color w:val="1F2937"/>
-          <w:sz w:val="15"/>
-          <w:szCs w:val="15"/>
-        </w:rPr>
-        <w:t xml:space="preserve">            {</w:t>
-      </w:r>
-    </w:p>
-    <w:p>
-      <w:pPr>
-        <w:shd w:fill="F4F6FA" w:color="auto" w:val="clear"/>
-        <w:bidi w:val="false"/>
-        <w:spacing w:after="0" w:line="230"/>
-        <w:jc w:val="left"/>
-      </w:pPr>
-      <w:r>
-        <w:rPr>
-          <w:rFonts w:ascii="Consolas" w:cs="Consolas" w:eastAsia="Consolas" w:hAnsi="Consolas"/>
-          <w:color w:val="1F2937"/>
-          <w:sz w:val="15"/>
-          <w:szCs w:val="15"/>
-        </w:rPr>
-        <w:t xml:space="preserve">              "role": "headline",</w:t>
-      </w:r>
-    </w:p>
-    <w:p>
-      <w:pPr>
-        <w:shd w:fill="F4F6FA" w:color="auto" w:val="clear"/>
-        <w:bidi w:val="false"/>
-        <w:spacing w:after="0" w:line="230"/>
-        <w:jc w:val="left"/>
-      </w:pPr>
-      <w:r>
-        <w:rPr>
-          <w:rFonts w:ascii="Consolas" w:cs="Consolas" w:eastAsia="Consolas" w:hAnsi="Consolas"/>
-          <w:color w:val="1F2937"/>
-          <w:sz w:val="15"/>
-          <w:szCs w:val="15"/>
-        </w:rPr>
-        <w:t xml:space="preserve">              "lines": 2,</w:t>
-      </w:r>
-    </w:p>
-    <w:p>
-      <w:pPr>
-        <w:shd w:fill="F4F6FA" w:color="auto" w:val="clear"/>
-        <w:bidi w:val="false"/>
-        <w:spacing w:after="0" w:line="230"/>
-        <w:jc w:val="left"/>
-      </w:pPr>
-      <w:r>
-        <w:rPr>
-          <w:rFonts w:ascii="Consolas" w:cs="Consolas" w:eastAsia="Consolas" w:hAnsi="Consolas"/>
-          <w:color w:val="1F2937"/>
-          <w:sz w:val="15"/>
-          <w:szCs w:val="15"/>
-        </w:rPr>
-        <w:t xml:space="preserve">              "size_pt": 30,</w:t>
-      </w:r>
-    </w:p>
-    <w:p>
-      <w:pPr>
-        <w:shd w:fill="F4F6FA" w:color="auto" w:val="clear"/>
-        <w:bidi w:val="false"/>
-        <w:spacing w:after="0" w:line="230"/>
-        <w:jc w:val="left"/>
-      </w:pPr>
-      <w:r>
-        <w:rPr>
-          <w:rFonts w:ascii="Consolas" w:cs="Consolas" w:eastAsia="Consolas" w:hAnsi="Consolas"/>
-          <w:color w:val="1F2937"/>
-          <w:sz w:val="15"/>
-          <w:szCs w:val="15"/>
-        </w:rPr>
-        <w:t xml:space="preserve">              "weight": "black",</w:t>
-      </w:r>
-    </w:p>
-    <w:p>
-      <w:pPr>
-        <w:shd w:fill="F4F6FA" w:color="auto" w:val="clear"/>
-        <w:bidi w:val="false"/>
-        <w:spacing w:after="0" w:line="230"/>
-        <w:jc w:val="left"/>
-      </w:pPr>
-      <w:r>
-        <w:rPr>
-          <w:rFonts w:ascii="Consolas" w:cs="Consolas" w:eastAsia="Consolas" w:hAnsi="Consolas"/>
-          <w:color w:val="1F2937"/>
-          <w:sz w:val="15"/>
-          <w:szCs w:val="15"/>
-        </w:rPr>
-        <w:t xml:space="preserve">              "highlight": {</w:t>
-      </w:r>
-    </w:p>
-    <w:p>
-      <w:pPr>
-        <w:shd w:fill="F4F6FA" w:color="auto" w:val="clear"/>
-        <w:bidi w:val="false"/>
-        <w:spacing w:after="0" w:line="230"/>
-        <w:jc w:val="left"/>
-      </w:pPr>
-      <w:r>
-        <w:rPr>
-          <w:rFonts w:ascii="Consolas" w:cs="Consolas" w:eastAsia="Consolas" w:hAnsi="Consolas"/>
-          <w:color w:val="1F2937"/>
-          <w:sz w:val="15"/>
-          <w:szCs w:val="15"/>
-        </w:rPr>
-        <w:t xml:space="preserve">                "phrase": "מי מייצג אתכם?",</w:t>
-      </w:r>
-    </w:p>
-    <w:p>
-      <w:pPr>
-        <w:shd w:fill="F4F6FA" w:color="auto" w:val="clear"/>
-        <w:bidi w:val="false"/>
-        <w:spacing w:after="0" w:line="230"/>
-        <w:jc w:val="left"/>
-      </w:pPr>
-      <w:r>
-        <w:rPr>
-          <w:rFonts w:ascii="Consolas" w:cs="Consolas" w:eastAsia="Consolas" w:hAnsi="Consolas"/>
-          <w:color w:val="1F2937"/>
-          <w:sz w:val="15"/>
-          <w:szCs w:val="15"/>
-        </w:rPr>
-        <w:t xml:space="preserve">                "color": "#004AAD"</w:t>
-      </w:r>
-    </w:p>
-    <w:p>
-      <w:pPr>
-        <w:shd w:fill="F4F6FA" w:color="auto" w:val="clear"/>
-        <w:bidi w:val="false"/>
-        <w:spacing w:after="0" w:line="230"/>
-        <w:jc w:val="left"/>
-      </w:pPr>
-      <w:r>
-        <w:rPr>
-          <w:rFonts w:ascii="Consolas" w:cs="Consolas" w:eastAsia="Consolas" w:hAnsi="Consolas"/>
-          <w:color w:val="1F2937"/>
-          <w:sz w:val="15"/>
-          <w:szCs w:val="15"/>
-        </w:rPr>
-        <w:t xml:space="preserve">              },</w:t>
-      </w:r>
-    </w:p>
-    <w:p>
-      <w:pPr>
-        <w:shd w:fill="F4F6FA" w:color="auto" w:val="clear"/>
-        <w:bidi w:val="false"/>
-        <w:spacing w:after="0" w:line="230"/>
-        <w:jc w:val="left"/>
-      </w:pPr>
-      <w:r>
-        <w:rPr>
-          <w:rFonts w:ascii="Consolas" w:cs="Consolas" w:eastAsia="Consolas" w:hAnsi="Consolas"/>
-          <w:color w:val="1F2937"/>
-          <w:sz w:val="15"/>
-          <w:szCs w:val="15"/>
-        </w:rPr>
-        <w:t xml:space="preserve">              "value": "הבנק מייצג את הבנק. מי מייצג אתכם?"</w:t>
-      </w:r>
-    </w:p>
-    <w:p>
-      <w:pPr>
-        <w:shd w:fill="F4F6FA" w:color="auto" w:val="clear"/>
-        <w:bidi w:val="false"/>
-        <w:spacing w:after="0" w:line="230"/>
-        <w:jc w:val="left"/>
-      </w:pPr>
-      <w:r>
-        <w:rPr>
-          <w:rFonts w:ascii="Consolas" w:cs="Consolas" w:eastAsia="Consolas" w:hAnsi="Consolas"/>
-          <w:color w:val="1F2937"/>
-          <w:sz w:val="15"/>
-          <w:szCs w:val="15"/>
-        </w:rPr>
-        <w:t xml:space="preserve">            },</w:t>
-      </w:r>
-    </w:p>
-    <w:p>
-      <w:pPr>
-        <w:shd w:fill="F4F6FA" w:color="auto" w:val="clear"/>
-        <w:bidi w:val="false"/>
-        <w:spacing w:after="0" w:line="230"/>
-        <w:jc w:val="left"/>
-      </w:pPr>
-      <w:r>
-        <w:rPr>
-          <w:rFonts w:ascii="Consolas" w:cs="Consolas" w:eastAsia="Consolas" w:hAnsi="Consolas"/>
-          <w:color w:val="1F2937"/>
-          <w:sz w:val="15"/>
-          <w:szCs w:val="15"/>
-        </w:rPr>
-        <w:t xml:space="preserve">            {</w:t>
-      </w:r>
-    </w:p>
-    <w:p>
-      <w:pPr>
-        <w:shd w:fill="F4F6FA" w:color="auto" w:val="clear"/>
-        <w:bidi w:val="false"/>
-        <w:spacing w:after="0" w:line="230"/>
-        <w:jc w:val="left"/>
-      </w:pPr>
-      <w:r>
-        <w:rPr>
-          <w:rFonts w:ascii="Consolas" w:cs="Consolas" w:eastAsia="Consolas" w:hAnsi="Consolas"/>
-          <w:color w:val="1F2937"/>
-          <w:sz w:val="15"/>
-          <w:szCs w:val="15"/>
-        </w:rPr>
-        <w:t xml:space="preserve">              "role": "tags",</w:t>
-      </w:r>
-    </w:p>
-    <w:p>
-      <w:pPr>
-        <w:shd w:fill="F4F6FA" w:color="auto" w:val="clear"/>
-        <w:bidi w:val="false"/>
-        <w:spacing w:after="0" w:line="230"/>
-        <w:jc w:val="left"/>
-      </w:pPr>
-      <w:r>
-        <w:rPr>
-          <w:rFonts w:ascii="Consolas" w:cs="Consolas" w:eastAsia="Consolas" w:hAnsi="Consolas"/>
-          <w:color w:val="1F2937"/>
-          <w:sz w:val="15"/>
-          <w:szCs w:val="15"/>
-        </w:rPr>
-        <w:t xml:space="preserve">              "size_pt": 8.5,</w:t>
-      </w:r>
-    </w:p>
-    <w:p>
-      <w:pPr>
-        <w:shd w:fill="F4F6FA" w:color="auto" w:val="clear"/>
-        <w:bidi w:val="false"/>
-        <w:spacing w:after="0" w:line="230"/>
-        <w:jc w:val="left"/>
-      </w:pPr>
-      <w:r>
-        <w:rPr>
-          <w:rFonts w:ascii="Consolas" w:cs="Consolas" w:eastAsia="Consolas" w:hAnsi="Consolas"/>
-          <w:color w:val="1F2937"/>
-          <w:sz w:val="15"/>
-          <w:szCs w:val="15"/>
-        </w:rPr>
-        <w:t xml:space="preserve">              "label": "מקרים שאני פוגש כל הזמן:",</w:t>
-      </w:r>
-    </w:p>
-    <w:p>
-      <w:pPr>
-        <w:shd w:fill="F4F6FA" w:color="auto" w:val="clear"/>
-        <w:bidi w:val="false"/>
-        <w:spacing w:after="0" w:line="230"/>
-        <w:jc w:val="left"/>
-      </w:pPr>
-      <w:r>
-        <w:rPr>
-          <w:rFonts w:ascii="Consolas" w:cs="Consolas" w:eastAsia="Consolas" w:hAnsi="Consolas"/>
-          <w:color w:val="1F2937"/>
-          <w:sz w:val="15"/>
-          <w:szCs w:val="15"/>
-        </w:rPr>
-        <w:t xml:space="preserve">              "items": [</w:t>
-      </w:r>
-    </w:p>
-    <w:p>
-      <w:pPr>
-        <w:shd w:fill="F4F6FA" w:color="auto" w:val="clear"/>
-        <w:bidi w:val="false"/>
-        <w:spacing w:after="0" w:line="230"/>
-        <w:jc w:val="left"/>
-      </w:pPr>
-      <w:r>
-        <w:rPr>
-          <w:rFonts w:ascii="Consolas" w:cs="Consolas" w:eastAsia="Consolas" w:hAnsi="Consolas"/>
-          <w:color w:val="1F2937"/>
-          <w:sz w:val="15"/>
-          <w:szCs w:val="15"/>
-        </w:rPr>
-        <w:t xml:space="preserve">                "זוגות צעירים",</w:t>
-      </w:r>
-    </w:p>
-    <w:p>
-      <w:pPr>
-        <w:shd w:fill="F4F6FA" w:color="auto" w:val="clear"/>
-        <w:bidi w:val="false"/>
-        <w:spacing w:after="0" w:line="230"/>
-        <w:jc w:val="left"/>
-      </w:pPr>
-      <w:r>
-        <w:rPr>
-          <w:rFonts w:ascii="Consolas" w:cs="Consolas" w:eastAsia="Consolas" w:hAnsi="Consolas"/>
-          <w:color w:val="1F2937"/>
-          <w:sz w:val="15"/>
-          <w:szCs w:val="15"/>
-        </w:rPr>
-        <w:t xml:space="preserve">                "משפרי דיור",</w:t>
-      </w:r>
-    </w:p>
-    <w:p>
-      <w:pPr>
-        <w:shd w:fill="F4F6FA" w:color="auto" w:val="clear"/>
-        <w:bidi w:val="false"/>
-        <w:spacing w:after="0" w:line="230"/>
-        <w:jc w:val="left"/>
-      </w:pPr>
-      <w:r>
-        <w:rPr>
-          <w:rFonts w:ascii="Consolas" w:cs="Consolas" w:eastAsia="Consolas" w:hAnsi="Consolas"/>
-          <w:color w:val="1F2937"/>
-          <w:sz w:val="15"/>
-          <w:szCs w:val="15"/>
-        </w:rPr>
-        <w:t xml:space="preserve">                "מסורבי בנקים",</w:t>
-      </w:r>
-    </w:p>
-    <w:p>
-      <w:pPr>
-        <w:shd w:fill="F4F6FA" w:color="auto" w:val="clear"/>
-        <w:bidi w:val="false"/>
-        <w:spacing w:after="0" w:line="230"/>
-        <w:jc w:val="left"/>
-      </w:pPr>
-      <w:r>
-        <w:rPr>
-          <w:rFonts w:ascii="Consolas" w:cs="Consolas" w:eastAsia="Consolas" w:hAnsi="Consolas"/>
-          <w:color w:val="1F2937"/>
-          <w:sz w:val="15"/>
-          <w:szCs w:val="15"/>
-        </w:rPr>
-        <w:t xml:space="preserve">                "עצמאים",</w:t>
-      </w:r>
-    </w:p>
-    <w:p>
-      <w:pPr>
-        <w:shd w:fill="F4F6FA" w:color="auto" w:val="clear"/>
-        <w:bidi w:val="false"/>
-        <w:spacing w:after="0" w:line="230"/>
-        <w:jc w:val="left"/>
-      </w:pPr>
-      <w:r>
-        <w:rPr>
-          <w:rFonts w:ascii="Consolas" w:cs="Consolas" w:eastAsia="Consolas" w:hAnsi="Consolas"/>
-          <w:color w:val="1F2937"/>
-          <w:sz w:val="15"/>
-          <w:szCs w:val="15"/>
-        </w:rPr>
-        <w:t xml:space="preserve">                "בעלי עסקים",</w:t>
-      </w:r>
-    </w:p>
-    <w:p>
-      <w:pPr>
-        <w:shd w:fill="F4F6FA" w:color="auto" w:val="clear"/>
-        <w:bidi w:val="false"/>
-        <w:spacing w:after="0" w:line="230"/>
-        <w:jc w:val="left"/>
-      </w:pPr>
-      <w:r>
-        <w:rPr>
-          <w:rFonts w:ascii="Consolas" w:cs="Consolas" w:eastAsia="Consolas" w:hAnsi="Consolas"/>
-          <w:color w:val="1F2937"/>
-          <w:sz w:val="15"/>
-          <w:szCs w:val="15"/>
-        </w:rPr>
-        <w:t xml:space="preserve">                "משקיעי נדל\"ן",</w:t>
-      </w:r>
-    </w:p>
-    <w:p>
-      <w:pPr>
-        <w:shd w:fill="F4F6FA" w:color="auto" w:val="clear"/>
-        <w:bidi w:val="false"/>
-        <w:spacing w:after="0" w:line="230"/>
-        <w:jc w:val="left"/>
-      </w:pPr>
-      <w:r>
-        <w:rPr>
-          <w:rFonts w:ascii="Consolas" w:cs="Consolas" w:eastAsia="Consolas" w:hAnsi="Consolas"/>
-          <w:color w:val="1F2937"/>
-          <w:sz w:val="15"/>
-          <w:szCs w:val="15"/>
-        </w:rPr>
-        <w:t xml:space="preserve">                "בני 55+"</w:t>
-      </w:r>
-    </w:p>
-    <w:p>
-      <w:pPr>
-        <w:shd w:fill="F4F6FA" w:color="auto" w:val="clear"/>
-        <w:bidi w:val="false"/>
-        <w:spacing w:after="0" w:line="230"/>
-        <w:jc w:val="left"/>
-      </w:pPr>
-      <w:r>
-        <w:rPr>
-          <w:rFonts w:ascii="Consolas" w:cs="Consolas" w:eastAsia="Consolas" w:hAnsi="Consolas"/>
-          <w:color w:val="1F2937"/>
-          <w:sz w:val="15"/>
-          <w:szCs w:val="15"/>
-        </w:rPr>
-        <w:t xml:space="preserve">              ],</w:t>
-      </w:r>
-    </w:p>
-    <w:p>
-      <w:pPr>
-        <w:shd w:fill="F4F6FA" w:color="auto" w:val="clear"/>
-        <w:bidi w:val="false"/>
-        <w:spacing w:after="0" w:line="230"/>
-        <w:jc w:val="left"/>
-      </w:pPr>
-      <w:r>
-        <w:rPr>
-          <w:rFonts w:ascii="Consolas" w:cs="Consolas" w:eastAsia="Consolas" w:hAnsi="Consolas"/>
-          <w:color w:val="1F2937"/>
-          <w:sz w:val="15"/>
-          <w:szCs w:val="15"/>
-        </w:rPr>
-        <w:t xml:space="preserve">              "drop_if_overflow": "בני 55+"</w:t>
-      </w:r>
-    </w:p>
-    <w:p>
-      <w:pPr>
-        <w:shd w:fill="F4F6FA" w:color="auto" w:val="clear"/>
-        <w:bidi w:val="false"/>
-        <w:spacing w:after="0" w:line="230"/>
-        <w:jc w:val="left"/>
-      </w:pPr>
-      <w:r>
-        <w:rPr>
-          <w:rFonts w:ascii="Consolas" w:cs="Consolas" w:eastAsia="Consolas" w:hAnsi="Consolas"/>
-          <w:color w:val="1F2937"/>
-          <w:sz w:val="15"/>
-          <w:szCs w:val="15"/>
-        </w:rPr>
-        <w:t xml:space="preserve">            }</w:t>
-      </w:r>
-    </w:p>
-    <w:p>
-      <w:pPr>
-        <w:shd w:fill="F4F6FA" w:color="auto" w:val="clear"/>
-        <w:bidi w:val="false"/>
-        <w:spacing w:after="0" w:line="230"/>
-        <w:jc w:val="left"/>
-      </w:pPr>
-      <w:r>
-        <w:rPr>
-          <w:rFonts w:ascii="Consolas" w:cs="Consolas" w:eastAsia="Consolas" w:hAnsi="Consolas"/>
-          <w:color w:val="1F2937"/>
-          <w:sz w:val="15"/>
-          <w:szCs w:val="15"/>
-        </w:rPr>
-        <w:t xml:space="preserve">          ]</w:t>
-      </w:r>
-    </w:p>
-    <w:p>
-      <w:pPr>
-        <w:shd w:fill="F4F6FA" w:color="auto" w:val="clear"/>
-        <w:bidi w:val="false"/>
-        <w:spacing w:after="0" w:line="230"/>
-        <w:jc w:val="left"/>
-      </w:pPr>
-      <w:r>
-        <w:rPr>
-          <w:rFonts w:ascii="Consolas" w:cs="Consolas" w:eastAsia="Consolas" w:hAnsi="Consolas"/>
-          <w:color w:val="1F2937"/>
-          <w:sz w:val="15"/>
-          <w:szCs w:val="15"/>
-        </w:rPr>
-        <w:t xml:space="preserve">        },</w:t>
-      </w:r>
-    </w:p>
-    <w:p>
-      <w:pPr>
-        <w:shd w:fill="F4F6FA" w:color="auto" w:val="clear"/>
-        <w:bidi w:val="false"/>
-        <w:spacing w:after="0" w:line="230"/>
-        <w:jc w:val="left"/>
-      </w:pPr>
-      <w:r>
-        <w:rPr>
-          <w:rFonts w:ascii="Consolas" w:cs="Consolas" w:eastAsia="Consolas" w:hAnsi="Consolas"/>
-          <w:color w:val="1F2937"/>
-          <w:sz w:val="15"/>
-          <w:szCs w:val="15"/>
-        </w:rPr>
-        <w:t xml:space="preserve">        {</w:t>
-      </w:r>
-    </w:p>
-    <w:p>
-      <w:pPr>
-        <w:shd w:fill="F4F6FA" w:color="auto" w:val="clear"/>
-        <w:bidi w:val="false"/>
-        <w:spacing w:after="0" w:line="230"/>
-        <w:jc w:val="left"/>
-      </w:pPr>
-      <w:r>
-        <w:rPr>
-          <w:rFonts w:ascii="Consolas" w:cs="Consolas" w:eastAsia="Consolas" w:hAnsi="Consolas"/>
-          <w:color w:val="1F2937"/>
-          <w:sz w:val="15"/>
-          <w:szCs w:val="15"/>
-        </w:rPr>
-        <w:t xml:space="preserve">          "id": "panel_6",</w:t>
-      </w:r>
-    </w:p>
-    <w:p>
-      <w:pPr>
-        <w:shd w:fill="F4F6FA" w:color="auto" w:val="clear"/>
-        <w:bidi w:val="false"/>
-        <w:spacing w:after="0" w:line="230"/>
-        <w:jc w:val="left"/>
-      </w:pPr>
-      <w:r>
-        <w:rPr>
-          <w:rFonts w:ascii="Consolas" w:cs="Consolas" w:eastAsia="Consolas" w:hAnsi="Consolas"/>
-          <w:color w:val="1F2937"/>
-          <w:sz w:val="15"/>
-          <w:szCs w:val="15"/>
-        </w:rPr>
-        <w:t xml:space="preserve">          "role": "Shirel story",</w:t>
-      </w:r>
-    </w:p>
-    <w:p>
-      <w:pPr>
-        <w:shd w:fill="F4F6FA" w:color="auto" w:val="clear"/>
-        <w:bidi w:val="false"/>
-        <w:spacing w:after="0" w:line="230"/>
-        <w:jc w:val="left"/>
-      </w:pPr>
-      <w:r>
-        <w:rPr>
-          <w:rFonts w:ascii="Consolas" w:cs="Consolas" w:eastAsia="Consolas" w:hAnsi="Consolas"/>
-          <w:color w:val="1F2937"/>
-          <w:sz w:val="15"/>
-          <w:szCs w:val="15"/>
-        </w:rPr>
-        <w:t xml:space="preserve">          "background": "#F4F8FF",</w:t>
-      </w:r>
-    </w:p>
-    <w:p>
-      <w:pPr>
-        <w:shd w:fill="F4F6FA" w:color="auto" w:val="clear"/>
-        <w:bidi w:val="false"/>
-        <w:spacing w:after="0" w:line="230"/>
-        <w:jc w:val="left"/>
-      </w:pPr>
-      <w:r>
-        <w:rPr>
-          <w:rFonts w:ascii="Consolas" w:cs="Consolas" w:eastAsia="Consolas" w:hAnsi="Consolas"/>
-          <w:color w:val="1F2937"/>
-          <w:sz w:val="15"/>
-          <w:szCs w:val="15"/>
-        </w:rPr>
-        <w:t xml:space="preserve">          "layout": "photo half, text half",</w:t>
-      </w:r>
-    </w:p>
-    <w:p>
-      <w:pPr>
-        <w:shd w:fill="F4F6FA" w:color="auto" w:val="clear"/>
-        <w:bidi w:val="false"/>
-        <w:spacing w:after="0" w:line="230"/>
-        <w:jc w:val="left"/>
-      </w:pPr>
-      <w:r>
-        <w:rPr>
-          <w:rFonts w:ascii="Consolas" w:cs="Consolas" w:eastAsia="Consolas" w:hAnsi="Consolas"/>
-          <w:color w:val="1F2937"/>
-          <w:sz w:val="15"/>
-          <w:szCs w:val="15"/>
-        </w:rPr>
-        <w:t xml:space="preserve">          "text": [</w:t>
-      </w:r>
-    </w:p>
-    <w:p>
-      <w:pPr>
-        <w:shd w:fill="F4F6FA" w:color="auto" w:val="clear"/>
-        <w:bidi w:val="false"/>
-        <w:spacing w:after="0" w:line="230"/>
-        <w:jc w:val="left"/>
-      </w:pPr>
-      <w:r>
-        <w:rPr>
-          <w:rFonts w:ascii="Consolas" w:cs="Consolas" w:eastAsia="Consolas" w:hAnsi="Consolas"/>
-          <w:color w:val="1F2937"/>
-          <w:sz w:val="15"/>
-          <w:szCs w:val="15"/>
-        </w:rPr>
-        <w:t xml:space="preserve">            {</w:t>
-      </w:r>
-    </w:p>
-    <w:p>
-      <w:pPr>
-        <w:shd w:fill="F4F6FA" w:color="auto" w:val="clear"/>
-        <w:bidi w:val="false"/>
-        <w:spacing w:after="0" w:line="230"/>
-        <w:jc w:val="left"/>
-      </w:pPr>
-      <w:r>
-        <w:rPr>
-          <w:rFonts w:ascii="Consolas" w:cs="Consolas" w:eastAsia="Consolas" w:hAnsi="Consolas"/>
-          <w:color w:val="1F2937"/>
-          <w:sz w:val="15"/>
-          <w:szCs w:val="15"/>
-        </w:rPr>
-        <w:t xml:space="preserve">              "role": "headline",</w:t>
-      </w:r>
-    </w:p>
-    <w:p>
-      <w:pPr>
-        <w:shd w:fill="F4F6FA" w:color="auto" w:val="clear"/>
-        <w:bidi w:val="false"/>
-        <w:spacing w:after="0" w:line="230"/>
-        <w:jc w:val="left"/>
-      </w:pPr>
-      <w:r>
-        <w:rPr>
-          <w:rFonts w:ascii="Consolas" w:cs="Consolas" w:eastAsia="Consolas" w:hAnsi="Consolas"/>
-          <w:color w:val="1F2937"/>
-          <w:sz w:val="15"/>
-          <w:szCs w:val="15"/>
-        </w:rPr>
-        <w:t xml:space="preserve">              "lines": 2,</w:t>
-      </w:r>
-    </w:p>
-    <w:p>
-      <w:pPr>
-        <w:shd w:fill="F4F6FA" w:color="auto" w:val="clear"/>
-        <w:bidi w:val="false"/>
-        <w:spacing w:after="0" w:line="230"/>
-        <w:jc w:val="left"/>
-      </w:pPr>
-      <w:r>
-        <w:rPr>
-          <w:rFonts w:ascii="Consolas" w:cs="Consolas" w:eastAsia="Consolas" w:hAnsi="Consolas"/>
-          <w:color w:val="1F2937"/>
-          <w:sz w:val="15"/>
-          <w:szCs w:val="15"/>
-        </w:rPr>
-        <w:t xml:space="preserve">              "size_pt": 23,</w:t>
-      </w:r>
-    </w:p>
-    <w:p>
-      <w:pPr>
-        <w:shd w:fill="F4F6FA" w:color="auto" w:val="clear"/>
-        <w:bidi w:val="false"/>
-        <w:spacing w:after="0" w:line="230"/>
-        <w:jc w:val="left"/>
-      </w:pPr>
-      <w:r>
-        <w:rPr>
-          <w:rFonts w:ascii="Consolas" w:cs="Consolas" w:eastAsia="Consolas" w:hAnsi="Consolas"/>
-          <w:color w:val="1F2937"/>
-          <w:sz w:val="15"/>
-          <w:szCs w:val="15"/>
-        </w:rPr>
-        <w:t xml:space="preserve">              "value": "ראיתי מקרוב מה טעות פיננסית עושה למשפחה."</w:t>
-      </w:r>
-    </w:p>
-    <w:p>
-      <w:pPr>
-        <w:shd w:fill="F4F6FA" w:color="auto" w:val="clear"/>
-        <w:bidi w:val="false"/>
-        <w:spacing w:after="0" w:line="230"/>
-        <w:jc w:val="left"/>
-      </w:pPr>
-      <w:r>
-        <w:rPr>
-          <w:rFonts w:ascii="Consolas" w:cs="Consolas" w:eastAsia="Consolas" w:hAnsi="Consolas"/>
-          <w:color w:val="1F2937"/>
-          <w:sz w:val="15"/>
-          <w:szCs w:val="15"/>
-        </w:rPr>
-        <w:t xml:space="preserve">            },</w:t>
-      </w:r>
-    </w:p>
-    <w:p>
-      <w:pPr>
-        <w:shd w:fill="F4F6FA" w:color="auto" w:val="clear"/>
-        <w:bidi w:val="false"/>
-        <w:spacing w:after="0" w:line="230"/>
-        <w:jc w:val="left"/>
-      </w:pPr>
-      <w:r>
-        <w:rPr>
-          <w:rFonts w:ascii="Consolas" w:cs="Consolas" w:eastAsia="Consolas" w:hAnsi="Consolas"/>
-          <w:color w:val="1F2937"/>
-          <w:sz w:val="15"/>
-          <w:szCs w:val="15"/>
-        </w:rPr>
-        <w:t xml:space="preserve">            {</w:t>
-      </w:r>
-    </w:p>
-    <w:p>
-      <w:pPr>
-        <w:shd w:fill="F4F6FA" w:color="auto" w:val="clear"/>
-        <w:bidi w:val="false"/>
-        <w:spacing w:after="0" w:line="230"/>
-        <w:jc w:val="left"/>
-      </w:pPr>
-      <w:r>
-        <w:rPr>
-          <w:rFonts w:ascii="Consolas" w:cs="Consolas" w:eastAsia="Consolas" w:hAnsi="Consolas"/>
-          <w:color w:val="1F2937"/>
-          <w:sz w:val="15"/>
-          <w:szCs w:val="15"/>
-        </w:rPr>
-        <w:t xml:space="preserve">              "role": "value",</w:t>
-      </w:r>
-    </w:p>
-    <w:p>
-      <w:pPr>
-        <w:shd w:fill="F4F6FA" w:color="auto" w:val="clear"/>
-        <w:bidi w:val="false"/>
-        <w:spacing w:after="0" w:line="230"/>
-        <w:jc w:val="left"/>
-      </w:pPr>
-      <w:r>
-        <w:rPr>
-          <w:rFonts w:ascii="Consolas" w:cs="Consolas" w:eastAsia="Consolas" w:hAnsi="Consolas"/>
-          <w:color w:val="1F2937"/>
-          <w:sz w:val="15"/>
-          <w:szCs w:val="15"/>
-        </w:rPr>
-        <w:t xml:space="preserve">              "size_pt": 11,</w:t>
-      </w:r>
-    </w:p>
-    <w:p>
-      <w:pPr>
-        <w:shd w:fill="F4F6FA" w:color="auto" w:val="clear"/>
-        <w:bidi w:val="false"/>
-        <w:spacing w:after="0" w:line="230"/>
-        <w:jc w:val="left"/>
-      </w:pPr>
-      <w:r>
-        <w:rPr>
-          <w:rFonts w:ascii="Consolas" w:cs="Consolas" w:eastAsia="Consolas" w:hAnsi="Consolas"/>
-          <w:color w:val="1F2937"/>
-          <w:sz w:val="15"/>
-          <w:szCs w:val="15"/>
-        </w:rPr>
-        <w:t xml:space="preserve">              "value": "למדתי את מה שאף אחד לא לימד אותנו. היום אני עומד לצד מי שצריך."</w:t>
-      </w:r>
-    </w:p>
-    <w:p>
-      <w:pPr>
-        <w:shd w:fill="F4F6FA" w:color="auto" w:val="clear"/>
-        <w:bidi w:val="false"/>
-        <w:spacing w:after="0" w:line="230"/>
-        <w:jc w:val="left"/>
-      </w:pPr>
-      <w:r>
-        <w:rPr>
-          <w:rFonts w:ascii="Consolas" w:cs="Consolas" w:eastAsia="Consolas" w:hAnsi="Consolas"/>
-          <w:color w:val="1F2937"/>
-          <w:sz w:val="15"/>
-          <w:szCs w:val="15"/>
-        </w:rPr>
-        <w:t xml:space="preserve">            },</w:t>
-      </w:r>
-    </w:p>
-    <w:p>
-      <w:pPr>
-        <w:shd w:fill="F4F6FA" w:color="auto" w:val="clear"/>
-        <w:bidi w:val="false"/>
-        <w:spacing w:after="0" w:line="230"/>
-        <w:jc w:val="left"/>
-      </w:pPr>
-      <w:r>
-        <w:rPr>
-          <w:rFonts w:ascii="Consolas" w:cs="Consolas" w:eastAsia="Consolas" w:hAnsi="Consolas"/>
-          <w:color w:val="1F2937"/>
-          <w:sz w:val="15"/>
-          <w:szCs w:val="15"/>
-        </w:rPr>
-        <w:t xml:space="preserve">            {</w:t>
-      </w:r>
-    </w:p>
-    <w:p>
-      <w:pPr>
-        <w:shd w:fill="F4F6FA" w:color="auto" w:val="clear"/>
-        <w:bidi w:val="false"/>
-        <w:spacing w:after="0" w:line="230"/>
-        <w:jc w:val="left"/>
-      </w:pPr>
-      <w:r>
-        <w:rPr>
-          <w:rFonts w:ascii="Consolas" w:cs="Consolas" w:eastAsia="Consolas" w:hAnsi="Consolas"/>
-          <w:color w:val="1F2937"/>
-          <w:sz w:val="15"/>
-          <w:szCs w:val="15"/>
-        </w:rPr>
         <w:t xml:space="preserve">              "role": "testimonial",</w:t>
       </w:r>
     </w:p>
@@ -22220,41 +22383,41 @@
           <w:sz w:val="15"/>
           <w:szCs w:val="15"/>
         </w:rPr>
-        <w:t xml:space="preserve">              "size_pt": 10,</w:t>
-      </w:r>
-    </w:p>
-    <w:p>
-      <w:pPr>
-        <w:shd w:fill="F4F6FA" w:color="auto" w:val="clear"/>
-        <w:bidi w:val="false"/>
-        <w:spacing w:after="0" w:line="230"/>
-        <w:jc w:val="left"/>
-      </w:pPr>
-      <w:r>
-        <w:rPr>
-          <w:rFonts w:ascii="Consolas" w:cs="Consolas" w:eastAsia="Consolas" w:hAnsi="Consolas"/>
-          <w:color w:val="1F2937"/>
-          <w:sz w:val="15"/>
-          <w:szCs w:val="15"/>
-        </w:rPr>
-        <w:t xml:space="preserve">              "value": "[עדות אמיתית: משפט אחד ושם פרטי]",</w:t>
-      </w:r>
-    </w:p>
-    <w:p>
-      <w:pPr>
-        <w:shd w:fill="F4F6FA" w:color="auto" w:val="clear"/>
-        <w:bidi w:val="false"/>
-        <w:spacing w:after="0" w:line="230"/>
-        <w:jc w:val="left"/>
-      </w:pPr>
-      <w:r>
-        <w:rPr>
-          <w:rFonts w:ascii="Consolas" w:cs="Consolas" w:eastAsia="Consolas" w:hAnsi="Consolas"/>
-          <w:color w:val="1F2937"/>
-          <w:sz w:val="15"/>
-          <w:szCs w:val="15"/>
-        </w:rPr>
-        <w:t xml:space="preserve">              "fallback": "B.A כלכלה + M.B.A · חבר בהתאחדות יועצי המשכנתאות"</w:t>
+        <w:t xml:space="preserve">              "size_pt": 9.4,</w:t>
+      </w:r>
+    </w:p>
+    <w:p>
+      <w:pPr>
+        <w:shd w:fill="F4F6FA" w:color="auto" w:val="clear"/>
+        <w:bidi w:val="false"/>
+        <w:spacing w:after="0" w:line="230"/>
+        <w:jc w:val="left"/>
+      </w:pPr>
+      <w:r>
+        <w:rPr>
+          <w:rFonts w:ascii="Consolas" w:cs="Consolas" w:eastAsia="Consolas" w:hAnsi="Consolas"/>
+          <w:color w:val="1F2937"/>
+          <w:sz w:val="15"/>
+          <w:szCs w:val="15"/>
+        </w:rPr>
+        <w:t xml:space="preserve">              "value": "יש לו המון ידע, והמון סבלנות.",</w:t>
+      </w:r>
+    </w:p>
+    <w:p>
+      <w:pPr>
+        <w:shd w:fill="F4F6FA" w:color="auto" w:val="clear"/>
+        <w:bidi w:val="false"/>
+        <w:spacing w:after="0" w:line="230"/>
+        <w:jc w:val="left"/>
+      </w:pPr>
+      <w:r>
+        <w:rPr>
+          <w:rFonts w:ascii="Consolas" w:cs="Consolas" w:eastAsia="Consolas" w:hAnsi="Consolas"/>
+          <w:color w:val="1F2937"/>
+          <w:sz w:val="15"/>
+          <w:szCs w:val="15"/>
+        </w:rPr>
+        <w:t xml:space="preserve">              "by": "יונתן, הגיע עם מצב מורכב מהסטנדרט"</w:t>
       </w:r>
     </w:p>
     <w:p>

</xml_diff>

<commit_message>
Brochure visuals: Bauhaus (baniyan) system - flat, serif headlines, single accent, business-card contact on cover
Co-Authored-By: Claude Opus 5.5 <noreply@anthropic.com>
Claude-Session: https://claude.ai/code/session_01KhCungy6SpcQ77bdWEeQSw
</commit_message>
<xml_diff>
--- a/brochure/MAKESENSE-brochure-copy.docx
+++ b/brochure/MAKESENSE-brochure-copy.docx
@@ -3192,7 +3192,7 @@
           <w:szCs w:val="21"/>
           <w:rtl/>
         </w:rPr>
-        <w:t xml:space="preserve"> Premium Editorial / Private Banking.</w:t>
+        <w:t xml:space="preserve"> Premium Editorial / Private Banking, לפי מערכת העיצוב "בניין" (Bauhaus): שטוח, בלי גרדיאנטים ובלי צללים, צבע הדגשה אחד (טורקיז) שמשמש רק להנעה לפעולה ולמילת מפתח אחת, פינות ישרות, ומספרי טלפון ומיילים מבודדים בכיוון LTR.</w:t>
       </w:r>
     </w:p>
     <w:p>
@@ -3536,7 +3536,7 @@
                 <w:szCs w:val="20"/>
                 <w:rtl/>
               </w:rPr>
-              <w:t xml:space="preserve">גרדיאנט כחול</w:t>
+              <w:t xml:space="preserve">כחול רויאל שטוח / כחול עמוק שטוח</w:t>
             </w:r>
           </w:p>
         </w:tc>
@@ -3571,7 +3571,7 @@
                 <w:szCs w:val="20"/>
                 <w:rtl/>
               </w:rPr>
-              <w:t xml:space="preserve">#1F8BF0 → #004AAD → #002C6B</w:t>
+              <w:t xml:space="preserve">#004AAD / #002C6B</w:t>
             </w:r>
           </w:p>
         </w:tc>
@@ -4173,7 +4173,7 @@
                 <w:szCs w:val="20"/>
                 <w:rtl/>
               </w:rPr>
-              <w:t xml:space="preserve">Rubik ExtraBold/Black, או גופן עברי גאומטרי מקביל</w:t>
+              <w:t xml:space="preserve">Frank Ruhl Libre Bold (סריף עברי), ריווח אותיות 0, גובה שורה 1.15 לפחות</w:t>
             </w:r>
           </w:p>
         </w:tc>
@@ -4208,7 +4208,7 @@
                 <w:szCs w:val="20"/>
                 <w:rtl/>
               </w:rPr>
-              <w:t xml:space="preserve">18–29pt (לפי אורך הכותרת)</w:t>
+              <w:t xml:space="preserve">18–28pt (לפי אורך הכותרת)</w:t>
             </w:r>
           </w:p>
         </w:tc>
@@ -5005,7 +5005,7 @@
           <w:szCs w:val="21"/>
           <w:rtl/>
         </w:rPr>
-        <w:t xml:space="preserve">יותר מגרדיאנט אחד בפאנל, וגרדיאנט על טקסט.</w:t>
+        <w:t xml:space="preserve">גרדיאנטים, צללים ופינות מעוגלות (מקסימום 0.6 מ"מ).</w:t>
       </w:r>
     </w:p>
     <w:p>
@@ -17663,24 +17663,7 @@
           <w:sz w:val="15"/>
           <w:szCs w:val="15"/>
         </w:rPr>
-        <w:t xml:space="preserve">      "dark_gradient": [</w:t>
-      </w:r>
-    </w:p>
-    <w:p>
-      <w:pPr>
-        <w:shd w:fill="F4F6FA" w:color="auto" w:val="clear"/>
-        <w:bidi w:val="false"/>
-        <w:spacing w:after="0" w:line="230"/>
-        <w:jc w:val="left"/>
-      </w:pPr>
-      <w:r>
-        <w:rPr>
-          <w:rFonts w:ascii="Consolas" w:cs="Consolas" w:eastAsia="Consolas" w:hAnsi="Consolas"/>
-          <w:color w:val="1F2937"/>
-          <w:sz w:val="15"/>
-          <w:szCs w:val="15"/>
-        </w:rPr>
-        <w:t xml:space="preserve">        "#1F8BF0",</w:t>
+        <w:t xml:space="preserve">      "dark": [</w:t>
       </w:r>
     </w:p>
     <w:p>
@@ -17748,6 +17731,23 @@
           <w:sz w:val="15"/>
           <w:szCs w:val="15"/>
         </w:rPr>
+        <w:t xml:space="preserve">      "gradients": "none (flat, Bauhaus system)",</w:t>
+      </w:r>
+    </w:p>
+    <w:p>
+      <w:pPr>
+        <w:shd w:fill="F4F6FA" w:color="auto" w:val="clear"/>
+        <w:bidi w:val="false"/>
+        <w:spacing w:after="0" w:line="230"/>
+        <w:jc w:val="left"/>
+      </w:pPr>
+      <w:r>
+        <w:rPr>
+          <w:rFonts w:ascii="Consolas" w:cs="Consolas" w:eastAsia="Consolas" w:hAnsi="Consolas"/>
+          <w:color w:val="1F2937"/>
+          <w:sz w:val="15"/>
+          <w:szCs w:val="15"/>
+        </w:rPr>
         <w:t xml:space="preserve">      "text": "#0A0A0A",</w:t>
       </w:r>
     </w:p>
@@ -17901,7 +17901,7 @@
           <w:sz w:val="15"/>
           <w:szCs w:val="15"/>
         </w:rPr>
-        <w:t xml:space="preserve">      "headline": "Rubik Black/Bold",</w:t>
+        <w:t xml:space="preserve">      "headline": "Frank Ruhl Libre Bold",</w:t>
       </w:r>
     </w:p>
     <w:p>
@@ -18445,7 +18445,7 @@
           <w:sz w:val="15"/>
           <w:szCs w:val="15"/>
         </w:rPr>
-        <w:t xml:space="preserve">          "background": "dark_gradient",</w:t>
+        <w:t xml:space="preserve">          "background": "#004AAD",</w:t>
       </w:r>
     </w:p>
     <w:p>
@@ -20536,7 +20536,7 @@
           <w:sz w:val="15"/>
           <w:szCs w:val="15"/>
         </w:rPr>
-        <w:t xml:space="preserve">          "background": "dark_gradient",</w:t>
+        <w:t xml:space="preserve">          "background": "#004AAD",</w:t>
       </w:r>
     </w:p>
     <w:p>
@@ -23613,7 +23613,7 @@
           <w:sz w:val="15"/>
           <w:szCs w:val="15"/>
         </w:rPr>
-        <w:t xml:space="preserve">          "background": "dark_gradient",</w:t>
+        <w:t xml:space="preserve">          "background": "#004AAD",</w:t>
       </w:r>
     </w:p>
     <w:p>

</xml_diff>